<commit_message>
BIG UPDATE BETA 02_PHASE 03_Mod Database Table Fixing
</commit_message>
<xml_diff>
--- a/BIG_UPDATE_BETA_02..docx
+++ b/BIG_UPDATE_BETA_02..docx
@@ -1387,14 +1387,7 @@
             <w:rFonts w:ascii="Cambria Math" w:hAnsi="Cambria Math"/>
             <w:lang w:val="vi-VN"/>
           </w:rPr>
-          <m:t>=1</m:t>
-        </m:r>
-        <m:r>
-          <w:rPr>
-            <w:rFonts w:ascii="Cambria Math" w:hAnsi="Cambria Math"/>
-            <w:lang w:val="vi-VN"/>
-          </w:rPr>
-          <m:t>0</m:t>
+          <m:t>=10</m:t>
         </m:r>
         <m:r>
           <w:rPr>
@@ -1455,31 +1448,47 @@
         <w:rPr>
           <w:lang w:val="vi-VN"/>
         </w:rPr>
-        <w:t xml:space="preserve"> Tách biệt hoàn toàn Ví điểm nạp với Ví SValue thưởng (</w:t>
-      </w:r>
-      <m:oMath>
-        <m:r>
-          <w:rPr>
-            <w:rFonts w:ascii="Cambria Math" w:hAnsi="Cambria Math"/>
-            <w:lang w:val="vi-VN"/>
-          </w:rPr>
-          <m:t>500.000</m:t>
-        </m:r>
-        <m:r>
-          <m:rPr>
-            <m:nor/>
-          </m:rPr>
-          <w:rPr>
-            <w:lang w:val="vi-VN"/>
-          </w:rPr>
-          <m:t> VNĐ</m:t>
-        </m:r>
-      </m:oMath>
-      <w:r>
-        <w:rPr>
-          <w:lang w:val="vi-VN"/>
-        </w:rPr>
-        <w:t xml:space="preserve"> thưởng tiêu dùng). </w:t>
+        <w:t xml:space="preserve"> Tách biệt hoàn toàn </w:t>
+      </w:r>
+      <w:proofErr w:type="spellStart"/>
+      <w:r>
+        <w:t>với</w:t>
+      </w:r>
+      <w:proofErr w:type="spellEnd"/>
+      <w:r>
+        <w:t xml:space="preserve"> </w:t>
+      </w:r>
+      <w:proofErr w:type="spellStart"/>
+      <w:r>
+        <w:t>các</w:t>
+      </w:r>
+      <w:proofErr w:type="spellEnd"/>
+      <w:r>
+        <w:t xml:space="preserve"> </w:t>
+      </w:r>
+      <w:proofErr w:type="spellStart"/>
+      <w:r>
+        <w:t>luồng</w:t>
+      </w:r>
+      <w:proofErr w:type="spellEnd"/>
+      <w:r>
+        <w:t xml:space="preserve"> </w:t>
+      </w:r>
+      <w:proofErr w:type="spellStart"/>
+      <w:r>
+        <w:t>tiền</w:t>
+      </w:r>
+      <w:proofErr w:type="spellEnd"/>
+      <w:r>
+        <w:t xml:space="preserve"> </w:t>
+      </w:r>
+      <w:proofErr w:type="spellStart"/>
+      <w:r>
+        <w:t>khác</w:t>
+      </w:r>
+      <w:proofErr w:type="spellEnd"/>
+      <w:r>
+        <w:t>.</w:t>
       </w:r>
     </w:p>
     <w:p>
@@ -1595,7 +1604,43 @@
           <w:lang w:val="vi-VN"/>
         </w:rPr>
         <w:lastRenderedPageBreak/>
-        <w:t>Database (Database/database.py):</w:t>
+        <w:t>Database (Database/</w:t>
+      </w:r>
+      <w:proofErr w:type="spellStart"/>
+      <w:r>
+        <w:rPr>
+          <w:b/>
+          <w:bCs/>
+        </w:rPr>
+        <w:t>schema.sql</w:t>
+      </w:r>
+      <w:proofErr w:type="spellEnd"/>
+      <w:r>
+        <w:rPr>
+          <w:b/>
+          <w:bCs/>
+          <w:lang w:val="vi-VN"/>
+        </w:rPr>
+        <w:t>):</w:t>
+      </w:r>
+    </w:p>
+    <w:p>
+      <w:pPr>
+        <w:numPr>
+          <w:ilvl w:val="0"/>
+          <w:numId w:val="6"/>
+        </w:numPr>
+        <w:rPr>
+          <w:lang w:val="vi-VN"/>
+        </w:rPr>
+      </w:pPr>
+      <w:r>
+        <w:rPr>
+          <w:b/>
+          <w:bCs/>
+          <w:lang w:val="vi-VN"/>
+        </w:rPr>
+        <w:t>Backend (Backend/):</w:t>
       </w:r>
     </w:p>
     <w:p>
@@ -1612,7 +1657,21 @@
         <w:rPr>
           <w:lang w:val="vi-VN"/>
         </w:rPr>
-        <w:t xml:space="preserve">Bảng users: Bổ sung cột points_balance (BIGINT/NUMERIC, DEFAULT = 0). </w:t>
+        <w:t>main.py:</w:t>
+      </w:r>
+    </w:p>
+    <w:p>
+      <w:pPr>
+        <w:numPr>
+          <w:ilvl w:val="1"/>
+          <w:numId w:val="6"/>
+        </w:numPr>
+        <w:rPr>
+          <w:lang w:val="vi-VN"/>
+        </w:rPr>
+      </w:pPr>
+      <w:r>
+        <w:t>schemas.py</w:t>
       </w:r>
     </w:p>
     <w:p>
@@ -1631,7 +1690,7 @@
           <w:bCs/>
           <w:lang w:val="vi-VN"/>
         </w:rPr>
-        <w:t>Backend (Backend/):</w:t>
+        <w:t>Mobile (Mobile/):</w:t>
       </w:r>
     </w:p>
     <w:p>
@@ -1648,85 +1707,10 @@
         <w:rPr>
           <w:lang w:val="vi-VN"/>
         </w:rPr>
-        <w:t>main.py:</w:t>
-      </w:r>
-    </w:p>
-    <w:p>
-      <w:pPr>
-        <w:numPr>
-          <w:ilvl w:val="2"/>
-          <w:numId w:val="6"/>
-        </w:numPr>
-        <w:rPr>
-          <w:lang w:val="vi-VN"/>
-        </w:rPr>
-      </w:pPr>
-      <w:r>
-        <w:rPr>
-          <w:lang w:val="vi-VN"/>
-        </w:rPr>
-        <w:t>Tạo API /user/points/topup (POST): Tiếp nhận số tiền muốn nạp, gọi PayOS API sinh QR giao dịch nạp điểm.</w:t>
-      </w:r>
-    </w:p>
-    <w:p>
-      <w:pPr>
-        <w:numPr>
-          <w:ilvl w:val="2"/>
-          <w:numId w:val="6"/>
-        </w:numPr>
-        <w:rPr>
-          <w:lang w:val="vi-VN"/>
-        </w:rPr>
-      </w:pPr>
-      <w:r>
-        <w:rPr>
-          <w:lang w:val="vi-VN"/>
-        </w:rPr>
-        <w:t xml:space="preserve">Cập nhật API /payos/webhook: Nhận phản hồi thanh toán thành công, thực hiện cộng points_balance cho user trong Atomic Transaction. </w:t>
-      </w:r>
-    </w:p>
-    <w:p>
-      <w:pPr>
-        <w:numPr>
-          <w:ilvl w:val="2"/>
-          <w:numId w:val="6"/>
-        </w:numPr>
-        <w:rPr>
-          <w:lang w:val="vi-VN"/>
-        </w:rPr>
-      </w:pPr>
-      <w:r>
-        <w:rPr>
-          <w:lang w:val="vi-VN"/>
-        </w:rPr>
-        <w:t>Bổ sung, nâng cấp thêm 1 số luồng đảm bảo dataflow như trên.</w:t>
-      </w:r>
-    </w:p>
-    <w:p>
-      <w:pPr>
-        <w:ind w:left="1800"/>
-        <w:rPr>
-          <w:lang w:val="vi-VN"/>
-        </w:rPr>
-      </w:pPr>
-    </w:p>
-    <w:p>
-      <w:pPr>
-        <w:numPr>
-          <w:ilvl w:val="0"/>
-          <w:numId w:val="6"/>
-        </w:numPr>
-        <w:rPr>
-          <w:lang w:val="vi-VN"/>
-        </w:rPr>
-      </w:pPr>
-      <w:r>
-        <w:rPr>
-          <w:b/>
-          <w:bCs/>
-          <w:lang w:val="vi-VN"/>
-        </w:rPr>
-        <w:t>Mobile (Mobile/):</w:t>
+        <w:t>lib/data/models/wallet_model.dart</w:t>
+      </w:r>
+      <w:r>
+        <w:t>;</w:t>
       </w:r>
     </w:p>
     <w:p>
@@ -1743,7 +1727,7 @@
         <w:rPr>
           <w:lang w:val="vi-VN"/>
         </w:rPr>
-        <w:t xml:space="preserve">lib/data/models/wallet_model.dart &amp; wallet_api_service.dart: Thêm trường pointsBalance và hàm gọi topup. </w:t>
+        <w:t xml:space="preserve">wallet_api_service.dart: Thêm trường pointsBalance và hàm gọi topup. </w:t>
       </w:r>
     </w:p>
     <w:p>
@@ -1928,6 +1912,93 @@
           <w:b/>
           <w:bCs/>
         </w:rPr>
+        <w:t xml:space="preserve">(Phase </w:t>
+      </w:r>
+      <w:proofErr w:type="spellStart"/>
+      <w:r>
+        <w:rPr>
+          <w:b/>
+          <w:bCs/>
+        </w:rPr>
+        <w:t>này</w:t>
+      </w:r>
+      <w:proofErr w:type="spellEnd"/>
+      <w:r>
+        <w:rPr>
+          <w:b/>
+          <w:bCs/>
+        </w:rPr>
+        <w:t xml:space="preserve"> </w:t>
+      </w:r>
+      <w:proofErr w:type="spellStart"/>
+      <w:r>
+        <w:rPr>
+          <w:b/>
+          <w:bCs/>
+        </w:rPr>
+        <w:t>chỉ</w:t>
+      </w:r>
+      <w:proofErr w:type="spellEnd"/>
+      <w:r>
+        <w:rPr>
+          <w:b/>
+          <w:bCs/>
+        </w:rPr>
+        <w:t xml:space="preserve"> </w:t>
+      </w:r>
+      <w:proofErr w:type="spellStart"/>
+      <w:r>
+        <w:rPr>
+          <w:b/>
+          <w:bCs/>
+        </w:rPr>
+        <w:t>làm</w:t>
+      </w:r>
+      <w:proofErr w:type="spellEnd"/>
+      <w:r>
+        <w:rPr>
+          <w:b/>
+          <w:bCs/>
+        </w:rPr>
+        <w:t xml:space="preserve"> </w:t>
+      </w:r>
+      <w:proofErr w:type="spellStart"/>
+      <w:r>
+        <w:rPr>
+          <w:b/>
+          <w:bCs/>
+        </w:rPr>
+        <w:t>đến</w:t>
+      </w:r>
+      <w:proofErr w:type="spellEnd"/>
+      <w:r>
+        <w:rPr>
+          <w:b/>
+          <w:bCs/>
+        </w:rPr>
+        <w:t xml:space="preserve"> </w:t>
+      </w:r>
+      <w:proofErr w:type="spellStart"/>
+      <w:r>
+        <w:rPr>
+          <w:b/>
+          <w:bCs/>
+        </w:rPr>
+        <w:t>đây</w:t>
+      </w:r>
+      <w:proofErr w:type="spellEnd"/>
+      <w:r>
+        <w:rPr>
+          <w:b/>
+          <w:bCs/>
+        </w:rPr>
+        <w:t xml:space="preserve">) </w:t>
+      </w:r>
+      <w:r>
+        <w:rPr>
+          <w:b/>
+          <w:bCs/>
+        </w:rPr>
         <w:sym w:font="Wingdings" w:char="F0E0"/>
       </w:r>
       <w:r>
@@ -1935,14 +2006,7 @@
           <w:b/>
           <w:bCs/>
         </w:rPr>
-        <w:t xml:space="preserve"> </w:t>
-      </w:r>
-      <w:r>
-        <w:rPr>
-          <w:b/>
-          <w:bCs/>
-        </w:rPr>
-        <w:t xml:space="preserve">Giao </w:t>
+        <w:t xml:space="preserve"> Giao </w:t>
       </w:r>
       <w:proofErr w:type="spellStart"/>
       <w:r>
@@ -1974,14 +2038,7 @@
           <w:b/>
           <w:bCs/>
         </w:rPr>
-        <w:t xml:space="preserve"> -</w:t>
-      </w:r>
-      <w:r>
-        <w:rPr>
-          <w:b/>
-          <w:bCs/>
-        </w:rPr>
-        <w:t xml:space="preserve"> </w:t>
+        <w:t xml:space="preserve"> - </w:t>
       </w:r>
       <w:proofErr w:type="spellStart"/>
       <w:r>
@@ -2144,6 +2201,7 @@
         <w:t xml:space="preserve">, </w:t>
       </w:r>
       <w:proofErr w:type="spellStart"/>
+      <w:proofErr w:type="gramStart"/>
       <w:r>
         <w:rPr>
           <w:b/>
@@ -2157,7 +2215,15 @@
           <w:b/>
           <w:bCs/>
         </w:rPr>
-        <w:t xml:space="preserve">,… </w:t>
+        <w:t>,…</w:t>
+      </w:r>
+      <w:proofErr w:type="gramEnd"/>
+      <w:r>
+        <w:rPr>
+          <w:b/>
+          <w:bCs/>
+        </w:rPr>
+        <w:t xml:space="preserve"> </w:t>
       </w:r>
       <w:proofErr w:type="spellStart"/>
       <w:r>
@@ -2559,33 +2625,160 @@
         <w:rPr>
           <w:lang w:val="vi-VN"/>
         </w:rPr>
-        <w:t xml:space="preserve"> Đối tác (Partner) tạo Voucher VIP bán bằng điểm, có đính kèm khung giờ cố định. Moderator/Admin kiểm duyệt trước khi đưa lên sàn. </w:t>
-      </w:r>
-    </w:p>
-    <w:p>
-      <w:pPr>
-        <w:numPr>
-          <w:ilvl w:val="0"/>
-          <w:numId w:val="7"/>
-        </w:numPr>
-        <w:rPr>
-          <w:lang w:val="vi-VN"/>
-        </w:rPr>
-      </w:pPr>
-      <w:r>
-        <w:rPr>
-          <w:b/>
-          <w:bCs/>
-          <w:lang w:val="vi-VN"/>
-        </w:rPr>
-        <w:t>Thay đổi logic:</w:t>
-      </w:r>
-      <w:r>
-        <w:rPr>
-          <w:lang w:val="vi-VN"/>
-        </w:rPr>
-        <w:t xml:space="preserve"> Tái sử dụng bảng vouchers hiện tại, mở rộng thêm các đặc tính của Voucher VIP. </w:t>
-      </w:r>
+        <w:t xml:space="preserve"> Đối tác (Partner) tạo Voucher VIP bán bằng điểm, có đính kèm khung giờ cố định. Moderator/Admin kiểm duyệt trước khi đưa lên sàn</w:t>
+      </w:r>
+      <w:r>
+        <w:t xml:space="preserve"> – </w:t>
+      </w:r>
+      <w:proofErr w:type="spellStart"/>
+      <w:r>
+        <w:t>tóm</w:t>
+      </w:r>
+      <w:proofErr w:type="spellEnd"/>
+      <w:r>
+        <w:t xml:space="preserve"> </w:t>
+      </w:r>
+      <w:proofErr w:type="spellStart"/>
+      <w:r>
+        <w:t>lại</w:t>
+      </w:r>
+      <w:proofErr w:type="spellEnd"/>
+      <w:r>
+        <w:t xml:space="preserve"> </w:t>
+      </w:r>
+      <w:proofErr w:type="spellStart"/>
+      <w:r>
+        <w:t>các</w:t>
+      </w:r>
+      <w:proofErr w:type="spellEnd"/>
+      <w:r>
+        <w:t xml:space="preserve"> </w:t>
+      </w:r>
+      <w:proofErr w:type="spellStart"/>
+      <w:r>
+        <w:t>trường</w:t>
+      </w:r>
+      <w:proofErr w:type="spellEnd"/>
+      <w:r>
+        <w:t xml:space="preserve"> </w:t>
+      </w:r>
+      <w:proofErr w:type="spellStart"/>
+      <w:r>
+        <w:t>thông</w:t>
+      </w:r>
+      <w:proofErr w:type="spellEnd"/>
+      <w:r>
+        <w:t xml:space="preserve"> tin </w:t>
+      </w:r>
+      <w:proofErr w:type="spellStart"/>
+      <w:r>
+        <w:t>như</w:t>
+      </w:r>
+      <w:proofErr w:type="spellEnd"/>
+      <w:r>
+        <w:t xml:space="preserve"> voucher </w:t>
+      </w:r>
+      <w:proofErr w:type="spellStart"/>
+      <w:r>
+        <w:t>thường</w:t>
+      </w:r>
+      <w:proofErr w:type="spellEnd"/>
+      <w:r>
+        <w:t xml:space="preserve">, </w:t>
+      </w:r>
+      <w:proofErr w:type="spellStart"/>
+      <w:r>
+        <w:t>nhưng</w:t>
+      </w:r>
+      <w:proofErr w:type="spellEnd"/>
+      <w:r>
+        <w:t xml:space="preserve"> </w:t>
+      </w:r>
+      <w:proofErr w:type="spellStart"/>
+      <w:r>
+        <w:t>có</w:t>
+      </w:r>
+      <w:proofErr w:type="spellEnd"/>
+      <w:r>
+        <w:t xml:space="preserve"> </w:t>
+      </w:r>
+      <w:proofErr w:type="spellStart"/>
+      <w:r>
+        <w:t>thêm</w:t>
+      </w:r>
+      <w:proofErr w:type="spellEnd"/>
+      <w:r>
+        <w:t xml:space="preserve"> </w:t>
+      </w:r>
+      <w:proofErr w:type="spellStart"/>
+      <w:r>
+        <w:t>trường</w:t>
+      </w:r>
+      <w:proofErr w:type="spellEnd"/>
+      <w:r>
+        <w:t xml:space="preserve"> </w:t>
+      </w:r>
+      <w:proofErr w:type="spellStart"/>
+      <w:r>
+        <w:t>điểm</w:t>
+      </w:r>
+      <w:proofErr w:type="spellEnd"/>
+      <w:r>
+        <w:t xml:space="preserve"> – </w:t>
+      </w:r>
+      <w:proofErr w:type="spellStart"/>
+      <w:r>
+        <w:t>giá</w:t>
+      </w:r>
+      <w:proofErr w:type="spellEnd"/>
+      <w:r>
+        <w:t xml:space="preserve"> </w:t>
+      </w:r>
+      <w:proofErr w:type="spellStart"/>
+      <w:r>
+        <w:t>mua</w:t>
+      </w:r>
+      <w:proofErr w:type="spellEnd"/>
+      <w:r>
+        <w:t xml:space="preserve">, </w:t>
+      </w:r>
+      <w:proofErr w:type="spellStart"/>
+      <w:r>
+        <w:t>khung</w:t>
+      </w:r>
+      <w:proofErr w:type="spellEnd"/>
+      <w:r>
+        <w:t xml:space="preserve"> </w:t>
+      </w:r>
+      <w:proofErr w:type="spellStart"/>
+      <w:r>
+        <w:t>giờ</w:t>
+      </w:r>
+      <w:proofErr w:type="spellEnd"/>
+      <w:r>
+        <w:t xml:space="preserve"> (A-B) – </w:t>
+      </w:r>
+      <w:proofErr w:type="spellStart"/>
+      <w:r>
+        <w:t>chỉ</w:t>
+      </w:r>
+      <w:proofErr w:type="spellEnd"/>
+      <w:r>
+        <w:t xml:space="preserve"> 1 </w:t>
+      </w:r>
+      <w:proofErr w:type="spellStart"/>
+      <w:r>
+        <w:t>khung</w:t>
+      </w:r>
+      <w:proofErr w:type="spellEnd"/>
+      <w:r>
+        <w:t xml:space="preserve"> </w:t>
+      </w:r>
+      <w:proofErr w:type="spellStart"/>
+      <w:r>
+        <w:t>giờ</w:t>
+      </w:r>
+      <w:proofErr w:type="spellEnd"/>
     </w:p>
     <w:p>
       <w:pPr>
@@ -2618,7 +2811,6 @@
         <w:rPr>
           <w:lang w:val="vi-VN"/>
         </w:rPr>
-        <w:lastRenderedPageBreak/>
         <w:t xml:space="preserve">Luồng trạng thái: Partner tạo (PENDING) </w:t>
       </w:r>
       <m:oMath>
@@ -2685,7 +2877,43 @@
           <w:bCs/>
           <w:lang w:val="vi-VN"/>
         </w:rPr>
-        <w:t>Database (Database/database.py):</w:t>
+        <w:t>Database (Database/</w:t>
+      </w:r>
+      <w:proofErr w:type="spellStart"/>
+      <w:r>
+        <w:rPr>
+          <w:b/>
+          <w:bCs/>
+        </w:rPr>
+        <w:t>schema.sql</w:t>
+      </w:r>
+      <w:proofErr w:type="spellEnd"/>
+      <w:r>
+        <w:rPr>
+          <w:b/>
+          <w:bCs/>
+          <w:lang w:val="vi-VN"/>
+        </w:rPr>
+        <w:t>:</w:t>
+      </w:r>
+    </w:p>
+    <w:p>
+      <w:pPr>
+        <w:numPr>
+          <w:ilvl w:val="0"/>
+          <w:numId w:val="9"/>
+        </w:numPr>
+        <w:rPr>
+          <w:lang w:val="vi-VN"/>
+        </w:rPr>
+      </w:pPr>
+      <w:r>
+        <w:rPr>
+          <w:b/>
+          <w:bCs/>
+          <w:lang w:val="vi-VN"/>
+        </w:rPr>
+        <w:t>Backend (Backend/):</w:t>
       </w:r>
     </w:p>
     <w:p>
@@ -2702,7 +2930,24 @@
         <w:rPr>
           <w:lang w:val="vi-VN"/>
         </w:rPr>
-        <w:t xml:space="preserve">Bảng vouchers: Bổ sung các cột is_vip (BOOLEAN, DEFAULT = False), point_price (NUMERIC, DEFAULT = 0), fixed_time_slot (VARCHAR), description (TEXT). </w:t>
+        <w:t xml:space="preserve">schemas.py: </w:t>
+      </w:r>
+    </w:p>
+    <w:p>
+      <w:pPr>
+        <w:numPr>
+          <w:ilvl w:val="1"/>
+          <w:numId w:val="9"/>
+        </w:numPr>
+        <w:rPr>
+          <w:lang w:val="vi-VN"/>
+        </w:rPr>
+      </w:pPr>
+      <w:r>
+        <w:rPr>
+          <w:lang w:val="vi-VN"/>
+        </w:rPr>
+        <w:t>main.py:</w:t>
       </w:r>
     </w:p>
     <w:p>
@@ -2721,7 +2966,8 @@
           <w:bCs/>
           <w:lang w:val="vi-VN"/>
         </w:rPr>
-        <w:t>Backend (Backend/):</w:t>
+        <w:lastRenderedPageBreak/>
+        <w:t>Mobile (Mobile/):</w:t>
       </w:r>
     </w:p>
     <w:p>
@@ -2738,7 +2984,7 @@
         <w:rPr>
           <w:lang w:val="vi-VN"/>
         </w:rPr>
-        <w:t xml:space="preserve">schemas.py: Cập nhật VoucherCreate thêm các trường is_vip, point_price, fixed_time_slot, description. </w:t>
+        <w:t xml:space="preserve">lib/data/models/voucher_model.dart: Thêm các thuộc tính VIP. </w:t>
       </w:r>
     </w:p>
     <w:p>
@@ -2755,60 +3001,7 @@
         <w:rPr>
           <w:lang w:val="vi-VN"/>
         </w:rPr>
-        <w:t>main.py:</w:t>
-      </w:r>
-    </w:p>
-    <w:p>
-      <w:pPr>
-        <w:numPr>
-          <w:ilvl w:val="2"/>
-          <w:numId w:val="9"/>
-        </w:numPr>
-        <w:rPr>
-          <w:lang w:val="vi-VN"/>
-        </w:rPr>
-      </w:pPr>
-      <w:r>
-        <w:rPr>
-          <w:lang w:val="vi-VN"/>
-        </w:rPr>
-        <w:t xml:space="preserve">API /vouchers (POST): Nhận yêu cầu tạo Voucher VIP từ Partner với trạng thái PENDING. </w:t>
-      </w:r>
-    </w:p>
-    <w:p>
-      <w:pPr>
-        <w:numPr>
-          <w:ilvl w:val="2"/>
-          <w:numId w:val="9"/>
-        </w:numPr>
-        <w:rPr>
-          <w:lang w:val="vi-VN"/>
-        </w:rPr>
-      </w:pPr>
-      <w:r>
-        <w:rPr>
-          <w:lang w:val="vi-VN"/>
-        </w:rPr>
-        <w:t xml:space="preserve">API /admin/vouchers/{voucher_id}/status (PATCH): Giữ nguyên logic duyệt nhưng cập nhật logic đẩy Voucher VIP lên sàn khi duyệt APPROVED. </w:t>
-      </w:r>
-    </w:p>
-    <w:p>
-      <w:pPr>
-        <w:numPr>
-          <w:ilvl w:val="0"/>
-          <w:numId w:val="9"/>
-        </w:numPr>
-        <w:rPr>
-          <w:lang w:val="vi-VN"/>
-        </w:rPr>
-      </w:pPr>
-      <w:r>
-        <w:rPr>
-          <w:b/>
-          <w:bCs/>
-          <w:lang w:val="vi-VN"/>
-        </w:rPr>
-        <w:t>Mobile (Mobile/):</w:t>
+        <w:t>voucher_api_service.dart</w:t>
       </w:r>
     </w:p>
     <w:p>
@@ -2825,7 +3018,7 @@
         <w:rPr>
           <w:lang w:val="vi-VN"/>
         </w:rPr>
-        <w:t xml:space="preserve">lib/data/models/voucher_model.dart: Thêm các thuộc tính VIP. </w:t>
+        <w:t xml:space="preserve">lib/presentation/screens/admin/partner_dashboard_screen.dart: Tích hợp giao diện phát hành và theo dõi trạng thái kiểm duyệt Voucher VIP. </w:t>
       </w:r>
     </w:p>
     <w:p>
@@ -2842,15 +3035,48 @@
         <w:rPr>
           <w:lang w:val="vi-VN"/>
         </w:rPr>
-        <w:t xml:space="preserve">lib/presentation/screens/admin/partner_dashboard_screen.dart: Tích hợp giao diện phát hành và theo dõi trạng thái kiểm duyệt Voucher VIP. </w:t>
-      </w:r>
-    </w:p>
-    <w:p>
-      <w:pPr>
-        <w:rPr>
-          <w:b/>
-          <w:bCs/>
-          <w:lang w:val="vi-VN"/>
+        <w:t>moderator_dashboard_screen.dart</w:t>
+      </w:r>
+    </w:p>
+    <w:p>
+      <w:pPr>
+        <w:numPr>
+          <w:ilvl w:val="1"/>
+          <w:numId w:val="9"/>
+        </w:numPr>
+        <w:rPr>
+          <w:lang w:val="vi-VN"/>
+        </w:rPr>
+      </w:pPr>
+      <w:r>
+        <w:rPr>
+          <w:lang w:val="vi-VN"/>
+        </w:rPr>
+        <w:t>partner_api_service.dart</w:t>
+      </w:r>
+    </w:p>
+    <w:p>
+      <w:pPr>
+        <w:numPr>
+          <w:ilvl w:val="1"/>
+          <w:numId w:val="9"/>
+        </w:numPr>
+        <w:rPr>
+          <w:lang w:val="vi-VN"/>
+        </w:rPr>
+      </w:pPr>
+      <w:r>
+        <w:rPr>
+          <w:lang w:val="vi-VN"/>
+        </w:rPr>
+        <w:t>admin_api_service.dart</w:t>
+      </w:r>
+    </w:p>
+    <w:p>
+      <w:pPr>
+        <w:rPr>
+          <w:b/>
+          <w:bCs/>
         </w:rPr>
       </w:pPr>
       <w:r>
@@ -2860,6 +3086,779 @@
           <w:lang w:val="vi-VN"/>
         </w:rPr>
         <w:t>Phase 4: Sàn giao dịch &amp; Lưu trữ VIP Voucher (VIP Voucher Shop &amp; Storage)</w:t>
+      </w:r>
+    </w:p>
+    <w:p>
+      <w:pPr>
+        <w:rPr>
+          <w:b/>
+          <w:bCs/>
+        </w:rPr>
+      </w:pPr>
+      <w:proofErr w:type="spellStart"/>
+      <w:r>
+        <w:rPr>
+          <w:b/>
+          <w:bCs/>
+        </w:rPr>
+        <w:t>Userflow</w:t>
+      </w:r>
+      <w:proofErr w:type="spellEnd"/>
+      <w:r>
+        <w:rPr>
+          <w:b/>
+          <w:bCs/>
+        </w:rPr>
+        <w:t xml:space="preserve">: </w:t>
+      </w:r>
+      <w:proofErr w:type="spellStart"/>
+      <w:r>
+        <w:rPr>
+          <w:b/>
+          <w:bCs/>
+        </w:rPr>
+        <w:t>Đối</w:t>
+      </w:r>
+      <w:proofErr w:type="spellEnd"/>
+      <w:r>
+        <w:rPr>
+          <w:b/>
+          <w:bCs/>
+        </w:rPr>
+        <w:t xml:space="preserve"> </w:t>
+      </w:r>
+      <w:proofErr w:type="spellStart"/>
+      <w:r>
+        <w:rPr>
+          <w:b/>
+          <w:bCs/>
+        </w:rPr>
+        <w:t>tác</w:t>
+      </w:r>
+      <w:proofErr w:type="spellEnd"/>
+      <w:r>
+        <w:rPr>
+          <w:b/>
+          <w:bCs/>
+        </w:rPr>
+        <w:t xml:space="preserve"> – Partner (</w:t>
+      </w:r>
+      <w:proofErr w:type="spellStart"/>
+      <w:r>
+        <w:rPr>
+          <w:b/>
+          <w:bCs/>
+        </w:rPr>
+        <w:t>từ</w:t>
+      </w:r>
+      <w:proofErr w:type="spellEnd"/>
+      <w:r>
+        <w:rPr>
+          <w:b/>
+          <w:bCs/>
+        </w:rPr>
+        <w:t xml:space="preserve"> Dashboard) </w:t>
+      </w:r>
+      <w:proofErr w:type="spellStart"/>
+      <w:r>
+        <w:rPr>
+          <w:b/>
+          <w:bCs/>
+        </w:rPr>
+        <w:t>phát</w:t>
+      </w:r>
+      <w:proofErr w:type="spellEnd"/>
+      <w:r>
+        <w:rPr>
+          <w:b/>
+          <w:bCs/>
+        </w:rPr>
+        <w:t xml:space="preserve"> </w:t>
+      </w:r>
+      <w:proofErr w:type="spellStart"/>
+      <w:r>
+        <w:rPr>
+          <w:b/>
+          <w:bCs/>
+        </w:rPr>
+        <w:t>hành</w:t>
+      </w:r>
+      <w:proofErr w:type="spellEnd"/>
+      <w:r>
+        <w:rPr>
+          <w:b/>
+          <w:bCs/>
+        </w:rPr>
+        <w:t xml:space="preserve"> Voucher VIP </w:t>
+      </w:r>
+      <w:r>
+        <w:rPr>
+          <w:b/>
+          <w:bCs/>
+        </w:rPr>
+        <w:sym w:font="Wingdings" w:char="F0E0"/>
+      </w:r>
+      <w:r>
+        <w:rPr>
+          <w:b/>
+          <w:bCs/>
+        </w:rPr>
+        <w:t xml:space="preserve"> Moderator </w:t>
+      </w:r>
+      <w:proofErr w:type="spellStart"/>
+      <w:r>
+        <w:rPr>
+          <w:b/>
+          <w:bCs/>
+        </w:rPr>
+        <w:t>duyệt</w:t>
+      </w:r>
+      <w:proofErr w:type="spellEnd"/>
+      <w:r>
+        <w:rPr>
+          <w:b/>
+          <w:bCs/>
+        </w:rPr>
+        <w:t xml:space="preserve"> (Phase </w:t>
+      </w:r>
+      <w:proofErr w:type="spellStart"/>
+      <w:r>
+        <w:rPr>
+          <w:b/>
+          <w:bCs/>
+        </w:rPr>
+        <w:t>này</w:t>
+      </w:r>
+      <w:proofErr w:type="spellEnd"/>
+      <w:r>
+        <w:rPr>
+          <w:b/>
+          <w:bCs/>
+        </w:rPr>
+        <w:t xml:space="preserve"> </w:t>
+      </w:r>
+      <w:proofErr w:type="spellStart"/>
+      <w:r>
+        <w:rPr>
+          <w:b/>
+          <w:bCs/>
+        </w:rPr>
+        <w:t>từ</w:t>
+      </w:r>
+      <w:proofErr w:type="spellEnd"/>
+      <w:r>
+        <w:rPr>
+          <w:b/>
+          <w:bCs/>
+        </w:rPr>
+        <w:t xml:space="preserve"> </w:t>
+      </w:r>
+      <w:proofErr w:type="spellStart"/>
+      <w:r>
+        <w:rPr>
+          <w:b/>
+          <w:bCs/>
+        </w:rPr>
+        <w:t>đây</w:t>
+      </w:r>
+      <w:proofErr w:type="spellEnd"/>
+      <w:r>
+        <w:rPr>
+          <w:b/>
+          <w:bCs/>
+        </w:rPr>
+        <w:t xml:space="preserve">) </w:t>
+      </w:r>
+      <w:r>
+        <w:rPr>
+          <w:b/>
+          <w:bCs/>
+        </w:rPr>
+        <w:sym w:font="Wingdings" w:char="F0E0"/>
+      </w:r>
+      <w:r>
+        <w:rPr>
+          <w:b/>
+          <w:bCs/>
+        </w:rPr>
+        <w:t xml:space="preserve"> Giao </w:t>
+      </w:r>
+      <w:proofErr w:type="spellStart"/>
+      <w:r>
+        <w:rPr>
+          <w:b/>
+          <w:bCs/>
+        </w:rPr>
+        <w:t>diện</w:t>
+      </w:r>
+      <w:proofErr w:type="spellEnd"/>
+      <w:r>
+        <w:rPr>
+          <w:b/>
+          <w:bCs/>
+        </w:rPr>
+        <w:t xml:space="preserve"> Voucher </w:t>
+      </w:r>
+      <w:proofErr w:type="spellStart"/>
+      <w:r>
+        <w:rPr>
+          <w:b/>
+          <w:bCs/>
+        </w:rPr>
+        <w:t>Shoping</w:t>
+      </w:r>
+      <w:proofErr w:type="spellEnd"/>
+      <w:r>
+        <w:rPr>
+          <w:b/>
+          <w:bCs/>
+        </w:rPr>
+        <w:t xml:space="preserve"> - </w:t>
+      </w:r>
+      <w:proofErr w:type="spellStart"/>
+      <w:r>
+        <w:rPr>
+          <w:b/>
+          <w:bCs/>
+        </w:rPr>
+        <w:t>xem</w:t>
+      </w:r>
+      <w:proofErr w:type="spellEnd"/>
+      <w:r>
+        <w:rPr>
+          <w:b/>
+          <w:bCs/>
+        </w:rPr>
+        <w:t xml:space="preserve">, </w:t>
+      </w:r>
+      <w:proofErr w:type="spellStart"/>
+      <w:r>
+        <w:rPr>
+          <w:b/>
+          <w:bCs/>
+        </w:rPr>
+        <w:t>lướt</w:t>
+      </w:r>
+      <w:proofErr w:type="spellEnd"/>
+      <w:r>
+        <w:rPr>
+          <w:b/>
+          <w:bCs/>
+        </w:rPr>
+        <w:t xml:space="preserve">, </w:t>
+      </w:r>
+      <w:proofErr w:type="spellStart"/>
+      <w:r>
+        <w:rPr>
+          <w:b/>
+          <w:bCs/>
+        </w:rPr>
+        <w:t>mua</w:t>
+      </w:r>
+      <w:proofErr w:type="spellEnd"/>
+      <w:r>
+        <w:rPr>
+          <w:b/>
+          <w:bCs/>
+        </w:rPr>
+        <w:t xml:space="preserve"> Voucher </w:t>
+      </w:r>
+      <w:proofErr w:type="spellStart"/>
+      <w:r>
+        <w:rPr>
+          <w:b/>
+          <w:bCs/>
+        </w:rPr>
+        <w:t>đa</w:t>
+      </w:r>
+      <w:proofErr w:type="spellEnd"/>
+      <w:r>
+        <w:rPr>
+          <w:b/>
+          <w:bCs/>
+        </w:rPr>
+        <w:t xml:space="preserve"> </w:t>
+      </w:r>
+      <w:proofErr w:type="spellStart"/>
+      <w:r>
+        <w:rPr>
+          <w:b/>
+          <w:bCs/>
+        </w:rPr>
+        <w:t>dạng</w:t>
+      </w:r>
+      <w:proofErr w:type="spellEnd"/>
+      <w:r>
+        <w:rPr>
+          <w:b/>
+          <w:bCs/>
+        </w:rPr>
+        <w:t xml:space="preserve"> </w:t>
+      </w:r>
+      <w:proofErr w:type="spellStart"/>
+      <w:r>
+        <w:rPr>
+          <w:b/>
+          <w:bCs/>
+        </w:rPr>
+        <w:t>phù</w:t>
+      </w:r>
+      <w:proofErr w:type="spellEnd"/>
+      <w:r>
+        <w:rPr>
+          <w:b/>
+          <w:bCs/>
+        </w:rPr>
+        <w:t xml:space="preserve"> </w:t>
+      </w:r>
+      <w:proofErr w:type="spellStart"/>
+      <w:r>
+        <w:rPr>
+          <w:b/>
+          <w:bCs/>
+        </w:rPr>
+        <w:t>hợp</w:t>
+      </w:r>
+      <w:proofErr w:type="spellEnd"/>
+      <w:r>
+        <w:rPr>
+          <w:b/>
+          <w:bCs/>
+        </w:rPr>
+        <w:t xml:space="preserve"> (</w:t>
+      </w:r>
+      <w:proofErr w:type="spellStart"/>
+      <w:r>
+        <w:rPr>
+          <w:b/>
+          <w:bCs/>
+        </w:rPr>
+        <w:t>đa</w:t>
+      </w:r>
+      <w:proofErr w:type="spellEnd"/>
+      <w:r>
+        <w:rPr>
+          <w:b/>
+          <w:bCs/>
+        </w:rPr>
+        <w:t xml:space="preserve"> </w:t>
+      </w:r>
+      <w:proofErr w:type="spellStart"/>
+      <w:r>
+        <w:rPr>
+          <w:b/>
+          <w:bCs/>
+        </w:rPr>
+        <w:t>lưới</w:t>
+      </w:r>
+      <w:proofErr w:type="spellEnd"/>
+      <w:r>
+        <w:rPr>
+          <w:b/>
+          <w:bCs/>
+        </w:rPr>
+        <w:t xml:space="preserve"> </w:t>
+      </w:r>
+      <w:proofErr w:type="spellStart"/>
+      <w:r>
+        <w:rPr>
+          <w:b/>
+          <w:bCs/>
+        </w:rPr>
+        <w:t>ngang</w:t>
+      </w:r>
+      <w:proofErr w:type="spellEnd"/>
+      <w:r>
+        <w:rPr>
+          <w:b/>
+          <w:bCs/>
+        </w:rPr>
+        <w:t xml:space="preserve">, </w:t>
+      </w:r>
+      <w:proofErr w:type="spellStart"/>
+      <w:proofErr w:type="gramStart"/>
+      <w:r>
+        <w:rPr>
+          <w:b/>
+          <w:bCs/>
+        </w:rPr>
+        <w:t>dọc</w:t>
+      </w:r>
+      <w:proofErr w:type="spellEnd"/>
+      <w:r>
+        <w:rPr>
+          <w:b/>
+          <w:bCs/>
+        </w:rPr>
+        <w:t>,…</w:t>
+      </w:r>
+      <w:proofErr w:type="gramEnd"/>
+      <w:r>
+        <w:rPr>
+          <w:b/>
+          <w:bCs/>
+        </w:rPr>
+        <w:t xml:space="preserve"> </w:t>
+      </w:r>
+      <w:proofErr w:type="spellStart"/>
+      <w:r>
+        <w:rPr>
+          <w:b/>
+          <w:bCs/>
+        </w:rPr>
+        <w:t>tương</w:t>
+      </w:r>
+      <w:proofErr w:type="spellEnd"/>
+      <w:r>
+        <w:rPr>
+          <w:b/>
+          <w:bCs/>
+        </w:rPr>
+        <w:t xml:space="preserve"> </w:t>
+      </w:r>
+      <w:proofErr w:type="spellStart"/>
+      <w:r>
+        <w:rPr>
+          <w:b/>
+          <w:bCs/>
+        </w:rPr>
+        <w:t>tự</w:t>
+      </w:r>
+      <w:proofErr w:type="spellEnd"/>
+      <w:r>
+        <w:rPr>
+          <w:b/>
+          <w:bCs/>
+        </w:rPr>
+        <w:t xml:space="preserve"> </w:t>
+      </w:r>
+      <w:proofErr w:type="spellStart"/>
+      <w:r>
+        <w:rPr>
+          <w:b/>
+          <w:bCs/>
+        </w:rPr>
+        <w:t>như</w:t>
+      </w:r>
+      <w:proofErr w:type="spellEnd"/>
+      <w:r>
+        <w:rPr>
+          <w:b/>
+          <w:bCs/>
+        </w:rPr>
+        <w:t xml:space="preserve"> </w:t>
+      </w:r>
+      <w:proofErr w:type="spellStart"/>
+      <w:r>
+        <w:rPr>
+          <w:b/>
+          <w:bCs/>
+        </w:rPr>
+        <w:t>explore_screen</w:t>
+      </w:r>
+      <w:proofErr w:type="spellEnd"/>
+      <w:r>
+        <w:rPr>
+          <w:b/>
+          <w:bCs/>
+        </w:rPr>
+        <w:t xml:space="preserve">) </w:t>
+      </w:r>
+      <w:r>
+        <w:rPr>
+          <w:b/>
+          <w:bCs/>
+        </w:rPr>
+        <w:sym w:font="Wingdings" w:char="F0E0"/>
+      </w:r>
+      <w:r>
+        <w:rPr>
+          <w:b/>
+          <w:bCs/>
+        </w:rPr>
+        <w:t xml:space="preserve"> Xem Preview </w:t>
+      </w:r>
+      <w:r>
+        <w:rPr>
+          <w:b/>
+          <w:bCs/>
+        </w:rPr>
+        <w:sym w:font="Wingdings" w:char="F0E0"/>
+      </w:r>
+      <w:r>
+        <w:rPr>
+          <w:b/>
+          <w:bCs/>
+        </w:rPr>
+        <w:t xml:space="preserve"> Xem chi </w:t>
+      </w:r>
+      <w:proofErr w:type="spellStart"/>
+      <w:r>
+        <w:rPr>
+          <w:b/>
+          <w:bCs/>
+        </w:rPr>
+        <w:t>tiết</w:t>
+      </w:r>
+      <w:proofErr w:type="spellEnd"/>
+      <w:r>
+        <w:rPr>
+          <w:b/>
+          <w:bCs/>
+        </w:rPr>
+        <w:t xml:space="preserve"> </w:t>
+      </w:r>
+      <w:r>
+        <w:rPr>
+          <w:b/>
+          <w:bCs/>
+        </w:rPr>
+        <w:sym w:font="Wingdings" w:char="F0E0"/>
+      </w:r>
+      <w:r>
+        <w:rPr>
+          <w:b/>
+          <w:bCs/>
+        </w:rPr>
+        <w:t xml:space="preserve"> Mua – </w:t>
+      </w:r>
+      <w:proofErr w:type="spellStart"/>
+      <w:r>
+        <w:rPr>
+          <w:b/>
+          <w:bCs/>
+        </w:rPr>
+        <w:t>thanh</w:t>
+      </w:r>
+      <w:proofErr w:type="spellEnd"/>
+      <w:r>
+        <w:rPr>
+          <w:b/>
+          <w:bCs/>
+        </w:rPr>
+        <w:t xml:space="preserve"> </w:t>
+      </w:r>
+      <w:proofErr w:type="spellStart"/>
+      <w:r>
+        <w:rPr>
+          <w:b/>
+          <w:bCs/>
+        </w:rPr>
+        <w:t>toán</w:t>
+      </w:r>
+      <w:proofErr w:type="spellEnd"/>
+      <w:r>
+        <w:rPr>
+          <w:b/>
+          <w:bCs/>
+        </w:rPr>
+        <w:t xml:space="preserve"> Voucher </w:t>
+      </w:r>
+      <w:r>
+        <w:rPr>
+          <w:b/>
+          <w:bCs/>
+        </w:rPr>
+        <w:sym w:font="Wingdings" w:char="F0E0"/>
+      </w:r>
+      <w:r>
+        <w:rPr>
+          <w:b/>
+          <w:bCs/>
+        </w:rPr>
+        <w:t xml:space="preserve"> </w:t>
+      </w:r>
+      <w:proofErr w:type="spellStart"/>
+      <w:r>
+        <w:rPr>
+          <w:b/>
+          <w:bCs/>
+        </w:rPr>
+        <w:t>Voucher</w:t>
+      </w:r>
+      <w:proofErr w:type="spellEnd"/>
+      <w:r>
+        <w:rPr>
+          <w:b/>
+          <w:bCs/>
+        </w:rPr>
+        <w:t xml:space="preserve"> </w:t>
+      </w:r>
+      <w:proofErr w:type="spellStart"/>
+      <w:r>
+        <w:rPr>
+          <w:b/>
+          <w:bCs/>
+        </w:rPr>
+        <w:t>được</w:t>
+      </w:r>
+      <w:proofErr w:type="spellEnd"/>
+      <w:r>
+        <w:rPr>
+          <w:b/>
+          <w:bCs/>
+        </w:rPr>
+        <w:t xml:space="preserve"> </w:t>
+      </w:r>
+      <w:proofErr w:type="spellStart"/>
+      <w:r>
+        <w:rPr>
+          <w:b/>
+          <w:bCs/>
+        </w:rPr>
+        <w:t>lưu</w:t>
+      </w:r>
+      <w:proofErr w:type="spellEnd"/>
+      <w:r>
+        <w:rPr>
+          <w:b/>
+          <w:bCs/>
+        </w:rPr>
+        <w:t xml:space="preserve"> </w:t>
+      </w:r>
+      <w:proofErr w:type="spellStart"/>
+      <w:r>
+        <w:rPr>
+          <w:b/>
+          <w:bCs/>
+        </w:rPr>
+        <w:t>vào</w:t>
+      </w:r>
+      <w:proofErr w:type="spellEnd"/>
+      <w:r>
+        <w:rPr>
+          <w:b/>
+          <w:bCs/>
+        </w:rPr>
+        <w:t xml:space="preserve"> Promo Screen (deep link </w:t>
+      </w:r>
+      <w:proofErr w:type="spellStart"/>
+      <w:r>
+        <w:rPr>
+          <w:b/>
+          <w:bCs/>
+        </w:rPr>
+        <w:t>để</w:t>
+      </w:r>
+      <w:proofErr w:type="spellEnd"/>
+      <w:r>
+        <w:rPr>
+          <w:b/>
+          <w:bCs/>
+        </w:rPr>
+        <w:t xml:space="preserve"> </w:t>
+      </w:r>
+      <w:proofErr w:type="spellStart"/>
+      <w:r>
+        <w:rPr>
+          <w:b/>
+          <w:bCs/>
+        </w:rPr>
+        <w:t>người</w:t>
+      </w:r>
+      <w:proofErr w:type="spellEnd"/>
+      <w:r>
+        <w:rPr>
+          <w:b/>
+          <w:bCs/>
+        </w:rPr>
+        <w:t xml:space="preserve"> </w:t>
+      </w:r>
+      <w:proofErr w:type="spellStart"/>
+      <w:r>
+        <w:rPr>
+          <w:b/>
+          <w:bCs/>
+        </w:rPr>
+        <w:t>dùng</w:t>
+      </w:r>
+      <w:proofErr w:type="spellEnd"/>
+      <w:r>
+        <w:rPr>
+          <w:b/>
+          <w:bCs/>
+        </w:rPr>
+        <w:t xml:space="preserve"> </w:t>
+      </w:r>
+      <w:proofErr w:type="spellStart"/>
+      <w:r>
+        <w:rPr>
+          <w:b/>
+          <w:bCs/>
+        </w:rPr>
+        <w:t>có</w:t>
+      </w:r>
+      <w:proofErr w:type="spellEnd"/>
+      <w:r>
+        <w:rPr>
+          <w:b/>
+          <w:bCs/>
+        </w:rPr>
+        <w:t xml:space="preserve"> </w:t>
+      </w:r>
+      <w:proofErr w:type="spellStart"/>
+      <w:r>
+        <w:rPr>
+          <w:b/>
+          <w:bCs/>
+        </w:rPr>
+        <w:t>thể</w:t>
+      </w:r>
+      <w:proofErr w:type="spellEnd"/>
+      <w:r>
+        <w:rPr>
+          <w:b/>
+          <w:bCs/>
+        </w:rPr>
+        <w:t xml:space="preserve"> click </w:t>
+      </w:r>
+      <w:proofErr w:type="spellStart"/>
+      <w:r>
+        <w:rPr>
+          <w:b/>
+          <w:bCs/>
+        </w:rPr>
+        <w:t>và</w:t>
+      </w:r>
+      <w:proofErr w:type="spellEnd"/>
+      <w:r>
+        <w:rPr>
+          <w:b/>
+          <w:bCs/>
+        </w:rPr>
+        <w:t xml:space="preserve"> </w:t>
+      </w:r>
+      <w:proofErr w:type="spellStart"/>
+      <w:r>
+        <w:rPr>
+          <w:b/>
+          <w:bCs/>
+        </w:rPr>
+        <w:t>trỏ</w:t>
+      </w:r>
+      <w:proofErr w:type="spellEnd"/>
+      <w:r>
+        <w:rPr>
+          <w:b/>
+          <w:bCs/>
+        </w:rPr>
+        <w:t xml:space="preserve"> </w:t>
+      </w:r>
+      <w:proofErr w:type="spellStart"/>
+      <w:r>
+        <w:rPr>
+          <w:b/>
+          <w:bCs/>
+        </w:rPr>
+        <w:t>về</w:t>
+      </w:r>
+      <w:proofErr w:type="spellEnd"/>
+      <w:r>
+        <w:rPr>
+          <w:b/>
+          <w:bCs/>
+        </w:rPr>
+        <w:t>).</w:t>
       </w:r>
     </w:p>
     <w:p>
@@ -2971,7 +3970,6 @@
           <w:bCs/>
           <w:lang w:val="vi-VN"/>
         </w:rPr>
-        <w:lastRenderedPageBreak/>
         <w:t>Backend (Backend/):</w:t>
       </w:r>
     </w:p>
@@ -2995,7 +3993,7 @@
     <w:p>
       <w:pPr>
         <w:numPr>
-          <w:ilvl w:val="2"/>
+          <w:ilvl w:val="1"/>
           <w:numId w:val="12"/>
         </w:numPr>
         <w:rPr>
@@ -3003,10 +4001,240 @@
         </w:rPr>
       </w:pPr>
       <w:r>
-        <w:rPr>
-          <w:lang w:val="vi-VN"/>
-        </w:rPr>
-        <w:t xml:space="preserve">API /vouchers/vip/public (GET): Lấy danh sách Voucher VIP đã duyệt (APPROVED), hỗ trợ filter theo khung giờ, khoảng giá điểm, tìm kiếm tên cơ sở/voucher. </w:t>
+        <w:t>schemas.py.</w:t>
+      </w:r>
+    </w:p>
+    <w:p>
+      <w:pPr>
+        <w:numPr>
+          <w:ilvl w:val="0"/>
+          <w:numId w:val="12"/>
+        </w:numPr>
+        <w:rPr>
+          <w:lang w:val="vi-VN"/>
+        </w:rPr>
+      </w:pPr>
+      <w:r>
+        <w:rPr>
+          <w:b/>
+          <w:bCs/>
+          <w:lang w:val="vi-VN"/>
+        </w:rPr>
+        <w:t>Mobile (Mobile/):</w:t>
+      </w:r>
+    </w:p>
+    <w:p>
+      <w:pPr>
+        <w:numPr>
+          <w:ilvl w:val="1"/>
+          <w:numId w:val="12"/>
+        </w:numPr>
+        <w:rPr>
+          <w:lang w:val="vi-VN"/>
+        </w:rPr>
+      </w:pPr>
+      <w:r>
+        <w:rPr>
+          <w:lang w:val="vi-VN"/>
+        </w:rPr>
+        <w:t xml:space="preserve">lib/presentation/screens/promo/promo_screen.dart: </w:t>
+      </w:r>
+      <w:proofErr w:type="spellStart"/>
+      <w:r>
+        <w:t>Nâng</w:t>
+      </w:r>
+      <w:proofErr w:type="spellEnd"/>
+      <w:r>
+        <w:t xml:space="preserve"> </w:t>
+      </w:r>
+      <w:proofErr w:type="spellStart"/>
+      <w:r>
+        <w:t>cấp</w:t>
+      </w:r>
+      <w:proofErr w:type="spellEnd"/>
+      <w:r>
+        <w:t xml:space="preserve"> </w:t>
+      </w:r>
+      <w:proofErr w:type="spellStart"/>
+      <w:r>
+        <w:t>thành</w:t>
+      </w:r>
+      <w:proofErr w:type="spellEnd"/>
+      <w:r>
+        <w:t xml:space="preserve"> </w:t>
+      </w:r>
+      <w:proofErr w:type="spellStart"/>
+      <w:r>
+        <w:t>giao</w:t>
+      </w:r>
+      <w:proofErr w:type="spellEnd"/>
+      <w:r>
+        <w:t xml:space="preserve"> </w:t>
+      </w:r>
+      <w:proofErr w:type="spellStart"/>
+      <w:r>
+        <w:t>diện</w:t>
+      </w:r>
+      <w:proofErr w:type="spellEnd"/>
+      <w:r>
+        <w:t xml:space="preserve"> </w:t>
+      </w:r>
+      <w:proofErr w:type="spellStart"/>
+      <w:r>
+        <w:t>lưu</w:t>
+      </w:r>
+      <w:proofErr w:type="spellEnd"/>
+      <w:r>
+        <w:t xml:space="preserve"> </w:t>
+      </w:r>
+      <w:proofErr w:type="spellStart"/>
+      <w:r>
+        <w:t>trữ</w:t>
+      </w:r>
+      <w:proofErr w:type="spellEnd"/>
+      <w:r>
+        <w:t xml:space="preserve"> 2 </w:t>
+      </w:r>
+      <w:proofErr w:type="spellStart"/>
+      <w:r>
+        <w:t>loại</w:t>
+      </w:r>
+      <w:proofErr w:type="spellEnd"/>
+      <w:r>
+        <w:t xml:space="preserve"> voucher </w:t>
+      </w:r>
+      <w:proofErr w:type="spellStart"/>
+      <w:r>
+        <w:t>riêng</w:t>
+      </w:r>
+      <w:proofErr w:type="spellEnd"/>
+      <w:r>
+        <w:t xml:space="preserve"> </w:t>
+      </w:r>
+      <w:proofErr w:type="spellStart"/>
+      <w:r>
+        <w:t>biệt</w:t>
+      </w:r>
+      <w:proofErr w:type="spellEnd"/>
+      <w:r>
+        <w:t xml:space="preserve">, </w:t>
+      </w:r>
+      <w:proofErr w:type="spellStart"/>
+      <w:r>
+        <w:t>trực</w:t>
+      </w:r>
+      <w:proofErr w:type="spellEnd"/>
+      <w:r>
+        <w:t xml:space="preserve"> </w:t>
+      </w:r>
+      <w:proofErr w:type="spellStart"/>
+      <w:r>
+        <w:t>quan</w:t>
+      </w:r>
+      <w:proofErr w:type="spellEnd"/>
+      <w:r>
+        <w:t xml:space="preserve">, premium, </w:t>
+      </w:r>
+      <w:proofErr w:type="spellStart"/>
+      <w:r>
+        <w:t>thực</w:t>
+      </w:r>
+      <w:proofErr w:type="spellEnd"/>
+      <w:r>
+        <w:t xml:space="preserve"> </w:t>
+      </w:r>
+      <w:proofErr w:type="spellStart"/>
+      <w:r>
+        <w:t>thụ</w:t>
+      </w:r>
+      <w:proofErr w:type="spellEnd"/>
+      <w:r>
+        <w:t>.</w:t>
+      </w:r>
+    </w:p>
+    <w:p>
+      <w:pPr>
+        <w:numPr>
+          <w:ilvl w:val="1"/>
+          <w:numId w:val="12"/>
+        </w:numPr>
+        <w:rPr>
+          <w:lang w:val="vi-VN"/>
+        </w:rPr>
+      </w:pPr>
+      <w:r>
+        <w:rPr>
+          <w:lang w:val="vi-VN"/>
+        </w:rPr>
+        <w:t>Tạ</w:t>
+      </w:r>
+      <w:r>
+        <w:t>/</w:t>
+      </w:r>
+      <w:proofErr w:type="spellStart"/>
+      <w:r>
+        <w:t>nâng</w:t>
+      </w:r>
+      <w:proofErr w:type="spellEnd"/>
+      <w:r>
+        <w:t xml:space="preserve"> </w:t>
+      </w:r>
+      <w:proofErr w:type="spellStart"/>
+      <w:r>
+        <w:t>cấp</w:t>
+      </w:r>
+      <w:proofErr w:type="spellEnd"/>
+      <w:r>
+        <w:t xml:space="preserve"> </w:t>
+      </w:r>
+      <w:proofErr w:type="spellStart"/>
+      <w:r>
+        <w:t>giao</w:t>
+      </w:r>
+      <w:proofErr w:type="spellEnd"/>
+      <w:r>
+        <w:t xml:space="preserve"> </w:t>
+      </w:r>
+      <w:proofErr w:type="spellStart"/>
+      <w:r>
+        <w:t>diện</w:t>
+      </w:r>
+      <w:proofErr w:type="spellEnd"/>
+      <w:r>
+        <w:rPr>
+          <w:lang w:val="vi-VN"/>
+        </w:rPr>
+        <w:t xml:space="preserve"> </w:t>
+      </w:r>
+      <w:proofErr w:type="spellStart"/>
+      <w:r>
+        <w:t>đa</w:t>
+      </w:r>
+      <w:proofErr w:type="spellEnd"/>
+      <w:r>
+        <w:t xml:space="preserve"> </w:t>
+      </w:r>
+      <w:proofErr w:type="spellStart"/>
+      <w:r>
+        <w:t>lưới</w:t>
+      </w:r>
+      <w:proofErr w:type="spellEnd"/>
+      <w:r>
+        <w:t xml:space="preserve"> (</w:t>
+      </w:r>
+      <w:proofErr w:type="spellStart"/>
+      <w:r>
+        <w:t>như</w:t>
+      </w:r>
+      <w:proofErr w:type="spellEnd"/>
+      <w:r>
+        <w:t xml:space="preserve"> explore screen) </w:t>
+      </w:r>
+      <w:r>
+        <w:rPr>
+          <w:lang w:val="vi-VN"/>
+        </w:rPr>
+        <w:t>screen/widget mới:</w:t>
       </w:r>
     </w:p>
     <w:p>
@@ -3023,90 +4251,8 @@
         <w:rPr>
           <w:lang w:val="vi-VN"/>
         </w:rPr>
-        <w:t xml:space="preserve">API /vouchers/{voucher_code}/buy-with-points (POST): Kiểm tra points_balance </w:t>
-      </w:r>
-      <m:oMath>
-        <m:r>
-          <w:rPr>
-            <w:rFonts w:ascii="Cambria Math" w:hAnsi="Cambria Math"/>
-            <w:lang w:val="vi-VN"/>
-          </w:rPr>
-          <m:t>→</m:t>
-        </m:r>
-      </m:oMath>
-      <w:r>
-        <w:rPr>
-          <w:lang w:val="vi-VN"/>
-        </w:rPr>
-        <w:t xml:space="preserve"> Trừ điểm </w:t>
-      </w:r>
-      <m:oMath>
-        <m:r>
-          <w:rPr>
-            <w:rFonts w:ascii="Cambria Math" w:hAnsi="Cambria Math"/>
-            <w:lang w:val="vi-VN"/>
-          </w:rPr>
-          <m:t>→</m:t>
-        </m:r>
-      </m:oMath>
-      <w:r>
-        <w:rPr>
-          <w:lang w:val="vi-VN"/>
-        </w:rPr>
-        <w:t xml:space="preserve"> Thêm bản ghi vào user_vouchers. </w:t>
-      </w:r>
-    </w:p>
-    <w:p>
-      <w:pPr>
-        <w:numPr>
-          <w:ilvl w:val="0"/>
-          <w:numId w:val="12"/>
-        </w:numPr>
-        <w:rPr>
-          <w:lang w:val="vi-VN"/>
-        </w:rPr>
-      </w:pPr>
-      <w:r>
-        <w:rPr>
-          <w:b/>
-          <w:bCs/>
-          <w:lang w:val="vi-VN"/>
-        </w:rPr>
-        <w:t>Mobile (Mobile/):</w:t>
-      </w:r>
-    </w:p>
-    <w:p>
-      <w:pPr>
-        <w:numPr>
-          <w:ilvl w:val="1"/>
-          <w:numId w:val="12"/>
-        </w:numPr>
-        <w:rPr>
-          <w:lang w:val="vi-VN"/>
-        </w:rPr>
-      </w:pPr>
-      <w:r>
-        <w:rPr>
-          <w:lang w:val="vi-VN"/>
-        </w:rPr>
-        <w:t xml:space="preserve">lib/presentation/screens/promo/promo_screen.dart: Nâng cấp giao diện hiển thị danh sách VIP Voucher đang bán và danh sách VIP Voucher đã mua của cá nhân. </w:t>
-      </w:r>
-    </w:p>
-    <w:p>
-      <w:pPr>
-        <w:numPr>
-          <w:ilvl w:val="1"/>
-          <w:numId w:val="12"/>
-        </w:numPr>
-        <w:rPr>
-          <w:lang w:val="vi-VN"/>
-        </w:rPr>
-      </w:pPr>
-      <w:r>
-        <w:rPr>
-          <w:lang w:val="vi-VN"/>
-        </w:rPr>
-        <w:t>Tạo screen/widget mới:</w:t>
+        <w:lastRenderedPageBreak/>
+        <w:t>VIP Voucher Shop View / Screen (Lưới lướt voucher, filter, search).</w:t>
       </w:r>
     </w:p>
     <w:p>
@@ -3123,23 +4269,6 @@
         <w:rPr>
           <w:lang w:val="vi-VN"/>
         </w:rPr>
-        <w:t>VIP Voucher Shop View / Screen (Lưới lướt voucher, filter, search).</w:t>
-      </w:r>
-    </w:p>
-    <w:p>
-      <w:pPr>
-        <w:numPr>
-          <w:ilvl w:val="2"/>
-          <w:numId w:val="12"/>
-        </w:numPr>
-        <w:rPr>
-          <w:lang w:val="vi-VN"/>
-        </w:rPr>
-      </w:pPr>
-      <w:r>
-        <w:rPr>
-          <w:lang w:val="vi-VN"/>
-        </w:rPr>
         <w:t>Sub-widgets: Popup preview chi tiết, BottomSheet thanh toán điểm &amp; Animation tick mềm mại.</w:t>
       </w:r>
     </w:p>
@@ -3389,7 +4518,6 @@
         <w:rPr>
           <w:lang w:val="vi-VN"/>
         </w:rPr>
-        <w:lastRenderedPageBreak/>
         <w:t xml:space="preserve">API /appointments/request (POST): Bổ sung hàm validate: Nếu có truyền voucher_code là VIP, bắt buộc đối soát partner_id của dịch vụ và fixed_time_slot xem có khớp với thông tin trên Voucher VIP hay không. </w:t>
       </w:r>
     </w:p>
@@ -6138,7 +7266,7 @@
   <w:style w:type="paragraph" w:default="1" w:styleId="Normal">
     <w:name w:val="Normal"/>
     <w:qFormat/>
-    <w:rsid w:val="00EA08AE"/>
+    <w:rsid w:val="002F23F0"/>
   </w:style>
   <w:style w:type="paragraph" w:styleId="Heading1">
     <w:name w:val="heading 1"/>

</xml_diff>

<commit_message>
BIG UPDATE BETA 02_Phase 09_Premium Subcription.
</commit_message>
<xml_diff>
--- a/BIG_UPDATE_BETA_02..docx
+++ b/BIG_UPDATE_BETA_02..docx
@@ -591,6 +591,7 @@
         <w:rPr>
           <w:b/>
           <w:bCs/>
+          <w:lang w:val="vi-VN"/>
         </w:rPr>
       </w:pPr>
       <w:r>
@@ -607,108 +608,22 @@
         <w:rPr>
           <w:b/>
           <w:bCs/>
-        </w:rPr>
-      </w:pPr>
-      <w:proofErr w:type="spellStart"/>
-      <w:r>
-        <w:rPr>
-          <w:b/>
-          <w:bCs/>
-        </w:rPr>
-        <w:t>Userflow</w:t>
-      </w:r>
-      <w:proofErr w:type="spellEnd"/>
-      <w:r>
-        <w:rPr>
-          <w:b/>
-          <w:bCs/>
-        </w:rPr>
-        <w:t xml:space="preserve">: Trang </w:t>
-      </w:r>
-      <w:proofErr w:type="spellStart"/>
-      <w:r>
-        <w:rPr>
-          <w:b/>
-          <w:bCs/>
-        </w:rPr>
-        <w:t>cá</w:t>
-      </w:r>
-      <w:proofErr w:type="spellEnd"/>
-      <w:r>
-        <w:rPr>
-          <w:b/>
-          <w:bCs/>
-        </w:rPr>
-        <w:t xml:space="preserve"> </w:t>
-      </w:r>
-      <w:proofErr w:type="spellStart"/>
-      <w:r>
-        <w:rPr>
-          <w:b/>
-          <w:bCs/>
-        </w:rPr>
-        <w:t>nhân</w:t>
-      </w:r>
-      <w:proofErr w:type="spellEnd"/>
-      <w:r>
-        <w:rPr>
-          <w:b/>
-          <w:bCs/>
-        </w:rPr>
-        <w:t xml:space="preserve"> (Profile </w:t>
-      </w:r>
-      <w:proofErr w:type="spellStart"/>
-      <w:r>
-        <w:rPr>
-          <w:b/>
-          <w:bCs/>
-        </w:rPr>
-        <w:t>cả</w:t>
-      </w:r>
-      <w:proofErr w:type="spellEnd"/>
-      <w:r>
-        <w:rPr>
-          <w:b/>
-          <w:bCs/>
-        </w:rPr>
-        <w:t xml:space="preserve"> </w:t>
-      </w:r>
-      <w:proofErr w:type="spellStart"/>
-      <w:r>
-        <w:rPr>
-          <w:b/>
-          <w:bCs/>
-        </w:rPr>
-        <w:t>của</w:t>
-      </w:r>
-      <w:proofErr w:type="spellEnd"/>
-      <w:r>
-        <w:rPr>
-          <w:b/>
-          <w:bCs/>
-        </w:rPr>
-        <w:t xml:space="preserve"> Creator </w:t>
-      </w:r>
-      <w:proofErr w:type="spellStart"/>
-      <w:r>
-        <w:rPr>
-          <w:b/>
-          <w:bCs/>
-        </w:rPr>
-        <w:t>và</w:t>
-      </w:r>
-      <w:proofErr w:type="spellEnd"/>
-      <w:r>
-        <w:rPr>
-          <w:b/>
-          <w:bCs/>
-        </w:rPr>
-        <w:t xml:space="preserve"> Regular User) </w:t>
-      </w:r>
-      <w:r>
-        <w:rPr>
-          <w:b/>
-          <w:bCs/>
+          <w:lang w:val="vi-VN"/>
+        </w:rPr>
+      </w:pPr>
+      <w:r>
+        <w:rPr>
+          <w:b/>
+          <w:bCs/>
+          <w:lang w:val="vi-VN"/>
+        </w:rPr>
+        <w:t xml:space="preserve">Userflow: Trang cá nhân (Profile cả của Creator và Regular User) </w:t>
+      </w:r>
+      <w:r>
+        <w:rPr>
+          <w:b/>
+          <w:bCs/>
+          <w:lang w:val="vi-VN"/>
         </w:rPr>
         <w:sym w:font="Wingdings" w:char="F0E0"/>
       </w:r>
@@ -716,589 +631,15 @@
         <w:rPr>
           <w:b/>
           <w:bCs/>
-        </w:rPr>
-        <w:t xml:space="preserve"> Wallet (</w:t>
-      </w:r>
-      <w:proofErr w:type="spellStart"/>
-      <w:r>
-        <w:rPr>
-          <w:b/>
-          <w:bCs/>
-        </w:rPr>
-        <w:t>xem</w:t>
-      </w:r>
-      <w:proofErr w:type="spellEnd"/>
-      <w:r>
-        <w:rPr>
-          <w:b/>
-          <w:bCs/>
-        </w:rPr>
-        <w:t xml:space="preserve"> </w:t>
-      </w:r>
-      <w:proofErr w:type="spellStart"/>
-      <w:r>
-        <w:rPr>
-          <w:b/>
-          <w:bCs/>
-        </w:rPr>
-        <w:t>số</w:t>
-      </w:r>
-      <w:proofErr w:type="spellEnd"/>
-      <w:r>
-        <w:rPr>
-          <w:b/>
-          <w:bCs/>
-        </w:rPr>
-        <w:t xml:space="preserve"> </w:t>
-      </w:r>
-      <w:proofErr w:type="spellStart"/>
-      <w:r>
-        <w:rPr>
-          <w:b/>
-          <w:bCs/>
-        </w:rPr>
-        <w:t>dư</w:t>
-      </w:r>
-      <w:proofErr w:type="spellEnd"/>
-      <w:r>
-        <w:rPr>
-          <w:b/>
-          <w:bCs/>
-        </w:rPr>
-        <w:t xml:space="preserve"> </w:t>
-      </w:r>
-      <w:proofErr w:type="spellStart"/>
-      <w:r>
-        <w:rPr>
-          <w:b/>
-          <w:bCs/>
-        </w:rPr>
-        <w:t>ví</w:t>
-      </w:r>
-      <w:proofErr w:type="spellEnd"/>
-      <w:r>
-        <w:rPr>
-          <w:b/>
-          <w:bCs/>
-        </w:rPr>
-        <w:t xml:space="preserve"> – </w:t>
-      </w:r>
-      <w:proofErr w:type="spellStart"/>
-      <w:r>
-        <w:rPr>
-          <w:b/>
-          <w:bCs/>
-        </w:rPr>
-        <w:t>điểm</w:t>
-      </w:r>
-      <w:proofErr w:type="spellEnd"/>
-      <w:r>
-        <w:rPr>
-          <w:b/>
-          <w:bCs/>
-        </w:rPr>
-        <w:t xml:space="preserve">, </w:t>
-      </w:r>
-      <w:proofErr w:type="spellStart"/>
-      <w:r>
-        <w:rPr>
-          <w:b/>
-          <w:bCs/>
-        </w:rPr>
-        <w:t>tích</w:t>
-      </w:r>
-      <w:proofErr w:type="spellEnd"/>
-      <w:r>
-        <w:rPr>
-          <w:b/>
-          <w:bCs/>
-        </w:rPr>
-        <w:t xml:space="preserve"> </w:t>
-      </w:r>
-      <w:proofErr w:type="spellStart"/>
-      <w:r>
-        <w:rPr>
-          <w:b/>
-          <w:bCs/>
-        </w:rPr>
-        <w:t>hợp</w:t>
-      </w:r>
-      <w:proofErr w:type="spellEnd"/>
-      <w:r>
-        <w:rPr>
-          <w:b/>
-          <w:bCs/>
-        </w:rPr>
-        <w:t xml:space="preserve"> </w:t>
-      </w:r>
-      <w:proofErr w:type="spellStart"/>
-      <w:r>
-        <w:rPr>
-          <w:b/>
-          <w:bCs/>
-        </w:rPr>
-        <w:t>cả</w:t>
-      </w:r>
-      <w:proofErr w:type="spellEnd"/>
-      <w:r>
-        <w:rPr>
-          <w:b/>
-          <w:bCs/>
-        </w:rPr>
-        <w:t xml:space="preserve"> </w:t>
-      </w:r>
-      <w:proofErr w:type="spellStart"/>
-      <w:r>
-        <w:rPr>
-          <w:b/>
-          <w:bCs/>
-        </w:rPr>
-        <w:t>nạp</w:t>
-      </w:r>
-      <w:proofErr w:type="spellEnd"/>
-      <w:r>
-        <w:rPr>
-          <w:b/>
-          <w:bCs/>
-        </w:rPr>
-        <w:t xml:space="preserve"> </w:t>
-      </w:r>
-      <w:proofErr w:type="spellStart"/>
-      <w:r>
-        <w:rPr>
-          <w:b/>
-          <w:bCs/>
-        </w:rPr>
-        <w:t>tiền</w:t>
-      </w:r>
-      <w:proofErr w:type="spellEnd"/>
-      <w:r>
-        <w:rPr>
-          <w:b/>
-          <w:bCs/>
-        </w:rPr>
-        <w:t xml:space="preserve"> </w:t>
-      </w:r>
-      <w:proofErr w:type="spellStart"/>
-      <w:r>
-        <w:rPr>
-          <w:b/>
-          <w:bCs/>
-        </w:rPr>
-        <w:t>đổi</w:t>
-      </w:r>
-      <w:proofErr w:type="spellEnd"/>
-      <w:r>
-        <w:rPr>
-          <w:b/>
-          <w:bCs/>
-        </w:rPr>
-        <w:t xml:space="preserve"> </w:t>
-      </w:r>
-      <w:proofErr w:type="spellStart"/>
-      <w:r>
-        <w:rPr>
-          <w:b/>
-          <w:bCs/>
-        </w:rPr>
-        <w:t>điểm</w:t>
-      </w:r>
-      <w:proofErr w:type="spellEnd"/>
-      <w:r>
-        <w:rPr>
-          <w:b/>
-          <w:bCs/>
-        </w:rPr>
-        <w:t xml:space="preserve"> </w:t>
-      </w:r>
-      <w:proofErr w:type="spellStart"/>
-      <w:r>
-        <w:rPr>
-          <w:b/>
-          <w:bCs/>
-        </w:rPr>
-        <w:t>tại</w:t>
-      </w:r>
-      <w:proofErr w:type="spellEnd"/>
-      <w:r>
-        <w:rPr>
-          <w:b/>
-          <w:bCs/>
-        </w:rPr>
-        <w:t xml:space="preserve"> </w:t>
-      </w:r>
-      <w:proofErr w:type="spellStart"/>
-      <w:r>
-        <w:rPr>
-          <w:b/>
-          <w:bCs/>
-        </w:rPr>
-        <w:t>đây</w:t>
-      </w:r>
-      <w:proofErr w:type="spellEnd"/>
-      <w:r>
-        <w:rPr>
-          <w:b/>
-          <w:bCs/>
-        </w:rPr>
-        <w:t xml:space="preserve">, </w:t>
-      </w:r>
-      <w:proofErr w:type="spellStart"/>
-      <w:r>
-        <w:rPr>
-          <w:b/>
-          <w:bCs/>
-        </w:rPr>
-        <w:t>cho</w:t>
-      </w:r>
-      <w:proofErr w:type="spellEnd"/>
-      <w:r>
-        <w:rPr>
-          <w:b/>
-          <w:bCs/>
-        </w:rPr>
-        <w:t xml:space="preserve"> </w:t>
-      </w:r>
-      <w:proofErr w:type="spellStart"/>
-      <w:r>
-        <w:rPr>
-          <w:b/>
-          <w:bCs/>
-        </w:rPr>
-        <w:t>phép</w:t>
-      </w:r>
-      <w:proofErr w:type="spellEnd"/>
-      <w:r>
-        <w:rPr>
-          <w:b/>
-          <w:bCs/>
-        </w:rPr>
-        <w:t xml:space="preserve"> </w:t>
-      </w:r>
-      <w:proofErr w:type="spellStart"/>
-      <w:r>
-        <w:rPr>
-          <w:b/>
-          <w:bCs/>
-        </w:rPr>
-        <w:t>chọn</w:t>
-      </w:r>
-      <w:proofErr w:type="spellEnd"/>
-      <w:r>
-        <w:rPr>
-          <w:b/>
-          <w:bCs/>
-        </w:rPr>
-        <w:t xml:space="preserve"> </w:t>
-      </w:r>
-      <w:proofErr w:type="spellStart"/>
-      <w:r>
-        <w:rPr>
-          <w:b/>
-          <w:bCs/>
-        </w:rPr>
-        <w:t>số</w:t>
-      </w:r>
-      <w:proofErr w:type="spellEnd"/>
-      <w:r>
-        <w:rPr>
-          <w:b/>
-          <w:bCs/>
-        </w:rPr>
-        <w:t xml:space="preserve"> </w:t>
-      </w:r>
-      <w:proofErr w:type="spellStart"/>
-      <w:r>
-        <w:rPr>
-          <w:b/>
-          <w:bCs/>
-        </w:rPr>
-        <w:t>tiền</w:t>
-      </w:r>
-      <w:proofErr w:type="spellEnd"/>
-      <w:r>
-        <w:rPr>
-          <w:b/>
-          <w:bCs/>
-        </w:rPr>
-        <w:t xml:space="preserve"> </w:t>
-      </w:r>
-      <w:proofErr w:type="spellStart"/>
-      <w:r>
-        <w:rPr>
-          <w:b/>
-          <w:bCs/>
-        </w:rPr>
-        <w:t>muốn</w:t>
-      </w:r>
-      <w:proofErr w:type="spellEnd"/>
-      <w:r>
-        <w:rPr>
-          <w:b/>
-          <w:bCs/>
-        </w:rPr>
-        <w:t xml:space="preserve"> </w:t>
-      </w:r>
-      <w:proofErr w:type="spellStart"/>
-      <w:r>
-        <w:rPr>
-          <w:b/>
-          <w:bCs/>
-        </w:rPr>
-        <w:t>nạp</w:t>
-      </w:r>
-      <w:proofErr w:type="spellEnd"/>
-      <w:r>
-        <w:rPr>
-          <w:b/>
-          <w:bCs/>
-        </w:rPr>
-        <w:t xml:space="preserve"> (</w:t>
-      </w:r>
-      <w:proofErr w:type="spellStart"/>
-      <w:r>
-        <w:rPr>
-          <w:b/>
-          <w:bCs/>
-        </w:rPr>
-        <w:t>tối</w:t>
-      </w:r>
-      <w:proofErr w:type="spellEnd"/>
-      <w:r>
-        <w:rPr>
-          <w:b/>
-          <w:bCs/>
-        </w:rPr>
-        <w:t xml:space="preserve"> </w:t>
-      </w:r>
-      <w:proofErr w:type="spellStart"/>
-      <w:r>
-        <w:rPr>
-          <w:b/>
-          <w:bCs/>
-        </w:rPr>
-        <w:t>thiểu</w:t>
-      </w:r>
-      <w:proofErr w:type="spellEnd"/>
-      <w:r>
-        <w:rPr>
-          <w:b/>
-          <w:bCs/>
-        </w:rPr>
-        <w:t xml:space="preserve"> 10 000đ, </w:t>
-      </w:r>
-      <w:proofErr w:type="spellStart"/>
-      <w:r>
-        <w:rPr>
-          <w:b/>
-          <w:bCs/>
-        </w:rPr>
-        <w:t>bội</w:t>
-      </w:r>
-      <w:proofErr w:type="spellEnd"/>
-      <w:r>
-        <w:rPr>
-          <w:b/>
-          <w:bCs/>
-        </w:rPr>
-        <w:t xml:space="preserve"> </w:t>
-      </w:r>
-      <w:proofErr w:type="spellStart"/>
-      <w:r>
-        <w:rPr>
-          <w:b/>
-          <w:bCs/>
-        </w:rPr>
-        <w:t>của</w:t>
-      </w:r>
-      <w:proofErr w:type="spellEnd"/>
-      <w:r>
-        <w:rPr>
-          <w:b/>
-          <w:bCs/>
-        </w:rPr>
-        <w:t xml:space="preserve"> 5 000, </w:t>
-      </w:r>
-      <w:proofErr w:type="spellStart"/>
-      <w:r>
-        <w:rPr>
-          <w:b/>
-          <w:bCs/>
-        </w:rPr>
-        <w:t>hiển</w:t>
-      </w:r>
-      <w:proofErr w:type="spellEnd"/>
-      <w:r>
-        <w:rPr>
-          <w:b/>
-          <w:bCs/>
-        </w:rPr>
-        <w:t xml:space="preserve"> </w:t>
-      </w:r>
-      <w:proofErr w:type="spellStart"/>
-      <w:r>
-        <w:rPr>
-          <w:b/>
-          <w:bCs/>
-        </w:rPr>
-        <w:t>thị</w:t>
-      </w:r>
-      <w:proofErr w:type="spellEnd"/>
-      <w:r>
-        <w:rPr>
-          <w:b/>
-          <w:bCs/>
-        </w:rPr>
-        <w:t xml:space="preserve"> - </w:t>
-      </w:r>
-      <w:proofErr w:type="spellStart"/>
-      <w:r>
-        <w:rPr>
-          <w:b/>
-          <w:bCs/>
-        </w:rPr>
-        <w:t>kéo</w:t>
-      </w:r>
-      <w:proofErr w:type="spellEnd"/>
-      <w:r>
-        <w:rPr>
-          <w:b/>
-          <w:bCs/>
-        </w:rPr>
-        <w:t xml:space="preserve"> QR </w:t>
-      </w:r>
-      <w:proofErr w:type="spellStart"/>
-      <w:r>
-        <w:rPr>
-          <w:b/>
-          <w:bCs/>
-        </w:rPr>
-        <w:t>PayOS</w:t>
-      </w:r>
-      <w:proofErr w:type="spellEnd"/>
-      <w:r>
-        <w:rPr>
-          <w:b/>
-          <w:bCs/>
-        </w:rPr>
-        <w:t xml:space="preserve"> </w:t>
-      </w:r>
-      <w:proofErr w:type="spellStart"/>
-      <w:r>
-        <w:rPr>
-          <w:b/>
-          <w:bCs/>
-        </w:rPr>
-        <w:t>về</w:t>
-      </w:r>
-      <w:proofErr w:type="spellEnd"/>
-      <w:r>
-        <w:rPr>
-          <w:b/>
-          <w:bCs/>
-        </w:rPr>
-        <w:t xml:space="preserve"> app – </w:t>
-      </w:r>
-      <w:proofErr w:type="spellStart"/>
-      <w:r>
-        <w:rPr>
-          <w:b/>
-          <w:bCs/>
-        </w:rPr>
-        <w:t>tương</w:t>
-      </w:r>
-      <w:proofErr w:type="spellEnd"/>
-      <w:r>
-        <w:rPr>
-          <w:b/>
-          <w:bCs/>
-        </w:rPr>
-        <w:t xml:space="preserve"> </w:t>
-      </w:r>
-      <w:proofErr w:type="spellStart"/>
-      <w:r>
-        <w:rPr>
-          <w:b/>
-          <w:bCs/>
-        </w:rPr>
-        <w:t>tự</w:t>
-      </w:r>
-      <w:proofErr w:type="spellEnd"/>
-      <w:r>
-        <w:rPr>
-          <w:b/>
-          <w:bCs/>
-        </w:rPr>
-        <w:t xml:space="preserve"> </w:t>
-      </w:r>
-      <w:proofErr w:type="spellStart"/>
-      <w:r>
-        <w:rPr>
-          <w:b/>
-          <w:bCs/>
-        </w:rPr>
-        <w:t>như</w:t>
-      </w:r>
-      <w:proofErr w:type="spellEnd"/>
-      <w:r>
-        <w:rPr>
-          <w:b/>
-          <w:bCs/>
-        </w:rPr>
-        <w:t xml:space="preserve"> calendar – </w:t>
-      </w:r>
-      <w:proofErr w:type="spellStart"/>
-      <w:r>
-        <w:rPr>
-          <w:b/>
-          <w:bCs/>
-        </w:rPr>
-        <w:t>trang</w:t>
-      </w:r>
-      <w:proofErr w:type="spellEnd"/>
-      <w:r>
-        <w:rPr>
-          <w:b/>
-          <w:bCs/>
-        </w:rPr>
-        <w:t xml:space="preserve"> </w:t>
-      </w:r>
-      <w:proofErr w:type="spellStart"/>
-      <w:r>
-        <w:rPr>
-          <w:b/>
-          <w:bCs/>
-        </w:rPr>
-        <w:t>thanh</w:t>
-      </w:r>
-      <w:proofErr w:type="spellEnd"/>
-      <w:r>
-        <w:rPr>
-          <w:b/>
-          <w:bCs/>
-        </w:rPr>
-        <w:t xml:space="preserve"> </w:t>
-      </w:r>
-      <w:proofErr w:type="spellStart"/>
-      <w:r>
-        <w:rPr>
-          <w:b/>
-          <w:bCs/>
-        </w:rPr>
-        <w:t>toán</w:t>
-      </w:r>
-      <w:proofErr w:type="spellEnd"/>
-      <w:r>
-        <w:rPr>
-          <w:b/>
-          <w:bCs/>
-        </w:rPr>
-        <w:t xml:space="preserve">) </w:t>
-      </w:r>
-      <w:r>
-        <w:rPr>
-          <w:b/>
-          <w:bCs/>
+          <w:lang w:val="vi-VN"/>
+        </w:rPr>
+        <w:t xml:space="preserve"> Wallet (xem số dư ví – điểm, tích hợp cả nạp tiền đổi điểm tại đây, cho phép chọn số tiền muốn nạp (tối thiểu 10 000đ, bội của 5 000, hiển thị - kéo QR PayOS về app – tương tự như calendar – trang thanh toán) </w:t>
+      </w:r>
+      <w:r>
+        <w:rPr>
+          <w:b/>
+          <w:bCs/>
+          <w:lang w:val="vi-VN"/>
         </w:rPr>
         <w:sym w:font="Wingdings" w:char="F0E0"/>
       </w:r>
@@ -1306,6 +647,7 @@
         <w:rPr>
           <w:b/>
           <w:bCs/>
+          <w:lang w:val="vi-VN"/>
         </w:rPr>
         <w:br/>
       </w:r>
@@ -1387,13 +729,7 @@
             <w:rFonts w:ascii="Cambria Math" w:hAnsi="Cambria Math"/>
             <w:lang w:val="vi-VN"/>
           </w:rPr>
-          <m:t>=10</m:t>
-        </m:r>
-        <m:r>
-          <w:rPr>
-            <w:rFonts w:ascii="Cambria Math" w:hAnsi="Cambria Math"/>
-          </w:rPr>
-          <m:t>00</m:t>
+          <m:t>=1000</m:t>
         </m:r>
         <m:r>
           <m:rPr>
@@ -1450,45 +786,11 @@
         </w:rPr>
         <w:t xml:space="preserve"> Tách biệt hoàn toàn </w:t>
       </w:r>
-      <w:proofErr w:type="spellStart"/>
-      <w:r>
-        <w:t>với</w:t>
-      </w:r>
-      <w:proofErr w:type="spellEnd"/>
-      <w:r>
-        <w:t xml:space="preserve"> </w:t>
-      </w:r>
-      <w:proofErr w:type="spellStart"/>
-      <w:r>
-        <w:t>các</w:t>
-      </w:r>
-      <w:proofErr w:type="spellEnd"/>
-      <w:r>
-        <w:t xml:space="preserve"> </w:t>
-      </w:r>
-      <w:proofErr w:type="spellStart"/>
-      <w:r>
-        <w:t>luồng</w:t>
-      </w:r>
-      <w:proofErr w:type="spellEnd"/>
-      <w:r>
-        <w:t xml:space="preserve"> </w:t>
-      </w:r>
-      <w:proofErr w:type="spellStart"/>
-      <w:r>
-        <w:t>tiền</w:t>
-      </w:r>
-      <w:proofErr w:type="spellEnd"/>
-      <w:r>
-        <w:t xml:space="preserve"> </w:t>
-      </w:r>
-      <w:proofErr w:type="spellStart"/>
-      <w:r>
-        <w:t>khác</w:t>
-      </w:r>
-      <w:proofErr w:type="spellEnd"/>
-      <w:r>
-        <w:t>.</w:t>
+      <w:r>
+        <w:rPr>
+          <w:lang w:val="vi-VN"/>
+        </w:rPr>
+        <w:t>với các luồng tiền khác.</w:t>
       </w:r>
     </w:p>
     <w:p>
@@ -1606,15 +908,14 @@
         <w:lastRenderedPageBreak/>
         <w:t>Database (Database/</w:t>
       </w:r>
-      <w:proofErr w:type="spellStart"/>
-      <w:r>
-        <w:rPr>
-          <w:b/>
-          <w:bCs/>
+      <w:r>
+        <w:rPr>
+          <w:b/>
+          <w:bCs/>
+          <w:lang w:val="vi-VN"/>
         </w:rPr>
         <w:t>schema.sql</w:t>
       </w:r>
-      <w:proofErr w:type="spellEnd"/>
       <w:r>
         <w:rPr>
           <w:b/>
@@ -1671,6 +972,9 @@
         </w:rPr>
       </w:pPr>
       <w:r>
+        <w:rPr>
+          <w:lang w:val="vi-VN"/>
+        </w:rPr>
         <w:t>schemas.py</w:t>
       </w:r>
     </w:p>
@@ -1710,6 +1014,9 @@
         <w:t>lib/data/models/wallet_model.dart</w:t>
       </w:r>
       <w:r>
+        <w:rPr>
+          <w:lang w:val="vi-VN"/>
+        </w:rPr>
         <w:t>;</w:t>
       </w:r>
     </w:p>
@@ -1763,6 +1070,7 @@
         <w:rPr>
           <w:b/>
           <w:bCs/>
+          <w:lang w:val="vi-VN"/>
         </w:rPr>
       </w:pPr>
       <w:r>
@@ -1779,108 +1087,22 @@
         <w:rPr>
           <w:b/>
           <w:bCs/>
-        </w:rPr>
-      </w:pPr>
-      <w:proofErr w:type="spellStart"/>
-      <w:r>
-        <w:rPr>
-          <w:b/>
-          <w:bCs/>
-        </w:rPr>
-        <w:t>Userflow</w:t>
-      </w:r>
-      <w:proofErr w:type="spellEnd"/>
-      <w:r>
-        <w:rPr>
-          <w:b/>
-          <w:bCs/>
-        </w:rPr>
-        <w:t xml:space="preserve">: </w:t>
-      </w:r>
-      <w:proofErr w:type="spellStart"/>
-      <w:r>
-        <w:rPr>
-          <w:b/>
-          <w:bCs/>
-        </w:rPr>
-        <w:t>Đối</w:t>
-      </w:r>
-      <w:proofErr w:type="spellEnd"/>
-      <w:r>
-        <w:rPr>
-          <w:b/>
-          <w:bCs/>
-        </w:rPr>
-        <w:t xml:space="preserve"> </w:t>
-      </w:r>
-      <w:proofErr w:type="spellStart"/>
-      <w:r>
-        <w:rPr>
-          <w:b/>
-          <w:bCs/>
-        </w:rPr>
-        <w:t>tác</w:t>
-      </w:r>
-      <w:proofErr w:type="spellEnd"/>
-      <w:r>
-        <w:rPr>
-          <w:b/>
-          <w:bCs/>
-        </w:rPr>
-        <w:t xml:space="preserve"> – Partner (</w:t>
-      </w:r>
-      <w:proofErr w:type="spellStart"/>
-      <w:r>
-        <w:rPr>
-          <w:b/>
-          <w:bCs/>
-        </w:rPr>
-        <w:t>từ</w:t>
-      </w:r>
-      <w:proofErr w:type="spellEnd"/>
-      <w:r>
-        <w:rPr>
-          <w:b/>
-          <w:bCs/>
-        </w:rPr>
-        <w:t xml:space="preserve"> Dashboard) </w:t>
-      </w:r>
-      <w:proofErr w:type="spellStart"/>
-      <w:r>
-        <w:rPr>
-          <w:b/>
-          <w:bCs/>
-        </w:rPr>
-        <w:t>phát</w:t>
-      </w:r>
-      <w:proofErr w:type="spellEnd"/>
-      <w:r>
-        <w:rPr>
-          <w:b/>
-          <w:bCs/>
-        </w:rPr>
-        <w:t xml:space="preserve"> </w:t>
-      </w:r>
-      <w:proofErr w:type="spellStart"/>
-      <w:r>
-        <w:rPr>
-          <w:b/>
-          <w:bCs/>
-        </w:rPr>
-        <w:t>hành</w:t>
-      </w:r>
-      <w:proofErr w:type="spellEnd"/>
-      <w:r>
-        <w:rPr>
-          <w:b/>
-          <w:bCs/>
-        </w:rPr>
-        <w:t xml:space="preserve"> Voucher VIP </w:t>
-      </w:r>
-      <w:r>
-        <w:rPr>
-          <w:b/>
-          <w:bCs/>
+          <w:lang w:val="vi-VN"/>
+        </w:rPr>
+      </w:pPr>
+      <w:r>
+        <w:rPr>
+          <w:b/>
+          <w:bCs/>
+          <w:lang w:val="vi-VN"/>
+        </w:rPr>
+        <w:t xml:space="preserve">Userflow: Đối tác – Partner (từ Dashboard) phát hành Voucher VIP </w:t>
+      </w:r>
+      <w:r>
+        <w:rPr>
+          <w:b/>
+          <w:bCs/>
+          <w:lang w:val="vi-VN"/>
         </w:rPr>
         <w:sym w:font="Wingdings" w:char="F0E0"/>
       </w:r>
@@ -1888,116 +1110,23 @@
         <w:rPr>
           <w:b/>
           <w:bCs/>
-        </w:rPr>
-        <w:t xml:space="preserve"> Moderator </w:t>
-      </w:r>
-      <w:proofErr w:type="spellStart"/>
-      <w:r>
-        <w:rPr>
-          <w:b/>
-          <w:bCs/>
-        </w:rPr>
-        <w:t>duyệt</w:t>
-      </w:r>
-      <w:proofErr w:type="spellEnd"/>
-      <w:r>
-        <w:rPr>
-          <w:b/>
-          <w:bCs/>
-        </w:rPr>
-        <w:t xml:space="preserve"> </w:t>
-      </w:r>
-      <w:r>
-        <w:rPr>
-          <w:b/>
-          <w:bCs/>
-        </w:rPr>
-        <w:t xml:space="preserve">(Phase </w:t>
-      </w:r>
-      <w:proofErr w:type="spellStart"/>
-      <w:r>
-        <w:rPr>
-          <w:b/>
-          <w:bCs/>
-        </w:rPr>
-        <w:t>này</w:t>
-      </w:r>
-      <w:proofErr w:type="spellEnd"/>
-      <w:r>
-        <w:rPr>
-          <w:b/>
-          <w:bCs/>
-        </w:rPr>
-        <w:t xml:space="preserve"> </w:t>
-      </w:r>
-      <w:proofErr w:type="spellStart"/>
-      <w:r>
-        <w:rPr>
-          <w:b/>
-          <w:bCs/>
-        </w:rPr>
-        <w:t>chỉ</w:t>
-      </w:r>
-      <w:proofErr w:type="spellEnd"/>
-      <w:r>
-        <w:rPr>
-          <w:b/>
-          <w:bCs/>
-        </w:rPr>
-        <w:t xml:space="preserve"> </w:t>
-      </w:r>
-      <w:proofErr w:type="spellStart"/>
-      <w:r>
-        <w:rPr>
-          <w:b/>
-          <w:bCs/>
-        </w:rPr>
-        <w:t>làm</w:t>
-      </w:r>
-      <w:proofErr w:type="spellEnd"/>
-      <w:r>
-        <w:rPr>
-          <w:b/>
-          <w:bCs/>
-        </w:rPr>
-        <w:t xml:space="preserve"> </w:t>
-      </w:r>
-      <w:proofErr w:type="spellStart"/>
-      <w:r>
-        <w:rPr>
-          <w:b/>
-          <w:bCs/>
-        </w:rPr>
-        <w:t>đến</w:t>
-      </w:r>
-      <w:proofErr w:type="spellEnd"/>
-      <w:r>
-        <w:rPr>
-          <w:b/>
-          <w:bCs/>
-        </w:rPr>
-        <w:t xml:space="preserve"> </w:t>
-      </w:r>
-      <w:proofErr w:type="spellStart"/>
-      <w:r>
-        <w:rPr>
-          <w:b/>
-          <w:bCs/>
-        </w:rPr>
-        <w:t>đây</w:t>
-      </w:r>
-      <w:proofErr w:type="spellEnd"/>
-      <w:r>
-        <w:rPr>
-          <w:b/>
-          <w:bCs/>
-        </w:rPr>
-        <w:t xml:space="preserve">) </w:t>
-      </w:r>
-      <w:r>
-        <w:rPr>
-          <w:b/>
-          <w:bCs/>
+          <w:lang w:val="vi-VN"/>
+        </w:rPr>
+        <w:t xml:space="preserve"> Moderator duyệt </w:t>
+      </w:r>
+      <w:r>
+        <w:rPr>
+          <w:b/>
+          <w:bCs/>
+          <w:lang w:val="vi-VN"/>
+        </w:rPr>
+        <w:t xml:space="preserve">(Phase này chỉ làm đến đây) </w:t>
+      </w:r>
+      <w:r>
+        <w:rPr>
+          <w:b/>
+          <w:bCs/>
+          <w:lang w:val="vi-VN"/>
         </w:rPr>
         <w:sym w:font="Wingdings" w:char="F0E0"/>
       </w:r>
@@ -2005,294 +1134,15 @@
         <w:rPr>
           <w:b/>
           <w:bCs/>
-        </w:rPr>
-        <w:t xml:space="preserve"> Giao </w:t>
-      </w:r>
-      <w:proofErr w:type="spellStart"/>
-      <w:r>
-        <w:rPr>
-          <w:b/>
-          <w:bCs/>
-        </w:rPr>
-        <w:t>diện</w:t>
-      </w:r>
-      <w:proofErr w:type="spellEnd"/>
-      <w:r>
-        <w:rPr>
-          <w:b/>
-          <w:bCs/>
-        </w:rPr>
-        <w:t xml:space="preserve"> Voucher </w:t>
-      </w:r>
-      <w:proofErr w:type="spellStart"/>
-      <w:r>
-        <w:rPr>
-          <w:b/>
-          <w:bCs/>
-        </w:rPr>
-        <w:t>Shoping</w:t>
-      </w:r>
-      <w:proofErr w:type="spellEnd"/>
-      <w:r>
-        <w:rPr>
-          <w:b/>
-          <w:bCs/>
-        </w:rPr>
-        <w:t xml:space="preserve"> - </w:t>
-      </w:r>
-      <w:proofErr w:type="spellStart"/>
-      <w:r>
-        <w:rPr>
-          <w:b/>
-          <w:bCs/>
-        </w:rPr>
-        <w:t>xem</w:t>
-      </w:r>
-      <w:proofErr w:type="spellEnd"/>
-      <w:r>
-        <w:rPr>
-          <w:b/>
-          <w:bCs/>
-        </w:rPr>
-        <w:t xml:space="preserve">, </w:t>
-      </w:r>
-      <w:proofErr w:type="spellStart"/>
-      <w:r>
-        <w:rPr>
-          <w:b/>
-          <w:bCs/>
-        </w:rPr>
-        <w:t>lướt</w:t>
-      </w:r>
-      <w:proofErr w:type="spellEnd"/>
-      <w:r>
-        <w:rPr>
-          <w:b/>
-          <w:bCs/>
-        </w:rPr>
-        <w:t xml:space="preserve">, </w:t>
-      </w:r>
-      <w:proofErr w:type="spellStart"/>
-      <w:r>
-        <w:rPr>
-          <w:b/>
-          <w:bCs/>
-        </w:rPr>
-        <w:t>mua</w:t>
-      </w:r>
-      <w:proofErr w:type="spellEnd"/>
-      <w:r>
-        <w:rPr>
-          <w:b/>
-          <w:bCs/>
-        </w:rPr>
-        <w:t xml:space="preserve"> Voucher </w:t>
-      </w:r>
-      <w:proofErr w:type="spellStart"/>
-      <w:r>
-        <w:rPr>
-          <w:b/>
-          <w:bCs/>
-        </w:rPr>
-        <w:t>đa</w:t>
-      </w:r>
-      <w:proofErr w:type="spellEnd"/>
-      <w:r>
-        <w:rPr>
-          <w:b/>
-          <w:bCs/>
-        </w:rPr>
-        <w:t xml:space="preserve"> </w:t>
-      </w:r>
-      <w:proofErr w:type="spellStart"/>
-      <w:r>
-        <w:rPr>
-          <w:b/>
-          <w:bCs/>
-        </w:rPr>
-        <w:t>dạng</w:t>
-      </w:r>
-      <w:proofErr w:type="spellEnd"/>
-      <w:r>
-        <w:rPr>
-          <w:b/>
-          <w:bCs/>
-        </w:rPr>
-        <w:t xml:space="preserve"> </w:t>
-      </w:r>
-      <w:proofErr w:type="spellStart"/>
-      <w:r>
-        <w:rPr>
-          <w:b/>
-          <w:bCs/>
-        </w:rPr>
-        <w:t>phù</w:t>
-      </w:r>
-      <w:proofErr w:type="spellEnd"/>
-      <w:r>
-        <w:rPr>
-          <w:b/>
-          <w:bCs/>
-        </w:rPr>
-        <w:t xml:space="preserve"> </w:t>
-      </w:r>
-      <w:proofErr w:type="spellStart"/>
-      <w:r>
-        <w:rPr>
-          <w:b/>
-          <w:bCs/>
-        </w:rPr>
-        <w:t>hợp</w:t>
-      </w:r>
-      <w:proofErr w:type="spellEnd"/>
-      <w:r>
-        <w:rPr>
-          <w:b/>
-          <w:bCs/>
-        </w:rPr>
-        <w:t xml:space="preserve"> (</w:t>
-      </w:r>
-      <w:proofErr w:type="spellStart"/>
-      <w:r>
-        <w:rPr>
-          <w:b/>
-          <w:bCs/>
-        </w:rPr>
-        <w:t>đa</w:t>
-      </w:r>
-      <w:proofErr w:type="spellEnd"/>
-      <w:r>
-        <w:rPr>
-          <w:b/>
-          <w:bCs/>
-        </w:rPr>
-        <w:t xml:space="preserve"> </w:t>
-      </w:r>
-      <w:proofErr w:type="spellStart"/>
-      <w:r>
-        <w:rPr>
-          <w:b/>
-          <w:bCs/>
-        </w:rPr>
-        <w:t>lưới</w:t>
-      </w:r>
-      <w:proofErr w:type="spellEnd"/>
-      <w:r>
-        <w:rPr>
-          <w:b/>
-          <w:bCs/>
-        </w:rPr>
-        <w:t xml:space="preserve"> </w:t>
-      </w:r>
-      <w:proofErr w:type="spellStart"/>
-      <w:r>
-        <w:rPr>
-          <w:b/>
-          <w:bCs/>
-        </w:rPr>
-        <w:t>ngang</w:t>
-      </w:r>
-      <w:proofErr w:type="spellEnd"/>
-      <w:r>
-        <w:rPr>
-          <w:b/>
-          <w:bCs/>
-        </w:rPr>
-        <w:t xml:space="preserve">, </w:t>
-      </w:r>
-      <w:proofErr w:type="spellStart"/>
-      <w:proofErr w:type="gramStart"/>
-      <w:r>
-        <w:rPr>
-          <w:b/>
-          <w:bCs/>
-        </w:rPr>
-        <w:t>dọc</w:t>
-      </w:r>
-      <w:proofErr w:type="spellEnd"/>
-      <w:r>
-        <w:rPr>
-          <w:b/>
-          <w:bCs/>
-        </w:rPr>
-        <w:t>,…</w:t>
-      </w:r>
-      <w:proofErr w:type="gramEnd"/>
-      <w:r>
-        <w:rPr>
-          <w:b/>
-          <w:bCs/>
-        </w:rPr>
-        <w:t xml:space="preserve"> </w:t>
-      </w:r>
-      <w:proofErr w:type="spellStart"/>
-      <w:r>
-        <w:rPr>
-          <w:b/>
-          <w:bCs/>
-        </w:rPr>
-        <w:t>tương</w:t>
-      </w:r>
-      <w:proofErr w:type="spellEnd"/>
-      <w:r>
-        <w:rPr>
-          <w:b/>
-          <w:bCs/>
-        </w:rPr>
-        <w:t xml:space="preserve"> </w:t>
-      </w:r>
-      <w:proofErr w:type="spellStart"/>
-      <w:r>
-        <w:rPr>
-          <w:b/>
-          <w:bCs/>
-        </w:rPr>
-        <w:t>tự</w:t>
-      </w:r>
-      <w:proofErr w:type="spellEnd"/>
-      <w:r>
-        <w:rPr>
-          <w:b/>
-          <w:bCs/>
-        </w:rPr>
-        <w:t xml:space="preserve"> </w:t>
-      </w:r>
-      <w:proofErr w:type="spellStart"/>
-      <w:r>
-        <w:rPr>
-          <w:b/>
-          <w:bCs/>
-        </w:rPr>
-        <w:t>như</w:t>
-      </w:r>
-      <w:proofErr w:type="spellEnd"/>
-      <w:r>
-        <w:rPr>
-          <w:b/>
-          <w:bCs/>
-        </w:rPr>
-        <w:t xml:space="preserve"> </w:t>
-      </w:r>
-      <w:proofErr w:type="spellStart"/>
-      <w:r>
-        <w:rPr>
-          <w:b/>
-          <w:bCs/>
-        </w:rPr>
-        <w:t>explore_screen</w:t>
-      </w:r>
-      <w:proofErr w:type="spellEnd"/>
-      <w:r>
-        <w:rPr>
-          <w:b/>
-          <w:bCs/>
-        </w:rPr>
-        <w:t xml:space="preserve">) </w:t>
-      </w:r>
-      <w:r>
-        <w:rPr>
-          <w:b/>
-          <w:bCs/>
+          <w:lang w:val="vi-VN"/>
+        </w:rPr>
+        <w:t xml:space="preserve"> Giao diện Voucher Shoping - xem, lướt, mua Voucher đa dạng phù hợp (đa lưới ngang, dọc,… tương tự như explore_screen) </w:t>
+      </w:r>
+      <w:r>
+        <w:rPr>
+          <w:b/>
+          <w:bCs/>
+          <w:lang w:val="vi-VN"/>
         </w:rPr>
         <w:sym w:font="Wingdings" w:char="F0E0"/>
       </w:r>
@@ -2300,6 +1150,7 @@
         <w:rPr>
           <w:b/>
           <w:bCs/>
+          <w:lang w:val="vi-VN"/>
         </w:rPr>
         <w:t xml:space="preserve"> Xem Preview </w:t>
       </w:r>
@@ -2307,6 +1158,7 @@
         <w:rPr>
           <w:b/>
           <w:bCs/>
+          <w:lang w:val="vi-VN"/>
         </w:rPr>
         <w:sym w:font="Wingdings" w:char="F0E0"/>
       </w:r>
@@ -2314,29 +1166,15 @@
         <w:rPr>
           <w:b/>
           <w:bCs/>
-        </w:rPr>
-        <w:t xml:space="preserve"> Xem chi </w:t>
-      </w:r>
-      <w:proofErr w:type="spellStart"/>
-      <w:r>
-        <w:rPr>
-          <w:b/>
-          <w:bCs/>
-        </w:rPr>
-        <w:t>tiết</w:t>
-      </w:r>
-      <w:proofErr w:type="spellEnd"/>
-      <w:r>
-        <w:rPr>
-          <w:b/>
-          <w:bCs/>
-        </w:rPr>
-        <w:t xml:space="preserve"> </w:t>
-      </w:r>
-      <w:r>
-        <w:rPr>
-          <w:b/>
-          <w:bCs/>
+          <w:lang w:val="vi-VN"/>
+        </w:rPr>
+        <w:t xml:space="preserve"> Xem chi tiết </w:t>
+      </w:r>
+      <w:r>
+        <w:rPr>
+          <w:b/>
+          <w:bCs/>
+          <w:lang w:val="vi-VN"/>
         </w:rPr>
         <w:sym w:font="Wingdings" w:char="F0E0"/>
       </w:r>
@@ -2344,45 +1182,15 @@
         <w:rPr>
           <w:b/>
           <w:bCs/>
-        </w:rPr>
-        <w:t xml:space="preserve"> Mua – </w:t>
-      </w:r>
-      <w:proofErr w:type="spellStart"/>
-      <w:r>
-        <w:rPr>
-          <w:b/>
-          <w:bCs/>
-        </w:rPr>
-        <w:t>thanh</w:t>
-      </w:r>
-      <w:proofErr w:type="spellEnd"/>
-      <w:r>
-        <w:rPr>
-          <w:b/>
-          <w:bCs/>
-        </w:rPr>
-        <w:t xml:space="preserve"> </w:t>
-      </w:r>
-      <w:proofErr w:type="spellStart"/>
-      <w:r>
-        <w:rPr>
-          <w:b/>
-          <w:bCs/>
-        </w:rPr>
-        <w:t>toán</w:t>
-      </w:r>
-      <w:proofErr w:type="spellEnd"/>
-      <w:r>
-        <w:rPr>
-          <w:b/>
-          <w:bCs/>
-        </w:rPr>
-        <w:t xml:space="preserve"> Voucher </w:t>
-      </w:r>
-      <w:r>
-        <w:rPr>
-          <w:b/>
-          <w:bCs/>
+          <w:lang w:val="vi-VN"/>
+        </w:rPr>
+        <w:t xml:space="preserve"> Mua – thanh toán Voucher </w:t>
+      </w:r>
+      <w:r>
+        <w:rPr>
+          <w:b/>
+          <w:bCs/>
+          <w:lang w:val="vi-VN"/>
         </w:rPr>
         <w:sym w:font="Wingdings" w:char="F0E0"/>
       </w:r>
@@ -2390,200 +1198,9 @@
         <w:rPr>
           <w:b/>
           <w:bCs/>
-        </w:rPr>
-        <w:t xml:space="preserve"> </w:t>
-      </w:r>
-      <w:proofErr w:type="spellStart"/>
-      <w:r>
-        <w:rPr>
-          <w:b/>
-          <w:bCs/>
-        </w:rPr>
-        <w:t>Voucher</w:t>
-      </w:r>
-      <w:proofErr w:type="spellEnd"/>
-      <w:r>
-        <w:rPr>
-          <w:b/>
-          <w:bCs/>
-        </w:rPr>
-        <w:t xml:space="preserve"> </w:t>
-      </w:r>
-      <w:proofErr w:type="spellStart"/>
-      <w:r>
-        <w:rPr>
-          <w:b/>
-          <w:bCs/>
-        </w:rPr>
-        <w:t>được</w:t>
-      </w:r>
-      <w:proofErr w:type="spellEnd"/>
-      <w:r>
-        <w:rPr>
-          <w:b/>
-          <w:bCs/>
-        </w:rPr>
-        <w:t xml:space="preserve"> </w:t>
-      </w:r>
-      <w:proofErr w:type="spellStart"/>
-      <w:r>
-        <w:rPr>
-          <w:b/>
-          <w:bCs/>
-        </w:rPr>
-        <w:t>lưu</w:t>
-      </w:r>
-      <w:proofErr w:type="spellEnd"/>
-      <w:r>
-        <w:rPr>
-          <w:b/>
-          <w:bCs/>
-        </w:rPr>
-        <w:t xml:space="preserve"> </w:t>
-      </w:r>
-      <w:proofErr w:type="spellStart"/>
-      <w:r>
-        <w:rPr>
-          <w:b/>
-          <w:bCs/>
-        </w:rPr>
-        <w:t>vào</w:t>
-      </w:r>
-      <w:proofErr w:type="spellEnd"/>
-      <w:r>
-        <w:rPr>
-          <w:b/>
-          <w:bCs/>
-        </w:rPr>
-        <w:t xml:space="preserve"> Promo Screen (deep link </w:t>
-      </w:r>
-      <w:proofErr w:type="spellStart"/>
-      <w:r>
-        <w:rPr>
-          <w:b/>
-          <w:bCs/>
-        </w:rPr>
-        <w:t>để</w:t>
-      </w:r>
-      <w:proofErr w:type="spellEnd"/>
-      <w:r>
-        <w:rPr>
-          <w:b/>
-          <w:bCs/>
-        </w:rPr>
-        <w:t xml:space="preserve"> </w:t>
-      </w:r>
-      <w:proofErr w:type="spellStart"/>
-      <w:r>
-        <w:rPr>
-          <w:b/>
-          <w:bCs/>
-        </w:rPr>
-        <w:t>người</w:t>
-      </w:r>
-      <w:proofErr w:type="spellEnd"/>
-      <w:r>
-        <w:rPr>
-          <w:b/>
-          <w:bCs/>
-        </w:rPr>
-        <w:t xml:space="preserve"> </w:t>
-      </w:r>
-      <w:proofErr w:type="spellStart"/>
-      <w:r>
-        <w:rPr>
-          <w:b/>
-          <w:bCs/>
-        </w:rPr>
-        <w:t>dùng</w:t>
-      </w:r>
-      <w:proofErr w:type="spellEnd"/>
-      <w:r>
-        <w:rPr>
-          <w:b/>
-          <w:bCs/>
-        </w:rPr>
-        <w:t xml:space="preserve"> </w:t>
-      </w:r>
-      <w:proofErr w:type="spellStart"/>
-      <w:r>
-        <w:rPr>
-          <w:b/>
-          <w:bCs/>
-        </w:rPr>
-        <w:t>có</w:t>
-      </w:r>
-      <w:proofErr w:type="spellEnd"/>
-      <w:r>
-        <w:rPr>
-          <w:b/>
-          <w:bCs/>
-        </w:rPr>
-        <w:t xml:space="preserve"> </w:t>
-      </w:r>
-      <w:proofErr w:type="spellStart"/>
-      <w:r>
-        <w:rPr>
-          <w:b/>
-          <w:bCs/>
-        </w:rPr>
-        <w:t>thể</w:t>
-      </w:r>
-      <w:proofErr w:type="spellEnd"/>
-      <w:r>
-        <w:rPr>
-          <w:b/>
-          <w:bCs/>
-        </w:rPr>
-        <w:t xml:space="preserve"> click </w:t>
-      </w:r>
-      <w:proofErr w:type="spellStart"/>
-      <w:r>
-        <w:rPr>
-          <w:b/>
-          <w:bCs/>
-        </w:rPr>
-        <w:t>và</w:t>
-      </w:r>
-      <w:proofErr w:type="spellEnd"/>
-      <w:r>
-        <w:rPr>
-          <w:b/>
-          <w:bCs/>
-        </w:rPr>
-        <w:t xml:space="preserve"> </w:t>
-      </w:r>
-      <w:proofErr w:type="spellStart"/>
-      <w:r>
-        <w:rPr>
-          <w:b/>
-          <w:bCs/>
-        </w:rPr>
-        <w:t>trỏ</w:t>
-      </w:r>
-      <w:proofErr w:type="spellEnd"/>
-      <w:r>
-        <w:rPr>
-          <w:b/>
-          <w:bCs/>
-        </w:rPr>
-        <w:t xml:space="preserve"> </w:t>
-      </w:r>
-      <w:proofErr w:type="spellStart"/>
-      <w:r>
-        <w:rPr>
-          <w:b/>
-          <w:bCs/>
-        </w:rPr>
-        <w:t>về</w:t>
-      </w:r>
-      <w:proofErr w:type="spellEnd"/>
-      <w:r>
-        <w:rPr>
-          <w:b/>
-          <w:bCs/>
-        </w:rPr>
-        <w:t>).</w:t>
+          <w:lang w:val="vi-VN"/>
+        </w:rPr>
+        <w:t xml:space="preserve"> Voucher được lưu vào Promo Screen (deep link để người dùng có thể click và trỏ về).</w:t>
       </w:r>
     </w:p>
     <w:p>
@@ -2628,157 +1245,11 @@
         <w:t xml:space="preserve"> Đối tác (Partner) tạo Voucher VIP bán bằng điểm, có đính kèm khung giờ cố định. Moderator/Admin kiểm duyệt trước khi đưa lên sàn</w:t>
       </w:r>
       <w:r>
-        <w:t xml:space="preserve"> – </w:t>
-      </w:r>
-      <w:proofErr w:type="spellStart"/>
-      <w:r>
-        <w:t>tóm</w:t>
-      </w:r>
-      <w:proofErr w:type="spellEnd"/>
-      <w:r>
-        <w:t xml:space="preserve"> </w:t>
-      </w:r>
-      <w:proofErr w:type="spellStart"/>
-      <w:r>
-        <w:t>lại</w:t>
-      </w:r>
-      <w:proofErr w:type="spellEnd"/>
-      <w:r>
-        <w:t xml:space="preserve"> </w:t>
-      </w:r>
-      <w:proofErr w:type="spellStart"/>
-      <w:r>
-        <w:t>các</w:t>
-      </w:r>
-      <w:proofErr w:type="spellEnd"/>
-      <w:r>
-        <w:t xml:space="preserve"> </w:t>
-      </w:r>
-      <w:proofErr w:type="spellStart"/>
-      <w:r>
-        <w:t>trường</w:t>
-      </w:r>
-      <w:proofErr w:type="spellEnd"/>
-      <w:r>
-        <w:t xml:space="preserve"> </w:t>
-      </w:r>
-      <w:proofErr w:type="spellStart"/>
-      <w:r>
-        <w:t>thông</w:t>
-      </w:r>
-      <w:proofErr w:type="spellEnd"/>
-      <w:r>
-        <w:t xml:space="preserve"> tin </w:t>
-      </w:r>
-      <w:proofErr w:type="spellStart"/>
-      <w:r>
-        <w:t>như</w:t>
-      </w:r>
-      <w:proofErr w:type="spellEnd"/>
-      <w:r>
-        <w:t xml:space="preserve"> voucher </w:t>
-      </w:r>
-      <w:proofErr w:type="spellStart"/>
-      <w:r>
-        <w:t>thường</w:t>
-      </w:r>
-      <w:proofErr w:type="spellEnd"/>
-      <w:r>
-        <w:t xml:space="preserve">, </w:t>
-      </w:r>
-      <w:proofErr w:type="spellStart"/>
-      <w:r>
-        <w:t>nhưng</w:t>
-      </w:r>
-      <w:proofErr w:type="spellEnd"/>
-      <w:r>
-        <w:t xml:space="preserve"> </w:t>
-      </w:r>
-      <w:proofErr w:type="spellStart"/>
-      <w:r>
-        <w:t>có</w:t>
-      </w:r>
-      <w:proofErr w:type="spellEnd"/>
-      <w:r>
-        <w:t xml:space="preserve"> </w:t>
-      </w:r>
-      <w:proofErr w:type="spellStart"/>
-      <w:r>
-        <w:t>thêm</w:t>
-      </w:r>
-      <w:proofErr w:type="spellEnd"/>
-      <w:r>
-        <w:t xml:space="preserve"> </w:t>
-      </w:r>
-      <w:proofErr w:type="spellStart"/>
-      <w:r>
-        <w:t>trường</w:t>
-      </w:r>
-      <w:proofErr w:type="spellEnd"/>
-      <w:r>
-        <w:t xml:space="preserve"> </w:t>
-      </w:r>
-      <w:proofErr w:type="spellStart"/>
-      <w:r>
-        <w:t>điểm</w:t>
-      </w:r>
-      <w:proofErr w:type="spellEnd"/>
-      <w:r>
-        <w:t xml:space="preserve"> – </w:t>
-      </w:r>
-      <w:proofErr w:type="spellStart"/>
-      <w:r>
-        <w:t>giá</w:t>
-      </w:r>
-      <w:proofErr w:type="spellEnd"/>
-      <w:r>
-        <w:t xml:space="preserve"> </w:t>
-      </w:r>
-      <w:proofErr w:type="spellStart"/>
-      <w:r>
-        <w:t>mua</w:t>
-      </w:r>
-      <w:proofErr w:type="spellEnd"/>
-      <w:r>
-        <w:t xml:space="preserve">, </w:t>
-      </w:r>
-      <w:proofErr w:type="spellStart"/>
-      <w:r>
-        <w:t>khung</w:t>
-      </w:r>
-      <w:proofErr w:type="spellEnd"/>
-      <w:r>
-        <w:t xml:space="preserve"> </w:t>
-      </w:r>
-      <w:proofErr w:type="spellStart"/>
-      <w:r>
-        <w:t>giờ</w:t>
-      </w:r>
-      <w:proofErr w:type="spellEnd"/>
-      <w:r>
-        <w:t xml:space="preserve"> (A-B) – </w:t>
-      </w:r>
-      <w:proofErr w:type="spellStart"/>
-      <w:r>
-        <w:t>chỉ</w:t>
-      </w:r>
-      <w:proofErr w:type="spellEnd"/>
-      <w:r>
-        <w:t xml:space="preserve"> 1 </w:t>
-      </w:r>
-      <w:proofErr w:type="spellStart"/>
-      <w:r>
-        <w:t>khung</w:t>
-      </w:r>
-      <w:proofErr w:type="spellEnd"/>
-      <w:r>
-        <w:t xml:space="preserve"> </w:t>
-      </w:r>
-      <w:proofErr w:type="spellStart"/>
-      <w:r>
-        <w:t>giờ</w:t>
-      </w:r>
-      <w:proofErr w:type="spellEnd"/>
+        <w:rPr>
+          <w:lang w:val="vi-VN"/>
+        </w:rPr>
+        <w:t xml:space="preserve"> – tóm lại các trường thông tin như voucher thường, nhưng có thêm trường điểm – giá mua, khung giờ (A-B) – chỉ 1 khung giờ</w:t>
+      </w:r>
     </w:p>
     <w:p>
       <w:pPr>
@@ -2879,15 +1350,14 @@
         </w:rPr>
         <w:t>Database (Database/</w:t>
       </w:r>
-      <w:proofErr w:type="spellStart"/>
-      <w:r>
-        <w:rPr>
-          <w:b/>
-          <w:bCs/>
+      <w:r>
+        <w:rPr>
+          <w:b/>
+          <w:bCs/>
+          <w:lang w:val="vi-VN"/>
         </w:rPr>
         <w:t>schema.sql</w:t>
       </w:r>
-      <w:proofErr w:type="spellEnd"/>
       <w:r>
         <w:rPr>
           <w:b/>
@@ -3077,6 +1547,7 @@
         <w:rPr>
           <w:b/>
           <w:bCs/>
+          <w:lang w:val="vi-VN"/>
         </w:rPr>
       </w:pPr>
       <w:r>
@@ -3093,108 +1564,22 @@
         <w:rPr>
           <w:b/>
           <w:bCs/>
-        </w:rPr>
-      </w:pPr>
-      <w:proofErr w:type="spellStart"/>
-      <w:r>
-        <w:rPr>
-          <w:b/>
-          <w:bCs/>
-        </w:rPr>
-        <w:t>Userflow</w:t>
-      </w:r>
-      <w:proofErr w:type="spellEnd"/>
-      <w:r>
-        <w:rPr>
-          <w:b/>
-          <w:bCs/>
-        </w:rPr>
-        <w:t xml:space="preserve">: </w:t>
-      </w:r>
-      <w:proofErr w:type="spellStart"/>
-      <w:r>
-        <w:rPr>
-          <w:b/>
-          <w:bCs/>
-        </w:rPr>
-        <w:t>Đối</w:t>
-      </w:r>
-      <w:proofErr w:type="spellEnd"/>
-      <w:r>
-        <w:rPr>
-          <w:b/>
-          <w:bCs/>
-        </w:rPr>
-        <w:t xml:space="preserve"> </w:t>
-      </w:r>
-      <w:proofErr w:type="spellStart"/>
-      <w:r>
-        <w:rPr>
-          <w:b/>
-          <w:bCs/>
-        </w:rPr>
-        <w:t>tác</w:t>
-      </w:r>
-      <w:proofErr w:type="spellEnd"/>
-      <w:r>
-        <w:rPr>
-          <w:b/>
-          <w:bCs/>
-        </w:rPr>
-        <w:t xml:space="preserve"> – Partner (</w:t>
-      </w:r>
-      <w:proofErr w:type="spellStart"/>
-      <w:r>
-        <w:rPr>
-          <w:b/>
-          <w:bCs/>
-        </w:rPr>
-        <w:t>từ</w:t>
-      </w:r>
-      <w:proofErr w:type="spellEnd"/>
-      <w:r>
-        <w:rPr>
-          <w:b/>
-          <w:bCs/>
-        </w:rPr>
-        <w:t xml:space="preserve"> Dashboard) </w:t>
-      </w:r>
-      <w:proofErr w:type="spellStart"/>
-      <w:r>
-        <w:rPr>
-          <w:b/>
-          <w:bCs/>
-        </w:rPr>
-        <w:t>phát</w:t>
-      </w:r>
-      <w:proofErr w:type="spellEnd"/>
-      <w:r>
-        <w:rPr>
-          <w:b/>
-          <w:bCs/>
-        </w:rPr>
-        <w:t xml:space="preserve"> </w:t>
-      </w:r>
-      <w:proofErr w:type="spellStart"/>
-      <w:r>
-        <w:rPr>
-          <w:b/>
-          <w:bCs/>
-        </w:rPr>
-        <w:t>hành</w:t>
-      </w:r>
-      <w:proofErr w:type="spellEnd"/>
-      <w:r>
-        <w:rPr>
-          <w:b/>
-          <w:bCs/>
-        </w:rPr>
-        <w:t xml:space="preserve"> Voucher VIP </w:t>
-      </w:r>
-      <w:r>
-        <w:rPr>
-          <w:b/>
-          <w:bCs/>
+          <w:lang w:val="vi-VN"/>
+        </w:rPr>
+      </w:pPr>
+      <w:r>
+        <w:rPr>
+          <w:b/>
+          <w:bCs/>
+          <w:lang w:val="vi-VN"/>
+        </w:rPr>
+        <w:t xml:space="preserve">Userflow: Đối tác – Partner (từ Dashboard) phát hành Voucher VIP </w:t>
+      </w:r>
+      <w:r>
+        <w:rPr>
+          <w:b/>
+          <w:bCs/>
+          <w:lang w:val="vi-VN"/>
         </w:rPr>
         <w:sym w:font="Wingdings" w:char="F0E0"/>
       </w:r>
@@ -3202,77 +1587,15 @@
         <w:rPr>
           <w:b/>
           <w:bCs/>
-        </w:rPr>
-        <w:t xml:space="preserve"> Moderator </w:t>
-      </w:r>
-      <w:proofErr w:type="spellStart"/>
-      <w:r>
-        <w:rPr>
-          <w:b/>
-          <w:bCs/>
-        </w:rPr>
-        <w:t>duyệt</w:t>
-      </w:r>
-      <w:proofErr w:type="spellEnd"/>
-      <w:r>
-        <w:rPr>
-          <w:b/>
-          <w:bCs/>
-        </w:rPr>
-        <w:t xml:space="preserve"> (Phase </w:t>
-      </w:r>
-      <w:proofErr w:type="spellStart"/>
-      <w:r>
-        <w:rPr>
-          <w:b/>
-          <w:bCs/>
-        </w:rPr>
-        <w:t>này</w:t>
-      </w:r>
-      <w:proofErr w:type="spellEnd"/>
-      <w:r>
-        <w:rPr>
-          <w:b/>
-          <w:bCs/>
-        </w:rPr>
-        <w:t xml:space="preserve"> </w:t>
-      </w:r>
-      <w:proofErr w:type="spellStart"/>
-      <w:r>
-        <w:rPr>
-          <w:b/>
-          <w:bCs/>
-        </w:rPr>
-        <w:t>từ</w:t>
-      </w:r>
-      <w:proofErr w:type="spellEnd"/>
-      <w:r>
-        <w:rPr>
-          <w:b/>
-          <w:bCs/>
-        </w:rPr>
-        <w:t xml:space="preserve"> </w:t>
-      </w:r>
-      <w:proofErr w:type="spellStart"/>
-      <w:r>
-        <w:rPr>
-          <w:b/>
-          <w:bCs/>
-        </w:rPr>
-        <w:t>đây</w:t>
-      </w:r>
-      <w:proofErr w:type="spellEnd"/>
-      <w:r>
-        <w:rPr>
-          <w:b/>
-          <w:bCs/>
-        </w:rPr>
-        <w:t xml:space="preserve">) </w:t>
-      </w:r>
-      <w:r>
-        <w:rPr>
-          <w:b/>
-          <w:bCs/>
+          <w:lang w:val="vi-VN"/>
+        </w:rPr>
+        <w:t xml:space="preserve"> Moderator duyệt (Phase này từ đây) </w:t>
+      </w:r>
+      <w:r>
+        <w:rPr>
+          <w:b/>
+          <w:bCs/>
+          <w:lang w:val="vi-VN"/>
         </w:rPr>
         <w:sym w:font="Wingdings" w:char="F0E0"/>
       </w:r>
@@ -3280,294 +1603,15 @@
         <w:rPr>
           <w:b/>
           <w:bCs/>
-        </w:rPr>
-        <w:t xml:space="preserve"> Giao </w:t>
-      </w:r>
-      <w:proofErr w:type="spellStart"/>
-      <w:r>
-        <w:rPr>
-          <w:b/>
-          <w:bCs/>
-        </w:rPr>
-        <w:t>diện</w:t>
-      </w:r>
-      <w:proofErr w:type="spellEnd"/>
-      <w:r>
-        <w:rPr>
-          <w:b/>
-          <w:bCs/>
-        </w:rPr>
-        <w:t xml:space="preserve"> Voucher </w:t>
-      </w:r>
-      <w:proofErr w:type="spellStart"/>
-      <w:r>
-        <w:rPr>
-          <w:b/>
-          <w:bCs/>
-        </w:rPr>
-        <w:t>Shoping</w:t>
-      </w:r>
-      <w:proofErr w:type="spellEnd"/>
-      <w:r>
-        <w:rPr>
-          <w:b/>
-          <w:bCs/>
-        </w:rPr>
-        <w:t xml:space="preserve"> - </w:t>
-      </w:r>
-      <w:proofErr w:type="spellStart"/>
-      <w:r>
-        <w:rPr>
-          <w:b/>
-          <w:bCs/>
-        </w:rPr>
-        <w:t>xem</w:t>
-      </w:r>
-      <w:proofErr w:type="spellEnd"/>
-      <w:r>
-        <w:rPr>
-          <w:b/>
-          <w:bCs/>
-        </w:rPr>
-        <w:t xml:space="preserve">, </w:t>
-      </w:r>
-      <w:proofErr w:type="spellStart"/>
-      <w:r>
-        <w:rPr>
-          <w:b/>
-          <w:bCs/>
-        </w:rPr>
-        <w:t>lướt</w:t>
-      </w:r>
-      <w:proofErr w:type="spellEnd"/>
-      <w:r>
-        <w:rPr>
-          <w:b/>
-          <w:bCs/>
-        </w:rPr>
-        <w:t xml:space="preserve">, </w:t>
-      </w:r>
-      <w:proofErr w:type="spellStart"/>
-      <w:r>
-        <w:rPr>
-          <w:b/>
-          <w:bCs/>
-        </w:rPr>
-        <w:t>mua</w:t>
-      </w:r>
-      <w:proofErr w:type="spellEnd"/>
-      <w:r>
-        <w:rPr>
-          <w:b/>
-          <w:bCs/>
-        </w:rPr>
-        <w:t xml:space="preserve"> Voucher </w:t>
-      </w:r>
-      <w:proofErr w:type="spellStart"/>
-      <w:r>
-        <w:rPr>
-          <w:b/>
-          <w:bCs/>
-        </w:rPr>
-        <w:t>đa</w:t>
-      </w:r>
-      <w:proofErr w:type="spellEnd"/>
-      <w:r>
-        <w:rPr>
-          <w:b/>
-          <w:bCs/>
-        </w:rPr>
-        <w:t xml:space="preserve"> </w:t>
-      </w:r>
-      <w:proofErr w:type="spellStart"/>
-      <w:r>
-        <w:rPr>
-          <w:b/>
-          <w:bCs/>
-        </w:rPr>
-        <w:t>dạng</w:t>
-      </w:r>
-      <w:proofErr w:type="spellEnd"/>
-      <w:r>
-        <w:rPr>
-          <w:b/>
-          <w:bCs/>
-        </w:rPr>
-        <w:t xml:space="preserve"> </w:t>
-      </w:r>
-      <w:proofErr w:type="spellStart"/>
-      <w:r>
-        <w:rPr>
-          <w:b/>
-          <w:bCs/>
-        </w:rPr>
-        <w:t>phù</w:t>
-      </w:r>
-      <w:proofErr w:type="spellEnd"/>
-      <w:r>
-        <w:rPr>
-          <w:b/>
-          <w:bCs/>
-        </w:rPr>
-        <w:t xml:space="preserve"> </w:t>
-      </w:r>
-      <w:proofErr w:type="spellStart"/>
-      <w:r>
-        <w:rPr>
-          <w:b/>
-          <w:bCs/>
-        </w:rPr>
-        <w:t>hợp</w:t>
-      </w:r>
-      <w:proofErr w:type="spellEnd"/>
-      <w:r>
-        <w:rPr>
-          <w:b/>
-          <w:bCs/>
-        </w:rPr>
-        <w:t xml:space="preserve"> (</w:t>
-      </w:r>
-      <w:proofErr w:type="spellStart"/>
-      <w:r>
-        <w:rPr>
-          <w:b/>
-          <w:bCs/>
-        </w:rPr>
-        <w:t>đa</w:t>
-      </w:r>
-      <w:proofErr w:type="spellEnd"/>
-      <w:r>
-        <w:rPr>
-          <w:b/>
-          <w:bCs/>
-        </w:rPr>
-        <w:t xml:space="preserve"> </w:t>
-      </w:r>
-      <w:proofErr w:type="spellStart"/>
-      <w:r>
-        <w:rPr>
-          <w:b/>
-          <w:bCs/>
-        </w:rPr>
-        <w:t>lưới</w:t>
-      </w:r>
-      <w:proofErr w:type="spellEnd"/>
-      <w:r>
-        <w:rPr>
-          <w:b/>
-          <w:bCs/>
-        </w:rPr>
-        <w:t xml:space="preserve"> </w:t>
-      </w:r>
-      <w:proofErr w:type="spellStart"/>
-      <w:r>
-        <w:rPr>
-          <w:b/>
-          <w:bCs/>
-        </w:rPr>
-        <w:t>ngang</w:t>
-      </w:r>
-      <w:proofErr w:type="spellEnd"/>
-      <w:r>
-        <w:rPr>
-          <w:b/>
-          <w:bCs/>
-        </w:rPr>
-        <w:t xml:space="preserve">, </w:t>
-      </w:r>
-      <w:proofErr w:type="spellStart"/>
-      <w:proofErr w:type="gramStart"/>
-      <w:r>
-        <w:rPr>
-          <w:b/>
-          <w:bCs/>
-        </w:rPr>
-        <w:t>dọc</w:t>
-      </w:r>
-      <w:proofErr w:type="spellEnd"/>
-      <w:r>
-        <w:rPr>
-          <w:b/>
-          <w:bCs/>
-        </w:rPr>
-        <w:t>,…</w:t>
-      </w:r>
-      <w:proofErr w:type="gramEnd"/>
-      <w:r>
-        <w:rPr>
-          <w:b/>
-          <w:bCs/>
-        </w:rPr>
-        <w:t xml:space="preserve"> </w:t>
-      </w:r>
-      <w:proofErr w:type="spellStart"/>
-      <w:r>
-        <w:rPr>
-          <w:b/>
-          <w:bCs/>
-        </w:rPr>
-        <w:t>tương</w:t>
-      </w:r>
-      <w:proofErr w:type="spellEnd"/>
-      <w:r>
-        <w:rPr>
-          <w:b/>
-          <w:bCs/>
-        </w:rPr>
-        <w:t xml:space="preserve"> </w:t>
-      </w:r>
-      <w:proofErr w:type="spellStart"/>
-      <w:r>
-        <w:rPr>
-          <w:b/>
-          <w:bCs/>
-        </w:rPr>
-        <w:t>tự</w:t>
-      </w:r>
-      <w:proofErr w:type="spellEnd"/>
-      <w:r>
-        <w:rPr>
-          <w:b/>
-          <w:bCs/>
-        </w:rPr>
-        <w:t xml:space="preserve"> </w:t>
-      </w:r>
-      <w:proofErr w:type="spellStart"/>
-      <w:r>
-        <w:rPr>
-          <w:b/>
-          <w:bCs/>
-        </w:rPr>
-        <w:t>như</w:t>
-      </w:r>
-      <w:proofErr w:type="spellEnd"/>
-      <w:r>
-        <w:rPr>
-          <w:b/>
-          <w:bCs/>
-        </w:rPr>
-        <w:t xml:space="preserve"> </w:t>
-      </w:r>
-      <w:proofErr w:type="spellStart"/>
-      <w:r>
-        <w:rPr>
-          <w:b/>
-          <w:bCs/>
-        </w:rPr>
-        <w:t>explore_screen</w:t>
-      </w:r>
-      <w:proofErr w:type="spellEnd"/>
-      <w:r>
-        <w:rPr>
-          <w:b/>
-          <w:bCs/>
-        </w:rPr>
-        <w:t xml:space="preserve">) </w:t>
-      </w:r>
-      <w:r>
-        <w:rPr>
-          <w:b/>
-          <w:bCs/>
+          <w:lang w:val="vi-VN"/>
+        </w:rPr>
+        <w:t xml:space="preserve"> Giao diện Voucher Shoping - xem, lướt, mua Voucher đa dạng phù hợp (đa lưới ngang, dọc,… tương tự như explore_screen) </w:t>
+      </w:r>
+      <w:r>
+        <w:rPr>
+          <w:b/>
+          <w:bCs/>
+          <w:lang w:val="vi-VN"/>
         </w:rPr>
         <w:sym w:font="Wingdings" w:char="F0E0"/>
       </w:r>
@@ -3575,6 +1619,7 @@
         <w:rPr>
           <w:b/>
           <w:bCs/>
+          <w:lang w:val="vi-VN"/>
         </w:rPr>
         <w:t xml:space="preserve"> Xem Preview </w:t>
       </w:r>
@@ -3582,6 +1627,7 @@
         <w:rPr>
           <w:b/>
           <w:bCs/>
+          <w:lang w:val="vi-VN"/>
         </w:rPr>
         <w:sym w:font="Wingdings" w:char="F0E0"/>
       </w:r>
@@ -3589,29 +1635,15 @@
         <w:rPr>
           <w:b/>
           <w:bCs/>
-        </w:rPr>
-        <w:t xml:space="preserve"> Xem chi </w:t>
-      </w:r>
-      <w:proofErr w:type="spellStart"/>
-      <w:r>
-        <w:rPr>
-          <w:b/>
-          <w:bCs/>
-        </w:rPr>
-        <w:t>tiết</w:t>
-      </w:r>
-      <w:proofErr w:type="spellEnd"/>
-      <w:r>
-        <w:rPr>
-          <w:b/>
-          <w:bCs/>
-        </w:rPr>
-        <w:t xml:space="preserve"> </w:t>
-      </w:r>
-      <w:r>
-        <w:rPr>
-          <w:b/>
-          <w:bCs/>
+          <w:lang w:val="vi-VN"/>
+        </w:rPr>
+        <w:t xml:space="preserve"> Xem chi tiết </w:t>
+      </w:r>
+      <w:r>
+        <w:rPr>
+          <w:b/>
+          <w:bCs/>
+          <w:lang w:val="vi-VN"/>
         </w:rPr>
         <w:sym w:font="Wingdings" w:char="F0E0"/>
       </w:r>
@@ -3619,45 +1651,15 @@
         <w:rPr>
           <w:b/>
           <w:bCs/>
-        </w:rPr>
-        <w:t xml:space="preserve"> Mua – </w:t>
-      </w:r>
-      <w:proofErr w:type="spellStart"/>
-      <w:r>
-        <w:rPr>
-          <w:b/>
-          <w:bCs/>
-        </w:rPr>
-        <w:t>thanh</w:t>
-      </w:r>
-      <w:proofErr w:type="spellEnd"/>
-      <w:r>
-        <w:rPr>
-          <w:b/>
-          <w:bCs/>
-        </w:rPr>
-        <w:t xml:space="preserve"> </w:t>
-      </w:r>
-      <w:proofErr w:type="spellStart"/>
-      <w:r>
-        <w:rPr>
-          <w:b/>
-          <w:bCs/>
-        </w:rPr>
-        <w:t>toán</w:t>
-      </w:r>
-      <w:proofErr w:type="spellEnd"/>
-      <w:r>
-        <w:rPr>
-          <w:b/>
-          <w:bCs/>
-        </w:rPr>
-        <w:t xml:space="preserve"> Voucher </w:t>
-      </w:r>
-      <w:r>
-        <w:rPr>
-          <w:b/>
-          <w:bCs/>
+          <w:lang w:val="vi-VN"/>
+        </w:rPr>
+        <w:t xml:space="preserve"> Mua – thanh toán Voucher </w:t>
+      </w:r>
+      <w:r>
+        <w:rPr>
+          <w:b/>
+          <w:bCs/>
+          <w:lang w:val="vi-VN"/>
         </w:rPr>
         <w:sym w:font="Wingdings" w:char="F0E0"/>
       </w:r>
@@ -3665,200 +1667,9 @@
         <w:rPr>
           <w:b/>
           <w:bCs/>
-        </w:rPr>
-        <w:t xml:space="preserve"> </w:t>
-      </w:r>
-      <w:proofErr w:type="spellStart"/>
-      <w:r>
-        <w:rPr>
-          <w:b/>
-          <w:bCs/>
-        </w:rPr>
-        <w:t>Voucher</w:t>
-      </w:r>
-      <w:proofErr w:type="spellEnd"/>
-      <w:r>
-        <w:rPr>
-          <w:b/>
-          <w:bCs/>
-        </w:rPr>
-        <w:t xml:space="preserve"> </w:t>
-      </w:r>
-      <w:proofErr w:type="spellStart"/>
-      <w:r>
-        <w:rPr>
-          <w:b/>
-          <w:bCs/>
-        </w:rPr>
-        <w:t>được</w:t>
-      </w:r>
-      <w:proofErr w:type="spellEnd"/>
-      <w:r>
-        <w:rPr>
-          <w:b/>
-          <w:bCs/>
-        </w:rPr>
-        <w:t xml:space="preserve"> </w:t>
-      </w:r>
-      <w:proofErr w:type="spellStart"/>
-      <w:r>
-        <w:rPr>
-          <w:b/>
-          <w:bCs/>
-        </w:rPr>
-        <w:t>lưu</w:t>
-      </w:r>
-      <w:proofErr w:type="spellEnd"/>
-      <w:r>
-        <w:rPr>
-          <w:b/>
-          <w:bCs/>
-        </w:rPr>
-        <w:t xml:space="preserve"> </w:t>
-      </w:r>
-      <w:proofErr w:type="spellStart"/>
-      <w:r>
-        <w:rPr>
-          <w:b/>
-          <w:bCs/>
-        </w:rPr>
-        <w:t>vào</w:t>
-      </w:r>
-      <w:proofErr w:type="spellEnd"/>
-      <w:r>
-        <w:rPr>
-          <w:b/>
-          <w:bCs/>
-        </w:rPr>
-        <w:t xml:space="preserve"> Promo Screen (deep link </w:t>
-      </w:r>
-      <w:proofErr w:type="spellStart"/>
-      <w:r>
-        <w:rPr>
-          <w:b/>
-          <w:bCs/>
-        </w:rPr>
-        <w:t>để</w:t>
-      </w:r>
-      <w:proofErr w:type="spellEnd"/>
-      <w:r>
-        <w:rPr>
-          <w:b/>
-          <w:bCs/>
-        </w:rPr>
-        <w:t xml:space="preserve"> </w:t>
-      </w:r>
-      <w:proofErr w:type="spellStart"/>
-      <w:r>
-        <w:rPr>
-          <w:b/>
-          <w:bCs/>
-        </w:rPr>
-        <w:t>người</w:t>
-      </w:r>
-      <w:proofErr w:type="spellEnd"/>
-      <w:r>
-        <w:rPr>
-          <w:b/>
-          <w:bCs/>
-        </w:rPr>
-        <w:t xml:space="preserve"> </w:t>
-      </w:r>
-      <w:proofErr w:type="spellStart"/>
-      <w:r>
-        <w:rPr>
-          <w:b/>
-          <w:bCs/>
-        </w:rPr>
-        <w:t>dùng</w:t>
-      </w:r>
-      <w:proofErr w:type="spellEnd"/>
-      <w:r>
-        <w:rPr>
-          <w:b/>
-          <w:bCs/>
-        </w:rPr>
-        <w:t xml:space="preserve"> </w:t>
-      </w:r>
-      <w:proofErr w:type="spellStart"/>
-      <w:r>
-        <w:rPr>
-          <w:b/>
-          <w:bCs/>
-        </w:rPr>
-        <w:t>có</w:t>
-      </w:r>
-      <w:proofErr w:type="spellEnd"/>
-      <w:r>
-        <w:rPr>
-          <w:b/>
-          <w:bCs/>
-        </w:rPr>
-        <w:t xml:space="preserve"> </w:t>
-      </w:r>
-      <w:proofErr w:type="spellStart"/>
-      <w:r>
-        <w:rPr>
-          <w:b/>
-          <w:bCs/>
-        </w:rPr>
-        <w:t>thể</w:t>
-      </w:r>
-      <w:proofErr w:type="spellEnd"/>
-      <w:r>
-        <w:rPr>
-          <w:b/>
-          <w:bCs/>
-        </w:rPr>
-        <w:t xml:space="preserve"> click </w:t>
-      </w:r>
-      <w:proofErr w:type="spellStart"/>
-      <w:r>
-        <w:rPr>
-          <w:b/>
-          <w:bCs/>
-        </w:rPr>
-        <w:t>và</w:t>
-      </w:r>
-      <w:proofErr w:type="spellEnd"/>
-      <w:r>
-        <w:rPr>
-          <w:b/>
-          <w:bCs/>
-        </w:rPr>
-        <w:t xml:space="preserve"> </w:t>
-      </w:r>
-      <w:proofErr w:type="spellStart"/>
-      <w:r>
-        <w:rPr>
-          <w:b/>
-          <w:bCs/>
-        </w:rPr>
-        <w:t>trỏ</w:t>
-      </w:r>
-      <w:proofErr w:type="spellEnd"/>
-      <w:r>
-        <w:rPr>
-          <w:b/>
-          <w:bCs/>
-        </w:rPr>
-        <w:t xml:space="preserve"> </w:t>
-      </w:r>
-      <w:proofErr w:type="spellStart"/>
-      <w:r>
-        <w:rPr>
-          <w:b/>
-          <w:bCs/>
-        </w:rPr>
-        <w:t>về</w:t>
-      </w:r>
-      <w:proofErr w:type="spellEnd"/>
-      <w:r>
-        <w:rPr>
-          <w:b/>
-          <w:bCs/>
-        </w:rPr>
-        <w:t>).</w:t>
+          <w:lang w:val="vi-VN"/>
+        </w:rPr>
+        <w:t xml:space="preserve"> Voucher được lưu vào Promo Screen (deep link để người dùng có thể click và trỏ về).</w:t>
       </w:r>
     </w:p>
     <w:p>
@@ -4001,6 +1812,9 @@
         </w:rPr>
       </w:pPr>
       <w:r>
+        <w:rPr>
+          <w:lang w:val="vi-VN"/>
+        </w:rPr>
         <w:t>schemas.py.</w:t>
       </w:r>
     </w:p>
@@ -4039,117 +1853,11 @@
         </w:rPr>
         <w:t xml:space="preserve">lib/presentation/screens/promo/promo_screen.dart: </w:t>
       </w:r>
-      <w:proofErr w:type="spellStart"/>
-      <w:r>
-        <w:t>Nâng</w:t>
-      </w:r>
-      <w:proofErr w:type="spellEnd"/>
-      <w:r>
-        <w:t xml:space="preserve"> </w:t>
-      </w:r>
-      <w:proofErr w:type="spellStart"/>
-      <w:r>
-        <w:t>cấp</w:t>
-      </w:r>
-      <w:proofErr w:type="spellEnd"/>
-      <w:r>
-        <w:t xml:space="preserve"> </w:t>
-      </w:r>
-      <w:proofErr w:type="spellStart"/>
-      <w:r>
-        <w:t>thành</w:t>
-      </w:r>
-      <w:proofErr w:type="spellEnd"/>
-      <w:r>
-        <w:t xml:space="preserve"> </w:t>
-      </w:r>
-      <w:proofErr w:type="spellStart"/>
-      <w:r>
-        <w:t>giao</w:t>
-      </w:r>
-      <w:proofErr w:type="spellEnd"/>
-      <w:r>
-        <w:t xml:space="preserve"> </w:t>
-      </w:r>
-      <w:proofErr w:type="spellStart"/>
-      <w:r>
-        <w:t>diện</w:t>
-      </w:r>
-      <w:proofErr w:type="spellEnd"/>
-      <w:r>
-        <w:t xml:space="preserve"> </w:t>
-      </w:r>
-      <w:proofErr w:type="spellStart"/>
-      <w:r>
-        <w:t>lưu</w:t>
-      </w:r>
-      <w:proofErr w:type="spellEnd"/>
-      <w:r>
-        <w:t xml:space="preserve"> </w:t>
-      </w:r>
-      <w:proofErr w:type="spellStart"/>
-      <w:r>
-        <w:t>trữ</w:t>
-      </w:r>
-      <w:proofErr w:type="spellEnd"/>
-      <w:r>
-        <w:t xml:space="preserve"> 2 </w:t>
-      </w:r>
-      <w:proofErr w:type="spellStart"/>
-      <w:r>
-        <w:t>loại</w:t>
-      </w:r>
-      <w:proofErr w:type="spellEnd"/>
-      <w:r>
-        <w:t xml:space="preserve"> voucher </w:t>
-      </w:r>
-      <w:proofErr w:type="spellStart"/>
-      <w:r>
-        <w:t>riêng</w:t>
-      </w:r>
-      <w:proofErr w:type="spellEnd"/>
-      <w:r>
-        <w:t xml:space="preserve"> </w:t>
-      </w:r>
-      <w:proofErr w:type="spellStart"/>
-      <w:r>
-        <w:t>biệt</w:t>
-      </w:r>
-      <w:proofErr w:type="spellEnd"/>
-      <w:r>
-        <w:t xml:space="preserve">, </w:t>
-      </w:r>
-      <w:proofErr w:type="spellStart"/>
-      <w:r>
-        <w:t>trực</w:t>
-      </w:r>
-      <w:proofErr w:type="spellEnd"/>
-      <w:r>
-        <w:t xml:space="preserve"> </w:t>
-      </w:r>
-      <w:proofErr w:type="spellStart"/>
-      <w:r>
-        <w:t>quan</w:t>
-      </w:r>
-      <w:proofErr w:type="spellEnd"/>
-      <w:r>
-        <w:t xml:space="preserve">, premium, </w:t>
-      </w:r>
-      <w:proofErr w:type="spellStart"/>
-      <w:r>
-        <w:t>thực</w:t>
-      </w:r>
-      <w:proofErr w:type="spellEnd"/>
-      <w:r>
-        <w:t xml:space="preserve"> </w:t>
-      </w:r>
-      <w:proofErr w:type="spellStart"/>
-      <w:r>
-        <w:t>thụ</w:t>
-      </w:r>
-      <w:proofErr w:type="spellEnd"/>
-      <w:r>
-        <w:t>.</w:t>
+      <w:r>
+        <w:rPr>
+          <w:lang w:val="vi-VN"/>
+        </w:rPr>
+        <w:t>Nâng cấp thành giao diện lưu trữ 2 loại voucher riêng biệt, trực quan, premium, thực thụ.</w:t>
       </w:r>
     </w:p>
     <w:p>
@@ -4169,66 +1877,22 @@
         <w:t>Tạ</w:t>
       </w:r>
       <w:r>
-        <w:t>/</w:t>
-      </w:r>
-      <w:proofErr w:type="spellStart"/>
-      <w:r>
-        <w:t>nâng</w:t>
-      </w:r>
-      <w:proofErr w:type="spellEnd"/>
-      <w:r>
+        <w:rPr>
+          <w:lang w:val="vi-VN"/>
+        </w:rPr>
+        <w:t>/nâng cấp giao diện</w:t>
+      </w:r>
+      <w:r>
+        <w:rPr>
+          <w:lang w:val="vi-VN"/>
+        </w:rPr>
         <w:t xml:space="preserve"> </w:t>
       </w:r>
-      <w:proofErr w:type="spellStart"/>
-      <w:r>
-        <w:t>cấp</w:t>
-      </w:r>
-      <w:proofErr w:type="spellEnd"/>
-      <w:r>
-        <w:t xml:space="preserve"> </w:t>
-      </w:r>
-      <w:proofErr w:type="spellStart"/>
-      <w:r>
-        <w:t>giao</w:t>
-      </w:r>
-      <w:proofErr w:type="spellEnd"/>
-      <w:r>
-        <w:t xml:space="preserve"> </w:t>
-      </w:r>
-      <w:proofErr w:type="spellStart"/>
-      <w:r>
-        <w:t>diện</w:t>
-      </w:r>
-      <w:proofErr w:type="spellEnd"/>
-      <w:r>
-        <w:rPr>
-          <w:lang w:val="vi-VN"/>
-        </w:rPr>
-        <w:t xml:space="preserve"> </w:t>
-      </w:r>
-      <w:proofErr w:type="spellStart"/>
-      <w:r>
-        <w:t>đa</w:t>
-      </w:r>
-      <w:proofErr w:type="spellEnd"/>
-      <w:r>
-        <w:t xml:space="preserve"> </w:t>
-      </w:r>
-      <w:proofErr w:type="spellStart"/>
-      <w:r>
-        <w:t>lưới</w:t>
-      </w:r>
-      <w:proofErr w:type="spellEnd"/>
-      <w:r>
-        <w:t xml:space="preserve"> (</w:t>
-      </w:r>
-      <w:proofErr w:type="spellStart"/>
-      <w:r>
-        <w:t>như</w:t>
-      </w:r>
-      <w:proofErr w:type="spellEnd"/>
-      <w:r>
-        <w:t xml:space="preserve"> explore screen) </w:t>
+      <w:r>
+        <w:rPr>
+          <w:lang w:val="vi-VN"/>
+        </w:rPr>
+        <w:t xml:space="preserve">đa lưới (như explore screen) </w:t>
       </w:r>
       <w:r>
         <w:rPr>
@@ -4501,13 +2165,19 @@
         <w:rPr>
           <w:lang w:val="vi-VN"/>
         </w:rPr>
-        <w:t>main.py:</w:t>
-      </w:r>
-    </w:p>
-    <w:p>
-      <w:pPr>
-        <w:numPr>
-          <w:ilvl w:val="2"/>
+        <w:t>main.py</w:t>
+      </w:r>
+      <w:r>
+        <w:rPr>
+          <w:lang w:val="vi-VN"/>
+        </w:rPr>
+        <w:t>;</w:t>
+      </w:r>
+    </w:p>
+    <w:p>
+      <w:pPr>
+        <w:numPr>
+          <w:ilvl w:val="1"/>
           <w:numId w:val="15"/>
         </w:numPr>
         <w:rPr>
@@ -4518,7 +2188,24 @@
         <w:rPr>
           <w:lang w:val="vi-VN"/>
         </w:rPr>
-        <w:t xml:space="preserve">API /appointments/request (POST): Bổ sung hàm validate: Nếu có truyền voucher_code là VIP, bắt buộc đối soát partner_id của dịch vụ và fixed_time_slot xem có khớp với thông tin trên Voucher VIP hay không. </w:t>
+        <w:t>Schemas.py;</w:t>
+      </w:r>
+    </w:p>
+    <w:p>
+      <w:pPr>
+        <w:numPr>
+          <w:ilvl w:val="1"/>
+          <w:numId w:val="15"/>
+        </w:numPr>
+        <w:rPr>
+          <w:lang w:val="vi-VN"/>
+        </w:rPr>
+      </w:pPr>
+      <w:r>
+        <w:rPr>
+          <w:lang w:val="vi-VN"/>
+        </w:rPr>
+        <w:t>Schema.sql</w:t>
       </w:r>
     </w:p>
     <w:p>
@@ -4563,6 +2250,1090 @@
           <w:lang w:val="vi-VN"/>
         </w:rPr>
       </w:pPr>
+    </w:p>
+    <w:p>
+      <w:pPr>
+        <w:rPr>
+          <w:lang w:val="vi-VN"/>
+        </w:rPr>
+      </w:pPr>
+      <w:r>
+        <w:rPr>
+          <w:lang w:val="vi-VN"/>
+        </w:rPr>
+        <w:t>Phase 07: Nạp tiền và giao diện show off (display) + đăng ký các gói;</w:t>
+      </w:r>
+    </w:p>
+    <w:p>
+      <w:pPr>
+        <w:rPr>
+          <w:lang w:val="vi-VN"/>
+        </w:rPr>
+      </w:pPr>
+      <w:r>
+        <w:rPr>
+          <w:lang w:val="vi-VN"/>
+        </w:rPr>
+        <w:t>1. Luồng nghiệp vụ &amp; chức năng:</w:t>
+      </w:r>
+    </w:p>
+    <w:p>
+      <w:pPr>
+        <w:rPr>
+          <w:lang w:val="vi-VN"/>
+        </w:rPr>
+      </w:pPr>
+      <w:r>
+        <w:rPr>
+          <w:lang w:val="vi-VN"/>
+        </w:rPr>
+        <w:t>- Chức năng: Show off một cách khéo léo, premium để kích thích người dùng – cụ thể ở đây là role Partner click vào mua các gói. Phase này xử lý luồng thanh toán thành công và giao diện thanh toán, show off – làm 1 trang riêng.</w:t>
+      </w:r>
+    </w:p>
+    <w:p>
+      <w:pPr>
+        <w:rPr>
+          <w:lang w:val="vi-VN"/>
+        </w:rPr>
+      </w:pPr>
+      <w:r>
+        <w:rPr>
+          <w:lang w:val="vi-VN"/>
+        </w:rPr>
+        <w:lastRenderedPageBreak/>
+        <w:t>2. Chi tiết thay đổi:</w:t>
+      </w:r>
+      <w:r>
+        <w:rPr>
+          <w:lang w:val="vi-VN"/>
+        </w:rPr>
+        <w:br/>
+        <w:t>- Chuẩn bị riêng 1 trang riêng để show off các gói – quyền lợi, button thanh toán,…</w:t>
+      </w:r>
+      <w:r>
+        <w:rPr>
+          <w:lang w:val="vi-VN"/>
+        </w:rPr>
+        <w:br/>
+        <w:t>- Nâng cấp Partner Private Profile Screen để có button dẫn vào trang trên, đồng thời kích thích việc click vào;</w:t>
+      </w:r>
+    </w:p>
+    <w:p>
+      <w:pPr>
+        <w:rPr>
+          <w:lang w:val="vi-VN"/>
+        </w:rPr>
+      </w:pPr>
+      <w:r>
+        <w:rPr>
+          <w:lang w:val="vi-VN"/>
+        </w:rPr>
+        <w:t>- Luồng và giao diện thanh toán PayOS;</w:t>
+      </w:r>
+    </w:p>
+    <w:p>
+      <w:pPr>
+        <w:rPr>
+          <w:lang w:val="vi-VN"/>
+        </w:rPr>
+      </w:pPr>
+      <w:r>
+        <w:rPr>
+          <w:lang w:val="vi-VN"/>
+        </w:rPr>
+        <w:t>3. Danh sách các files cần thay đổi:</w:t>
+      </w:r>
+    </w:p>
+    <w:p>
+      <w:pPr>
+        <w:rPr>
+          <w:lang w:val="vi-VN"/>
+        </w:rPr>
+      </w:pPr>
+      <w:r>
+        <w:rPr>
+          <w:lang w:val="vi-VN"/>
+        </w:rPr>
+        <w:t>- Backend: schema.sql, schemas.py, main.py;</w:t>
+      </w:r>
+    </w:p>
+    <w:p>
+      <w:pPr>
+        <w:rPr>
+          <w:lang w:val="vi-VN"/>
+        </w:rPr>
+      </w:pPr>
+      <w:r>
+        <w:rPr>
+          <w:lang w:val="vi-VN"/>
+        </w:rPr>
+        <w:t xml:space="preserve">- Frontend (mobile): </w:t>
+      </w:r>
+    </w:p>
+    <w:p>
+      <w:pPr>
+        <w:rPr>
+          <w:lang w:val="vi-VN"/>
+        </w:rPr>
+      </w:pPr>
+      <w:r>
+        <w:rPr>
+          <w:lang w:val="vi-VN"/>
+        </w:rPr>
+        <w:t>Model, Service, Route (đề xuất xem cần audit, tạo mới các files nào, cần nâng cấp để đảm bảo luồng hoạt động);</w:t>
+      </w:r>
+    </w:p>
+    <w:p>
+      <w:pPr>
+        <w:rPr>
+          <w:lang w:val="vi-VN"/>
+        </w:rPr>
+      </w:pPr>
+      <w:r>
+        <w:rPr>
+          <w:lang w:val="vi-VN"/>
+        </w:rPr>
+        <w:t>Giao diện:Partner Private Profile, Tạo 1 trang mới.</w:t>
+      </w:r>
+    </w:p>
+    <w:p>
+      <w:pPr>
+        <w:rPr>
+          <w:lang w:val="vi-VN"/>
+        </w:rPr>
+      </w:pPr>
+    </w:p>
+    <w:p>
+      <w:pPr>
+        <w:rPr>
+          <w:lang w:val="vi-VN"/>
+        </w:rPr>
+      </w:pPr>
+      <w:r>
+        <w:rPr>
+          <w:lang w:val="vi-VN"/>
+        </w:rPr>
+        <w:t>Làm components Shrimmer và Lấp lánh riêng, cho các thành phần cần thể hiện sự premium;</w:t>
+      </w:r>
+    </w:p>
+    <w:p>
+      <w:pPr>
+        <w:rPr>
+          <w:lang w:val="vi-VN"/>
+        </w:rPr>
+      </w:pPr>
+      <w:r>
+        <w:rPr>
+          <w:lang w:val="vi-VN"/>
+        </w:rPr>
+        <w:t>Làm component khung, badge, màu sắc nhận diện riêng cho các cấp độ thành viên Partner;</w:t>
+      </w:r>
+    </w:p>
+    <w:p>
+      <w:pPr>
+        <w:rPr>
+          <w:lang w:val="vi-VN"/>
+        </w:rPr>
+      </w:pPr>
+      <w:r>
+        <w:rPr>
+          <w:lang w:val="vi-VN"/>
+        </w:rPr>
+        <w:t>Quyền lợi thật:</w:t>
+      </w:r>
+    </w:p>
+    <w:p>
+      <w:pPr>
+        <w:rPr>
+          <w:lang w:val="vi-VN"/>
+        </w:rPr>
+      </w:pPr>
+      <w:r>
+        <w:rPr>
+          <w:lang w:val="vi-VN"/>
+        </w:rPr>
+        <w:t>1. Dedicated upload – tải lên video 10 phút dài, 4k 60 fps: Vừa nâng cấp logic thật, cũng vừa nâng cấp giao diện tùy theo cấp độ thành viên thể hiện sự premium;</w:t>
+      </w:r>
+    </w:p>
+    <w:p>
+      <w:pPr>
+        <w:rPr>
+          <w:lang w:val="vi-VN"/>
+        </w:rPr>
+      </w:pPr>
+      <w:r>
+        <w:rPr>
+          <w:lang w:val="vi-VN"/>
+        </w:rPr>
+        <w:t xml:space="preserve">2. File </w:t>
+      </w:r>
+      <w:r>
+        <w:rPr>
+          <w:lang w:val="vi-VN"/>
+        </w:rPr>
+        <w:t>partner_ai_context_screen.dart</w:t>
+      </w:r>
+      <w:r>
+        <w:rPr>
+          <w:lang w:val="vi-VN"/>
+        </w:rPr>
+        <w:t xml:space="preserve"> – số lượng context có thể nạp: </w:t>
+      </w:r>
+      <w:r>
+        <w:rPr>
+          <w:lang w:val="vi-VN"/>
+        </w:rPr>
+        <w:t>Vừa nâng cấp logic thật, cũng vừa nâng cấp giao diện tùy theo cấp độ thành viên thể hiện sự premium;</w:t>
+      </w:r>
+    </w:p>
+    <w:p>
+      <w:pPr>
+        <w:rPr>
+          <w:lang w:val="vi-VN"/>
+        </w:rPr>
+      </w:pPr>
+      <w:r>
+        <w:rPr>
+          <w:lang w:val="vi-VN"/>
+        </w:rPr>
+        <w:t>Về mặt thể hiện – giao diện:</w:t>
+      </w:r>
+    </w:p>
+    <w:p>
+      <w:pPr>
+        <w:rPr>
+          <w:lang w:val="vi-VN"/>
+        </w:rPr>
+      </w:pPr>
+      <w:r>
+        <w:rPr>
+          <w:lang w:val="vi-VN"/>
+        </w:rPr>
+        <w:t>1. Partner Private Profile Screen: Bổ sung badge, khung, thay đổi màu sắc nhận diện;</w:t>
+      </w:r>
+    </w:p>
+    <w:p>
+      <w:pPr>
+        <w:rPr>
+          <w:lang w:val="vi-VN"/>
+        </w:rPr>
+      </w:pPr>
+      <w:r>
+        <w:rPr>
+          <w:lang w:val="vi-VN"/>
+        </w:rPr>
+        <w:t>2. TikTokFeeds Screen – phần hiển thị avatar ở thanh các button thêm phải, kiểm tra điều kiện cấp độ hội viên mà bổ sung thêm khung bên ngoài;</w:t>
+      </w:r>
+    </w:p>
+    <w:p>
+      <w:pPr>
+        <w:rPr>
+          <w:lang w:val="vi-VN"/>
+        </w:rPr>
+      </w:pPr>
+      <w:r>
+        <w:rPr>
+          <w:lang w:val="vi-VN"/>
+        </w:rPr>
+        <w:t>3. Partner Public Profile: Cũng cần bổ sung badge, khung, màu sắc nhận diện,... 1 số phần khác thể hiện rõ nét sự trang trọng (để đối tác cảm thấy thích thú, phấn khởi);</w:t>
+      </w:r>
+    </w:p>
+    <w:p>
+      <w:pPr>
+        <w:rPr>
+          <w:lang w:val="vi-VN"/>
+        </w:rPr>
+      </w:pPr>
+      <w:r>
+        <w:rPr>
+          <w:lang w:val="vi-VN"/>
+        </w:rPr>
+        <w:t xml:space="preserve">4. Files </w:t>
+      </w:r>
+      <w:r>
+        <w:rPr>
+          <w:lang w:val="vi-VN"/>
+        </w:rPr>
+        <w:t>partner_ai_chat_screen.dart</w:t>
+      </w:r>
+      <w:r>
+        <w:rPr>
+          <w:lang w:val="vi-VN"/>
+        </w:rPr>
+        <w:t>, cũng cần nâng cấp màu sắc nhận diện, badge, khung vào đây;</w:t>
+      </w:r>
+    </w:p>
+    <w:p>
+      <w:pPr>
+        <w:rPr>
+          <w:lang w:val="vi-VN"/>
+        </w:rPr>
+      </w:pPr>
+      <w:r>
+        <w:rPr>
+          <w:lang w:val="vi-VN"/>
+        </w:rPr>
+        <w:lastRenderedPageBreak/>
+        <w:t>5. Booking Bottom Sheets cũng cần nâng cấp: Nếu người dùng đăng ký dịch vụ của 1 đối tác VIP hoặc PRO thì giao diện đăng ký sẽ khác;</w:t>
+      </w:r>
+    </w:p>
+    <w:p>
+      <w:pPr>
+        <w:rPr>
+          <w:lang w:val="vi-VN"/>
+        </w:rPr>
+      </w:pPr>
+      <w:r>
+        <w:rPr>
+          <w:lang w:val="vi-VN"/>
+        </w:rPr>
+        <w:t>6. Explore screen: Ưu tiên sắp xếp các đối tác VIP, PRO lên đầu tiên</w:t>
+      </w:r>
+      <w:r>
+        <w:rPr>
+          <w:lang w:val="vi-VN"/>
+        </w:rPr>
+        <w:t>, cũng cần gắn – bọc khung, badge của các partner cấp độ VIP, PRO vào đây;</w:t>
+      </w:r>
+    </w:p>
+    <w:p>
+      <w:pPr>
+        <w:rPr>
+          <w:lang w:val="vi-VN"/>
+        </w:rPr>
+      </w:pPr>
+      <w:r>
+        <w:rPr>
+          <w:lang w:val="vi-VN"/>
+        </w:rPr>
+        <w:t>7. Map Screen: Tương tự với Explore;</w:t>
+      </w:r>
+    </w:p>
+    <w:p>
+      <w:pPr>
+        <w:rPr>
+          <w:lang w:val="vi-VN"/>
+        </w:rPr>
+      </w:pPr>
+      <w:r>
+        <w:rPr>
+          <w:lang w:val="vi-VN"/>
+        </w:rPr>
+        <w:t>8. Calendar cũng cần nâng cấp: Cho cả phía người dùng và Partner – người dùng thì họ cũng cần biết mình đang đăng ký với dịch vụ với Partner ở cấp độ nào; Partner thì nâng cấp giao diện thể hiện tính premium 1 chút – về bản chất cũng không cần bổ sung logic hay button;</w:t>
+      </w:r>
+    </w:p>
+    <w:p>
+      <w:pPr>
+        <w:rPr>
+          <w:lang w:val="vi-VN"/>
+        </w:rPr>
+      </w:pPr>
+      <w:r>
+        <w:rPr>
+          <w:lang w:val="vi-VN"/>
+        </w:rPr>
+        <w:t>9. Partner Dashboard: Nâng cấp giao diện, màu sắc nhận diện đẳng cấp – premium cho các cấp độ Partner tương ứng; Đồng thời đăng tải voucher VIP cũng bọc khóa với Partner thường, với Partner Pro thì (5 voucher 1 tuần), VIP thì không giới hạn;</w:t>
+      </w:r>
+    </w:p>
+    <w:p>
+      <w:pPr>
+        <w:rPr>
+          <w:lang w:val="vi-VN"/>
+        </w:rPr>
+      </w:pPr>
+      <w:r>
+        <w:rPr>
+          <w:lang w:val="vi-VN"/>
+        </w:rPr>
+        <w:t>10. Admin Dashboard: Xem được số lượng Partner theo từng cấp độ tương ứng.</w:t>
+      </w:r>
+    </w:p>
+    <w:p>
+      <w:pPr>
+        <w:rPr>
+          <w:lang w:val="vi-VN"/>
+        </w:rPr>
+      </w:pPr>
+    </w:p>
+    <w:p>
+      <w:pPr>
+        <w:rPr>
+          <w:lang w:val="vi-VN"/>
+        </w:rPr>
+      </w:pPr>
+    </w:p>
+    <w:p>
+      <w:pPr>
+        <w:rPr>
+          <w:b/>
+          <w:bCs/>
+          <w:lang w:val="vi-VN"/>
+        </w:rPr>
+      </w:pPr>
+      <w:r>
+        <w:rPr>
+          <w:b/>
+          <w:bCs/>
+          <w:lang w:val="vi-VN"/>
+        </w:rPr>
+        <w:t>Khối 1: Công Cụ Đặc Quyền Thực Tế Của Đối Tác (2 Files)</w:t>
+      </w:r>
+    </w:p>
+    <w:p>
+      <w:pPr>
+        <w:numPr>
+          <w:ilvl w:val="0"/>
+          <w:numId w:val="17"/>
+        </w:numPr>
+        <w:rPr>
+          <w:lang w:val="vi-VN"/>
+        </w:rPr>
+      </w:pPr>
+      <w:r>
+        <w:rPr>
+          <w:b/>
+          <w:bCs/>
+          <w:lang w:val="vi-VN"/>
+        </w:rPr>
+        <w:t>Các file:</w:t>
+      </w:r>
+      <w:r>
+        <w:rPr>
+          <w:lang w:val="vi-VN"/>
+        </w:rPr>
+        <w:t xml:space="preserve"> dedicated_upload_screen.dart, partner_ai_context_screen.dart</w:t>
+      </w:r>
+    </w:p>
+    <w:p>
+      <w:pPr>
+        <w:numPr>
+          <w:ilvl w:val="0"/>
+          <w:numId w:val="17"/>
+        </w:numPr>
+        <w:rPr>
+          <w:lang w:val="vi-VN"/>
+        </w:rPr>
+      </w:pPr>
+      <w:r>
+        <w:rPr>
+          <w:b/>
+          <w:bCs/>
+          <w:lang w:val="vi-VN"/>
+        </w:rPr>
+        <w:t>Nhiệm vụ:</w:t>
+      </w:r>
+    </w:p>
+    <w:p>
+      <w:pPr>
+        <w:numPr>
+          <w:ilvl w:val="1"/>
+          <w:numId w:val="17"/>
+        </w:numPr>
+        <w:rPr>
+          <w:lang w:val="vi-VN"/>
+        </w:rPr>
+      </w:pPr>
+      <w:r>
+        <w:rPr>
+          <w:lang w:val="vi-VN"/>
+        </w:rPr>
+        <w:t>Mở khóa hạn mức upload Video 4K 60fps dài 10 phút cho Diamond, 3 phút cho Pro.</w:t>
+      </w:r>
+    </w:p>
+    <w:p>
+      <w:pPr>
+        <w:numPr>
+          <w:ilvl w:val="1"/>
+          <w:numId w:val="17"/>
+        </w:numPr>
+        <w:rPr>
+          <w:lang w:val="vi-VN"/>
+        </w:rPr>
+      </w:pPr>
+      <w:r>
+        <w:rPr>
+          <w:lang w:val="vi-VN"/>
+        </w:rPr>
+        <w:t>Hiển thị thanh đo ký tự động (2.000 / 5.000 / 10.000 ký tự) cho partner_ai_context_screen.dart.</w:t>
+      </w:r>
+    </w:p>
+    <w:p>
+      <w:pPr>
+        <w:numPr>
+          <w:ilvl w:val="0"/>
+          <w:numId w:val="17"/>
+        </w:numPr>
+        <w:rPr>
+          <w:lang w:val="vi-VN"/>
+        </w:rPr>
+      </w:pPr>
+      <w:r>
+        <w:rPr>
+          <w:b/>
+          <w:bCs/>
+          <w:lang w:val="vi-VN"/>
+        </w:rPr>
+        <w:t>Lý do đi trước:</w:t>
+      </w:r>
+      <w:r>
+        <w:rPr>
+          <w:lang w:val="vi-VN"/>
+        </w:rPr>
+        <w:t xml:space="preserve"> Tạo dữ liệu đầu vào chuẩn mực (Video dài chất lượng cao + Ngữ cảnh AI sâu) để các màn hình hiển thị sau có dữ liệu thật để render.</w:t>
+      </w:r>
+    </w:p>
+    <w:p>
+      <w:pPr>
+        <w:rPr>
+          <w:b/>
+          <w:bCs/>
+          <w:lang w:val="vi-VN"/>
+        </w:rPr>
+      </w:pPr>
+      <w:r>
+        <w:rPr>
+          <w:b/>
+          <w:bCs/>
+          <w:lang w:val="vi-VN"/>
+        </w:rPr>
+        <w:t>Khối 2: Hồ Sơ Đối Tác &amp; Nhận Diện Đẳng Cấp (2 Files)</w:t>
+      </w:r>
+    </w:p>
+    <w:p>
+      <w:pPr>
+        <w:numPr>
+          <w:ilvl w:val="0"/>
+          <w:numId w:val="18"/>
+        </w:numPr>
+        <w:rPr>
+          <w:lang w:val="vi-VN"/>
+        </w:rPr>
+      </w:pPr>
+      <w:r>
+        <w:rPr>
+          <w:b/>
+          <w:bCs/>
+          <w:lang w:val="vi-VN"/>
+        </w:rPr>
+        <w:t>Các file:</w:t>
+      </w:r>
+      <w:r>
+        <w:rPr>
+          <w:lang w:val="vi-VN"/>
+        </w:rPr>
+        <w:t xml:space="preserve"> partner_profile_screen.dart, public_profile_screen.dart</w:t>
+      </w:r>
+    </w:p>
+    <w:p>
+      <w:pPr>
+        <w:numPr>
+          <w:ilvl w:val="0"/>
+          <w:numId w:val="18"/>
+        </w:numPr>
+        <w:rPr>
+          <w:lang w:val="vi-VN"/>
+        </w:rPr>
+      </w:pPr>
+      <w:r>
+        <w:rPr>
+          <w:b/>
+          <w:bCs/>
+          <w:lang w:val="vi-VN"/>
+        </w:rPr>
+        <w:t>Nhiệm vụ:</w:t>
+      </w:r>
+    </w:p>
+    <w:p>
+      <w:pPr>
+        <w:numPr>
+          <w:ilvl w:val="1"/>
+          <w:numId w:val="18"/>
+        </w:numPr>
+        <w:rPr>
+          <w:lang w:val="vi-VN"/>
+        </w:rPr>
+      </w:pPr>
+      <w:r>
+        <w:rPr>
+          <w:lang w:val="vi-VN"/>
+        </w:rPr>
+        <w:t xml:space="preserve">Gắn PartnerAvatarFrame, đổi dải màu Header và gắn dải Ruy-băng </w:t>
+      </w:r>
+      <w:r>
+        <w:rPr>
+          <w:i/>
+          <w:iCs/>
+          <w:lang w:val="vi-VN"/>
+        </w:rPr>
+        <w:t>"</w:t>
+      </w:r>
+      <w:r>
+        <w:rPr>
+          <w:rFonts w:ascii="Segoe UI Symbol" w:hAnsi="Segoe UI Symbol" w:cs="Segoe UI Symbol"/>
+          <w:i/>
+          <w:iCs/>
+          <w:lang w:val="vi-VN"/>
+        </w:rPr>
+        <w:t>✦</w:t>
+      </w:r>
+      <w:r>
+        <w:rPr>
+          <w:i/>
+          <w:iCs/>
+          <w:lang w:val="vi-VN"/>
+        </w:rPr>
+        <w:t xml:space="preserve"> TOP 1 VERIFIED CLINIC"</w:t>
+      </w:r>
+      <w:r>
+        <w:rPr>
+          <w:lang w:val="vi-VN"/>
+        </w:rPr>
+        <w:t xml:space="preserve"> cho Diamond.</w:t>
+      </w:r>
+    </w:p>
+    <w:p>
+      <w:pPr>
+        <w:numPr>
+          <w:ilvl w:val="1"/>
+          <w:numId w:val="18"/>
+        </w:numPr>
+        <w:rPr>
+          <w:lang w:val="vi-VN"/>
+        </w:rPr>
+      </w:pPr>
+      <w:r>
+        <w:rPr>
+          <w:lang w:val="vi-VN"/>
+        </w:rPr>
+        <w:lastRenderedPageBreak/>
+        <w:t xml:space="preserve">Bổ sung Badge </w:t>
+      </w:r>
+      <w:r>
+        <w:rPr>
+          <w:rFonts w:ascii="Segoe UI Emoji" w:hAnsi="Segoe UI Emoji" w:cs="Segoe UI Emoji"/>
+          <w:lang w:val="vi-VN"/>
+        </w:rPr>
+        <w:t>💠</w:t>
+      </w:r>
+      <w:r>
+        <w:rPr>
+          <w:lang w:val="vi-VN"/>
+        </w:rPr>
+        <w:t xml:space="preserve"> PRO / </w:t>
+      </w:r>
+      <w:r>
+        <w:rPr>
+          <w:rFonts w:ascii="Segoe UI Emoji" w:hAnsi="Segoe UI Emoji" w:cs="Segoe UI Emoji"/>
+          <w:lang w:val="vi-VN"/>
+        </w:rPr>
+        <w:t>👑</w:t>
+      </w:r>
+      <w:r>
+        <w:rPr>
+          <w:lang w:val="vi-VN"/>
+        </w:rPr>
+        <w:t xml:space="preserve"> VIP DIAMOND tại trang cá nhân và trang công khai.</w:t>
+      </w:r>
+    </w:p>
+    <w:p>
+      <w:pPr>
+        <w:numPr>
+          <w:ilvl w:val="0"/>
+          <w:numId w:val="18"/>
+        </w:numPr>
+        <w:rPr>
+          <w:lang w:val="vi-VN"/>
+        </w:rPr>
+      </w:pPr>
+      <w:r>
+        <w:rPr>
+          <w:b/>
+          <w:bCs/>
+          <w:lang w:val="vi-VN"/>
+        </w:rPr>
+        <w:t>Lý do đi tiếp:</w:t>
+      </w:r>
+      <w:r>
+        <w:rPr>
+          <w:lang w:val="vi-VN"/>
+        </w:rPr>
+        <w:t xml:space="preserve"> Đây là bộ mặt thương hiệu của đối tác. Khi làm xong, mọi nơi click vào Avatar đối tác đều trỏ về một trang Public Profile đẹp mắt và trang trọng.</w:t>
+      </w:r>
+    </w:p>
+    <w:p>
+      <w:pPr>
+        <w:rPr>
+          <w:b/>
+          <w:bCs/>
+          <w:lang w:val="vi-VN"/>
+        </w:rPr>
+      </w:pPr>
+      <w:r>
+        <w:rPr>
+          <w:b/>
+          <w:bCs/>
+          <w:lang w:val="vi-VN"/>
+        </w:rPr>
+        <w:t>Khối 3: Phễu Khám Phá, AI Concierge &amp; Chốt Lịch Hẹn (4 Files)</w:t>
+      </w:r>
+    </w:p>
+    <w:p>
+      <w:pPr>
+        <w:numPr>
+          <w:ilvl w:val="0"/>
+          <w:numId w:val="19"/>
+        </w:numPr>
+        <w:rPr>
+          <w:lang w:val="vi-VN"/>
+        </w:rPr>
+      </w:pPr>
+      <w:r>
+        <w:rPr>
+          <w:b/>
+          <w:bCs/>
+          <w:lang w:val="vi-VN"/>
+        </w:rPr>
+        <w:t>Các file:</w:t>
+      </w:r>
+      <w:r>
+        <w:rPr>
+          <w:lang w:val="vi-VN"/>
+        </w:rPr>
+        <w:t xml:space="preserve"> tiktok_feeds_screen.dart, map_screen.dart (hoặc explore_screen.dart), partner_ai_chat_screen.dart, service_booking_bottom_sheet.dart</w:t>
+      </w:r>
+    </w:p>
+    <w:p>
+      <w:pPr>
+        <w:numPr>
+          <w:ilvl w:val="0"/>
+          <w:numId w:val="19"/>
+        </w:numPr>
+        <w:rPr>
+          <w:lang w:val="vi-VN"/>
+        </w:rPr>
+      </w:pPr>
+      <w:r>
+        <w:rPr>
+          <w:b/>
+          <w:bCs/>
+          <w:lang w:val="vi-VN"/>
+        </w:rPr>
+        <w:t>Nhiệm vụ:</w:t>
+      </w:r>
+    </w:p>
+    <w:p>
+      <w:pPr>
+        <w:numPr>
+          <w:ilvl w:val="1"/>
+          <w:numId w:val="19"/>
+        </w:numPr>
+        <w:rPr>
+          <w:lang w:val="vi-VN"/>
+        </w:rPr>
+      </w:pPr>
+      <w:r>
+        <w:rPr>
+          <w:b/>
+          <w:bCs/>
+          <w:lang w:val="vi-VN"/>
+        </w:rPr>
+        <w:t>Feeds:</w:t>
+      </w:r>
+      <w:r>
+        <w:rPr>
+          <w:lang w:val="vi-VN"/>
+        </w:rPr>
+        <w:t xml:space="preserve"> Bọc PartnerAvatarFrame ở cột action bên phải để kích thích khách bấm vào kênh cơ sở.</w:t>
+      </w:r>
+    </w:p>
+    <w:p>
+      <w:pPr>
+        <w:numPr>
+          <w:ilvl w:val="1"/>
+          <w:numId w:val="19"/>
+        </w:numPr>
+        <w:rPr>
+          <w:lang w:val="vi-VN"/>
+        </w:rPr>
+      </w:pPr>
+      <w:r>
+        <w:rPr>
+          <w:b/>
+          <w:bCs/>
+          <w:lang w:val="vi-VN"/>
+        </w:rPr>
+        <w:t>Map/Explore:</w:t>
+      </w:r>
+      <w:r>
+        <w:rPr>
+          <w:lang w:val="vi-VN"/>
+        </w:rPr>
+        <w:t xml:space="preserve"> Đổi Marker thành </w:t>
+      </w:r>
+      <w:r>
+        <w:rPr>
+          <w:b/>
+          <w:bCs/>
+          <w:lang w:val="vi-VN"/>
+        </w:rPr>
+        <w:t>Viên Kim Cương Ruby Đỏ</w:t>
+      </w:r>
+      <w:r>
+        <w:rPr>
+          <w:lang w:val="vi-VN"/>
+        </w:rPr>
+        <w:t xml:space="preserve"> hoặc </w:t>
+      </w:r>
+      <w:r>
+        <w:rPr>
+          <w:b/>
+          <w:bCs/>
+          <w:lang w:val="vi-VN"/>
+        </w:rPr>
+        <w:t>Ghim Cyan</w:t>
+      </w:r>
+      <w:r>
+        <w:rPr>
+          <w:lang w:val="vi-VN"/>
+        </w:rPr>
+        <w:t>, ghim cơ sở VIP lên hàng đầu.</w:t>
+      </w:r>
+    </w:p>
+    <w:p>
+      <w:pPr>
+        <w:numPr>
+          <w:ilvl w:val="1"/>
+          <w:numId w:val="19"/>
+        </w:numPr>
+        <w:rPr>
+          <w:lang w:val="vi-VN"/>
+        </w:rPr>
+      </w:pPr>
+      <w:r>
+        <w:rPr>
+          <w:b/>
+          <w:bCs/>
+          <w:lang w:val="vi-VN"/>
+        </w:rPr>
+        <w:t>AI Chat:</w:t>
+      </w:r>
+      <w:r>
+        <w:rPr>
+          <w:lang w:val="vi-VN"/>
+        </w:rPr>
+        <w:t xml:space="preserve"> Giao diện Trợ lý Concierge 5 sao với Mascot có hào quang nhận diện theo gói.</w:t>
+      </w:r>
+    </w:p>
+    <w:p>
+      <w:pPr>
+        <w:numPr>
+          <w:ilvl w:val="1"/>
+          <w:numId w:val="19"/>
+        </w:numPr>
+        <w:rPr>
+          <w:lang w:val="vi-VN"/>
+        </w:rPr>
+      </w:pPr>
+      <w:r>
+        <w:rPr>
+          <w:b/>
+          <w:bCs/>
+          <w:lang w:val="vi-VN"/>
+        </w:rPr>
+        <w:t>Booking Sheet:</w:t>
+      </w:r>
+      <w:r>
+        <w:rPr>
+          <w:lang w:val="vi-VN"/>
+        </w:rPr>
+        <w:t xml:space="preserve"> Đổi Header sang chuẩn sang trọng khi đặt lịch tại cơ sở VIP.</w:t>
+      </w:r>
+    </w:p>
+    <w:p>
+      <w:pPr>
+        <w:numPr>
+          <w:ilvl w:val="0"/>
+          <w:numId w:val="19"/>
+        </w:numPr>
+        <w:rPr>
+          <w:lang w:val="vi-VN"/>
+        </w:rPr>
+      </w:pPr>
+      <w:r>
+        <w:rPr>
+          <w:b/>
+          <w:bCs/>
+          <w:lang w:val="vi-VN"/>
+        </w:rPr>
+        <w:t>Lý do đi tiếp:</w:t>
+      </w:r>
+      <w:r>
+        <w:rPr>
+          <w:lang w:val="vi-VN"/>
+        </w:rPr>
+        <w:t xml:space="preserve"> Hoàn thiện trải nghiệm từ lúc khách xem video, tìm trên bản đồ, chat với AI đến lúc chốt lịch hẹn.</w:t>
+      </w:r>
+    </w:p>
+    <w:p>
+      <w:pPr>
+        <w:rPr>
+          <w:b/>
+          <w:bCs/>
+          <w:lang w:val="vi-VN"/>
+        </w:rPr>
+      </w:pPr>
+      <w:r>
+        <w:rPr>
+          <w:b/>
+          <w:bCs/>
+          <w:lang w:val="vi-VN"/>
+        </w:rPr>
+        <w:t>Khối 4: Vận Hành, Lịch Trình &amp; Quản Trị Hệ Thống (3 Files)</w:t>
+      </w:r>
+    </w:p>
+    <w:p>
+      <w:pPr>
+        <w:numPr>
+          <w:ilvl w:val="0"/>
+          <w:numId w:val="20"/>
+        </w:numPr>
+        <w:rPr>
+          <w:lang w:val="vi-VN"/>
+        </w:rPr>
+      </w:pPr>
+      <w:r>
+        <w:rPr>
+          <w:b/>
+          <w:bCs/>
+          <w:lang w:val="vi-VN"/>
+        </w:rPr>
+        <w:t>Các file:</w:t>
+      </w:r>
+      <w:r>
+        <w:rPr>
+          <w:lang w:val="vi-VN"/>
+        </w:rPr>
+        <w:t xml:space="preserve"> calendar_screen.dart, partner_dashboard_screen.dart, admin_dashboard_screen.dart</w:t>
+      </w:r>
+    </w:p>
+    <w:p>
+      <w:pPr>
+        <w:numPr>
+          <w:ilvl w:val="0"/>
+          <w:numId w:val="20"/>
+        </w:numPr>
+        <w:rPr>
+          <w:lang w:val="vi-VN"/>
+        </w:rPr>
+      </w:pPr>
+      <w:r>
+        <w:rPr>
+          <w:b/>
+          <w:bCs/>
+          <w:lang w:val="vi-VN"/>
+        </w:rPr>
+        <w:t>Nhiệm vụ:</w:t>
+      </w:r>
+    </w:p>
+    <w:p>
+      <w:pPr>
+        <w:numPr>
+          <w:ilvl w:val="1"/>
+          <w:numId w:val="20"/>
+        </w:numPr>
+        <w:rPr>
+          <w:lang w:val="vi-VN"/>
+        </w:rPr>
+      </w:pPr>
+      <w:r>
+        <w:rPr>
+          <w:b/>
+          <w:bCs/>
+          <w:lang w:val="vi-VN"/>
+        </w:rPr>
+        <w:t>Calendar:</w:t>
+      </w:r>
+      <w:r>
+        <w:rPr>
+          <w:lang w:val="vi-VN"/>
+        </w:rPr>
+        <w:t xml:space="preserve"> Gắn badge nhận diện cấp độ cơ sở trên từng thẻ lịch hẹn.</w:t>
+      </w:r>
+    </w:p>
+    <w:p>
+      <w:pPr>
+        <w:numPr>
+          <w:ilvl w:val="1"/>
+          <w:numId w:val="20"/>
+        </w:numPr>
+        <w:rPr>
+          <w:lang w:val="vi-VN"/>
+        </w:rPr>
+      </w:pPr>
+      <w:r>
+        <w:rPr>
+          <w:b/>
+          <w:bCs/>
+          <w:lang w:val="vi-VN"/>
+        </w:rPr>
+        <w:t>Partner Dashboard:</w:t>
+      </w:r>
+      <w:r>
+        <w:rPr>
+          <w:lang w:val="vi-VN"/>
+        </w:rPr>
+        <w:t xml:space="preserve"> Khóa nút tạo VIP Voucher nếu là Standard, hiển thị bộ đếm 5 voucher/tuần nếu là Pro.</w:t>
+      </w:r>
+    </w:p>
+    <w:p>
+      <w:pPr>
+        <w:numPr>
+          <w:ilvl w:val="1"/>
+          <w:numId w:val="20"/>
+        </w:numPr>
+        <w:rPr>
+          <w:lang w:val="vi-VN"/>
+        </w:rPr>
+      </w:pPr>
+      <w:r>
+        <w:rPr>
+          <w:b/>
+          <w:bCs/>
+          <w:lang w:val="vi-VN"/>
+        </w:rPr>
+        <w:t>Admin Dashboard:</w:t>
+      </w:r>
+      <w:r>
+        <w:rPr>
+          <w:lang w:val="vi-VN"/>
+        </w:rPr>
+        <w:t xml:space="preserve"> Thêm Widget biểu đồ phân bổ số lượng đối tác Standard / Pro / Diamond.</w:t>
+      </w:r>
+    </w:p>
+    <w:p>
+      <w:pPr>
+        <w:numPr>
+          <w:ilvl w:val="0"/>
+          <w:numId w:val="20"/>
+        </w:numPr>
+        <w:rPr>
+          <w:lang w:val="vi-VN"/>
+        </w:rPr>
+      </w:pPr>
+      <w:r>
+        <w:rPr>
+          <w:b/>
+          <w:bCs/>
+          <w:lang w:val="vi-VN"/>
+        </w:rPr>
+        <w:t>Lý do chốt hạ:</w:t>
+      </w:r>
+      <w:r>
+        <w:rPr>
+          <w:lang w:val="vi-VN"/>
+        </w:rPr>
+        <w:t xml:space="preserve"> Đóng gói toàn bộ vòng đời quản trị, nghiệm thu trọn vẹn Phase 08.</w:t>
+      </w:r>
     </w:p>
     <w:p>
       <w:pPr>
@@ -5627,6 +4398,155 @@
     </w:lvl>
   </w:abstractNum>
   <w:abstractNum w:abstractNumId="7" w15:restartNumberingAfterBreak="0">
+    <w:nsid w:val="400C545F"/>
+    <w:multiLevelType w:val="multilevel"/>
+    <w:tmpl w:val="1DE087BC"/>
+    <w:lvl w:ilvl="0">
+      <w:start w:val="1"/>
+      <w:numFmt w:val="bullet"/>
+      <w:lvlText w:val=""/>
+      <w:lvlJc w:val="left"/>
+      <w:pPr>
+        <w:tabs>
+          <w:tab w:val="num" w:pos="720"/>
+        </w:tabs>
+        <w:ind w:left="720" w:hanging="360"/>
+      </w:pPr>
+      <w:rPr>
+        <w:rFonts w:ascii="Symbol" w:hAnsi="Symbol" w:hint="default"/>
+        <w:sz w:val="20"/>
+      </w:rPr>
+    </w:lvl>
+    <w:lvl w:ilvl="1">
+      <w:start w:val="1"/>
+      <w:numFmt w:val="bullet"/>
+      <w:lvlText w:val="o"/>
+      <w:lvlJc w:val="left"/>
+      <w:pPr>
+        <w:tabs>
+          <w:tab w:val="num" w:pos="1440"/>
+        </w:tabs>
+        <w:ind w:left="1440" w:hanging="360"/>
+      </w:pPr>
+      <w:rPr>
+        <w:rFonts w:ascii="Courier New" w:hAnsi="Courier New" w:hint="default"/>
+        <w:sz w:val="20"/>
+      </w:rPr>
+    </w:lvl>
+    <w:lvl w:ilvl="2" w:tentative="1">
+      <w:start w:val="1"/>
+      <w:numFmt w:val="bullet"/>
+      <w:lvlText w:val=""/>
+      <w:lvlJc w:val="left"/>
+      <w:pPr>
+        <w:tabs>
+          <w:tab w:val="num" w:pos="2160"/>
+        </w:tabs>
+        <w:ind w:left="2160" w:hanging="360"/>
+      </w:pPr>
+      <w:rPr>
+        <w:rFonts w:ascii="Wingdings" w:hAnsi="Wingdings" w:hint="default"/>
+        <w:sz w:val="20"/>
+      </w:rPr>
+    </w:lvl>
+    <w:lvl w:ilvl="3" w:tentative="1">
+      <w:start w:val="1"/>
+      <w:numFmt w:val="bullet"/>
+      <w:lvlText w:val=""/>
+      <w:lvlJc w:val="left"/>
+      <w:pPr>
+        <w:tabs>
+          <w:tab w:val="num" w:pos="2880"/>
+        </w:tabs>
+        <w:ind w:left="2880" w:hanging="360"/>
+      </w:pPr>
+      <w:rPr>
+        <w:rFonts w:ascii="Wingdings" w:hAnsi="Wingdings" w:hint="default"/>
+        <w:sz w:val="20"/>
+      </w:rPr>
+    </w:lvl>
+    <w:lvl w:ilvl="4" w:tentative="1">
+      <w:start w:val="1"/>
+      <w:numFmt w:val="bullet"/>
+      <w:lvlText w:val=""/>
+      <w:lvlJc w:val="left"/>
+      <w:pPr>
+        <w:tabs>
+          <w:tab w:val="num" w:pos="3600"/>
+        </w:tabs>
+        <w:ind w:left="3600" w:hanging="360"/>
+      </w:pPr>
+      <w:rPr>
+        <w:rFonts w:ascii="Wingdings" w:hAnsi="Wingdings" w:hint="default"/>
+        <w:sz w:val="20"/>
+      </w:rPr>
+    </w:lvl>
+    <w:lvl w:ilvl="5" w:tentative="1">
+      <w:start w:val="1"/>
+      <w:numFmt w:val="bullet"/>
+      <w:lvlText w:val=""/>
+      <w:lvlJc w:val="left"/>
+      <w:pPr>
+        <w:tabs>
+          <w:tab w:val="num" w:pos="4320"/>
+        </w:tabs>
+        <w:ind w:left="4320" w:hanging="360"/>
+      </w:pPr>
+      <w:rPr>
+        <w:rFonts w:ascii="Wingdings" w:hAnsi="Wingdings" w:hint="default"/>
+        <w:sz w:val="20"/>
+      </w:rPr>
+    </w:lvl>
+    <w:lvl w:ilvl="6" w:tentative="1">
+      <w:start w:val="1"/>
+      <w:numFmt w:val="bullet"/>
+      <w:lvlText w:val=""/>
+      <w:lvlJc w:val="left"/>
+      <w:pPr>
+        <w:tabs>
+          <w:tab w:val="num" w:pos="5040"/>
+        </w:tabs>
+        <w:ind w:left="5040" w:hanging="360"/>
+      </w:pPr>
+      <w:rPr>
+        <w:rFonts w:ascii="Wingdings" w:hAnsi="Wingdings" w:hint="default"/>
+        <w:sz w:val="20"/>
+      </w:rPr>
+    </w:lvl>
+    <w:lvl w:ilvl="7" w:tentative="1">
+      <w:start w:val="1"/>
+      <w:numFmt w:val="bullet"/>
+      <w:lvlText w:val=""/>
+      <w:lvlJc w:val="left"/>
+      <w:pPr>
+        <w:tabs>
+          <w:tab w:val="num" w:pos="5760"/>
+        </w:tabs>
+        <w:ind w:left="5760" w:hanging="360"/>
+      </w:pPr>
+      <w:rPr>
+        <w:rFonts w:ascii="Wingdings" w:hAnsi="Wingdings" w:hint="default"/>
+        <w:sz w:val="20"/>
+      </w:rPr>
+    </w:lvl>
+    <w:lvl w:ilvl="8" w:tentative="1">
+      <w:start w:val="1"/>
+      <w:numFmt w:val="bullet"/>
+      <w:lvlText w:val=""/>
+      <w:lvlJc w:val="left"/>
+      <w:pPr>
+        <w:tabs>
+          <w:tab w:val="num" w:pos="6480"/>
+        </w:tabs>
+        <w:ind w:left="6480" w:hanging="360"/>
+      </w:pPr>
+      <w:rPr>
+        <w:rFonts w:ascii="Wingdings" w:hAnsi="Wingdings" w:hint="default"/>
+        <w:sz w:val="20"/>
+      </w:rPr>
+    </w:lvl>
+  </w:abstractNum>
+  <w:abstractNum w:abstractNumId="8" w15:restartNumberingAfterBreak="0">
     <w:nsid w:val="45E34B30"/>
     <w:multiLevelType w:val="multilevel"/>
     <w:tmpl w:val="4F0E4F4E"/>
@@ -5775,7 +4695,7 @@
       </w:rPr>
     </w:lvl>
   </w:abstractNum>
-  <w:abstractNum w:abstractNumId="8" w15:restartNumberingAfterBreak="0">
+  <w:abstractNum w:abstractNumId="9" w15:restartNumberingAfterBreak="0">
     <w:nsid w:val="4B8207AC"/>
     <w:multiLevelType w:val="multilevel"/>
     <w:tmpl w:val="0BF87476"/>
@@ -5924,7 +4844,7 @@
       </w:rPr>
     </w:lvl>
   </w:abstractNum>
-  <w:abstractNum w:abstractNumId="9" w15:restartNumberingAfterBreak="0">
+  <w:abstractNum w:abstractNumId="10" w15:restartNumberingAfterBreak="0">
     <w:nsid w:val="4FAA63D5"/>
     <w:multiLevelType w:val="multilevel"/>
     <w:tmpl w:val="8232338A"/>
@@ -6073,7 +4993,156 @@
       </w:rPr>
     </w:lvl>
   </w:abstractNum>
-  <w:abstractNum w:abstractNumId="10" w15:restartNumberingAfterBreak="0">
+  <w:abstractNum w:abstractNumId="11" w15:restartNumberingAfterBreak="0">
+    <w:nsid w:val="531D4D17"/>
+    <w:multiLevelType w:val="multilevel"/>
+    <w:tmpl w:val="615A2E86"/>
+    <w:lvl w:ilvl="0">
+      <w:start w:val="1"/>
+      <w:numFmt w:val="bullet"/>
+      <w:lvlText w:val=""/>
+      <w:lvlJc w:val="left"/>
+      <w:pPr>
+        <w:tabs>
+          <w:tab w:val="num" w:pos="720"/>
+        </w:tabs>
+        <w:ind w:left="720" w:hanging="360"/>
+      </w:pPr>
+      <w:rPr>
+        <w:rFonts w:ascii="Symbol" w:hAnsi="Symbol" w:hint="default"/>
+        <w:sz w:val="20"/>
+      </w:rPr>
+    </w:lvl>
+    <w:lvl w:ilvl="1">
+      <w:start w:val="1"/>
+      <w:numFmt w:val="bullet"/>
+      <w:lvlText w:val="o"/>
+      <w:lvlJc w:val="left"/>
+      <w:pPr>
+        <w:tabs>
+          <w:tab w:val="num" w:pos="1440"/>
+        </w:tabs>
+        <w:ind w:left="1440" w:hanging="360"/>
+      </w:pPr>
+      <w:rPr>
+        <w:rFonts w:ascii="Courier New" w:hAnsi="Courier New" w:hint="default"/>
+        <w:sz w:val="20"/>
+      </w:rPr>
+    </w:lvl>
+    <w:lvl w:ilvl="2" w:tentative="1">
+      <w:start w:val="1"/>
+      <w:numFmt w:val="bullet"/>
+      <w:lvlText w:val=""/>
+      <w:lvlJc w:val="left"/>
+      <w:pPr>
+        <w:tabs>
+          <w:tab w:val="num" w:pos="2160"/>
+        </w:tabs>
+        <w:ind w:left="2160" w:hanging="360"/>
+      </w:pPr>
+      <w:rPr>
+        <w:rFonts w:ascii="Wingdings" w:hAnsi="Wingdings" w:hint="default"/>
+        <w:sz w:val="20"/>
+      </w:rPr>
+    </w:lvl>
+    <w:lvl w:ilvl="3" w:tentative="1">
+      <w:start w:val="1"/>
+      <w:numFmt w:val="bullet"/>
+      <w:lvlText w:val=""/>
+      <w:lvlJc w:val="left"/>
+      <w:pPr>
+        <w:tabs>
+          <w:tab w:val="num" w:pos="2880"/>
+        </w:tabs>
+        <w:ind w:left="2880" w:hanging="360"/>
+      </w:pPr>
+      <w:rPr>
+        <w:rFonts w:ascii="Wingdings" w:hAnsi="Wingdings" w:hint="default"/>
+        <w:sz w:val="20"/>
+      </w:rPr>
+    </w:lvl>
+    <w:lvl w:ilvl="4" w:tentative="1">
+      <w:start w:val="1"/>
+      <w:numFmt w:val="bullet"/>
+      <w:lvlText w:val=""/>
+      <w:lvlJc w:val="left"/>
+      <w:pPr>
+        <w:tabs>
+          <w:tab w:val="num" w:pos="3600"/>
+        </w:tabs>
+        <w:ind w:left="3600" w:hanging="360"/>
+      </w:pPr>
+      <w:rPr>
+        <w:rFonts w:ascii="Wingdings" w:hAnsi="Wingdings" w:hint="default"/>
+        <w:sz w:val="20"/>
+      </w:rPr>
+    </w:lvl>
+    <w:lvl w:ilvl="5" w:tentative="1">
+      <w:start w:val="1"/>
+      <w:numFmt w:val="bullet"/>
+      <w:lvlText w:val=""/>
+      <w:lvlJc w:val="left"/>
+      <w:pPr>
+        <w:tabs>
+          <w:tab w:val="num" w:pos="4320"/>
+        </w:tabs>
+        <w:ind w:left="4320" w:hanging="360"/>
+      </w:pPr>
+      <w:rPr>
+        <w:rFonts w:ascii="Wingdings" w:hAnsi="Wingdings" w:hint="default"/>
+        <w:sz w:val="20"/>
+      </w:rPr>
+    </w:lvl>
+    <w:lvl w:ilvl="6" w:tentative="1">
+      <w:start w:val="1"/>
+      <w:numFmt w:val="bullet"/>
+      <w:lvlText w:val=""/>
+      <w:lvlJc w:val="left"/>
+      <w:pPr>
+        <w:tabs>
+          <w:tab w:val="num" w:pos="5040"/>
+        </w:tabs>
+        <w:ind w:left="5040" w:hanging="360"/>
+      </w:pPr>
+      <w:rPr>
+        <w:rFonts w:ascii="Wingdings" w:hAnsi="Wingdings" w:hint="default"/>
+        <w:sz w:val="20"/>
+      </w:rPr>
+    </w:lvl>
+    <w:lvl w:ilvl="7" w:tentative="1">
+      <w:start w:val="1"/>
+      <w:numFmt w:val="bullet"/>
+      <w:lvlText w:val=""/>
+      <w:lvlJc w:val="left"/>
+      <w:pPr>
+        <w:tabs>
+          <w:tab w:val="num" w:pos="5760"/>
+        </w:tabs>
+        <w:ind w:left="5760" w:hanging="360"/>
+      </w:pPr>
+      <w:rPr>
+        <w:rFonts w:ascii="Wingdings" w:hAnsi="Wingdings" w:hint="default"/>
+        <w:sz w:val="20"/>
+      </w:rPr>
+    </w:lvl>
+    <w:lvl w:ilvl="8" w:tentative="1">
+      <w:start w:val="1"/>
+      <w:numFmt w:val="bullet"/>
+      <w:lvlText w:val=""/>
+      <w:lvlJc w:val="left"/>
+      <w:pPr>
+        <w:tabs>
+          <w:tab w:val="num" w:pos="6480"/>
+        </w:tabs>
+        <w:ind w:left="6480" w:hanging="360"/>
+      </w:pPr>
+      <w:rPr>
+        <w:rFonts w:ascii="Wingdings" w:hAnsi="Wingdings" w:hint="default"/>
+        <w:sz w:val="20"/>
+      </w:rPr>
+    </w:lvl>
+  </w:abstractNum>
+  <w:abstractNum w:abstractNumId="12" w15:restartNumberingAfterBreak="0">
     <w:nsid w:val="54712BCD"/>
     <w:multiLevelType w:val="multilevel"/>
     <w:tmpl w:val="1932D866"/>
@@ -6222,7 +5291,7 @@
       </w:rPr>
     </w:lvl>
   </w:abstractNum>
-  <w:abstractNum w:abstractNumId="11" w15:restartNumberingAfterBreak="0">
+  <w:abstractNum w:abstractNumId="13" w15:restartNumberingAfterBreak="0">
     <w:nsid w:val="55462955"/>
     <w:multiLevelType w:val="multilevel"/>
     <w:tmpl w:val="9EA4A9DE"/>
@@ -6371,7 +5440,96 @@
       </w:rPr>
     </w:lvl>
   </w:abstractNum>
-  <w:abstractNum w:abstractNumId="12" w15:restartNumberingAfterBreak="0">
+  <w:abstractNum w:abstractNumId="14" w15:restartNumberingAfterBreak="0">
+    <w:nsid w:val="659A7FEB"/>
+    <w:multiLevelType w:val="hybridMultilevel"/>
+    <w:tmpl w:val="6DFE2C98"/>
+    <w:lvl w:ilvl="0" w:tplc="0409000F">
+      <w:start w:val="1"/>
+      <w:numFmt w:val="decimal"/>
+      <w:lvlText w:val="%1."/>
+      <w:lvlJc w:val="left"/>
+      <w:pPr>
+        <w:ind w:left="720" w:hanging="360"/>
+      </w:pPr>
+      <w:rPr>
+        <w:rFonts w:hint="default"/>
+      </w:rPr>
+    </w:lvl>
+    <w:lvl w:ilvl="1" w:tplc="04090019">
+      <w:start w:val="1"/>
+      <w:numFmt w:val="lowerLetter"/>
+      <w:lvlText w:val="%2."/>
+      <w:lvlJc w:val="left"/>
+      <w:pPr>
+        <w:ind w:left="1440" w:hanging="360"/>
+      </w:pPr>
+    </w:lvl>
+    <w:lvl w:ilvl="2" w:tplc="0409001B" w:tentative="1">
+      <w:start w:val="1"/>
+      <w:numFmt w:val="lowerRoman"/>
+      <w:lvlText w:val="%3."/>
+      <w:lvlJc w:val="right"/>
+      <w:pPr>
+        <w:ind w:left="2160" w:hanging="180"/>
+      </w:pPr>
+    </w:lvl>
+    <w:lvl w:ilvl="3" w:tplc="0409000F" w:tentative="1">
+      <w:start w:val="1"/>
+      <w:numFmt w:val="decimal"/>
+      <w:lvlText w:val="%4."/>
+      <w:lvlJc w:val="left"/>
+      <w:pPr>
+        <w:ind w:left="2880" w:hanging="360"/>
+      </w:pPr>
+    </w:lvl>
+    <w:lvl w:ilvl="4" w:tplc="04090019" w:tentative="1">
+      <w:start w:val="1"/>
+      <w:numFmt w:val="lowerLetter"/>
+      <w:lvlText w:val="%5."/>
+      <w:lvlJc w:val="left"/>
+      <w:pPr>
+        <w:ind w:left="3600" w:hanging="360"/>
+      </w:pPr>
+    </w:lvl>
+    <w:lvl w:ilvl="5" w:tplc="0409001B" w:tentative="1">
+      <w:start w:val="1"/>
+      <w:numFmt w:val="lowerRoman"/>
+      <w:lvlText w:val="%6."/>
+      <w:lvlJc w:val="right"/>
+      <w:pPr>
+        <w:ind w:left="4320" w:hanging="180"/>
+      </w:pPr>
+    </w:lvl>
+    <w:lvl w:ilvl="6" w:tplc="0409000F" w:tentative="1">
+      <w:start w:val="1"/>
+      <w:numFmt w:val="decimal"/>
+      <w:lvlText w:val="%7."/>
+      <w:lvlJc w:val="left"/>
+      <w:pPr>
+        <w:ind w:left="5040" w:hanging="360"/>
+      </w:pPr>
+    </w:lvl>
+    <w:lvl w:ilvl="7" w:tplc="04090019" w:tentative="1">
+      <w:start w:val="1"/>
+      <w:numFmt w:val="lowerLetter"/>
+      <w:lvlText w:val="%8."/>
+      <w:lvlJc w:val="left"/>
+      <w:pPr>
+        <w:ind w:left="5760" w:hanging="360"/>
+      </w:pPr>
+    </w:lvl>
+    <w:lvl w:ilvl="8" w:tplc="0409001B" w:tentative="1">
+      <w:start w:val="1"/>
+      <w:numFmt w:val="lowerRoman"/>
+      <w:lvlText w:val="%9."/>
+      <w:lvlJc w:val="right"/>
+      <w:pPr>
+        <w:ind w:left="6480" w:hanging="180"/>
+      </w:pPr>
+    </w:lvl>
+  </w:abstractNum>
+  <w:abstractNum w:abstractNumId="15" w15:restartNumberingAfterBreak="0">
     <w:nsid w:val="665E69A9"/>
     <w:multiLevelType w:val="multilevel"/>
     <w:tmpl w:val="722EC606"/>
@@ -6520,7 +5678,156 @@
       </w:rPr>
     </w:lvl>
   </w:abstractNum>
-  <w:abstractNum w:abstractNumId="13" w15:restartNumberingAfterBreak="0">
+  <w:abstractNum w:abstractNumId="16" w15:restartNumberingAfterBreak="0">
+    <w:nsid w:val="6F281BBA"/>
+    <w:multiLevelType w:val="multilevel"/>
+    <w:tmpl w:val="B1EEAB02"/>
+    <w:lvl w:ilvl="0">
+      <w:start w:val="1"/>
+      <w:numFmt w:val="bullet"/>
+      <w:lvlText w:val=""/>
+      <w:lvlJc w:val="left"/>
+      <w:pPr>
+        <w:tabs>
+          <w:tab w:val="num" w:pos="720"/>
+        </w:tabs>
+        <w:ind w:left="720" w:hanging="360"/>
+      </w:pPr>
+      <w:rPr>
+        <w:rFonts w:ascii="Symbol" w:hAnsi="Symbol" w:hint="default"/>
+        <w:sz w:val="20"/>
+      </w:rPr>
+    </w:lvl>
+    <w:lvl w:ilvl="1">
+      <w:start w:val="1"/>
+      <w:numFmt w:val="bullet"/>
+      <w:lvlText w:val="o"/>
+      <w:lvlJc w:val="left"/>
+      <w:pPr>
+        <w:tabs>
+          <w:tab w:val="num" w:pos="1440"/>
+        </w:tabs>
+        <w:ind w:left="1440" w:hanging="360"/>
+      </w:pPr>
+      <w:rPr>
+        <w:rFonts w:ascii="Courier New" w:hAnsi="Courier New" w:hint="default"/>
+        <w:sz w:val="20"/>
+      </w:rPr>
+    </w:lvl>
+    <w:lvl w:ilvl="2" w:tentative="1">
+      <w:start w:val="1"/>
+      <w:numFmt w:val="bullet"/>
+      <w:lvlText w:val=""/>
+      <w:lvlJc w:val="left"/>
+      <w:pPr>
+        <w:tabs>
+          <w:tab w:val="num" w:pos="2160"/>
+        </w:tabs>
+        <w:ind w:left="2160" w:hanging="360"/>
+      </w:pPr>
+      <w:rPr>
+        <w:rFonts w:ascii="Wingdings" w:hAnsi="Wingdings" w:hint="default"/>
+        <w:sz w:val="20"/>
+      </w:rPr>
+    </w:lvl>
+    <w:lvl w:ilvl="3" w:tentative="1">
+      <w:start w:val="1"/>
+      <w:numFmt w:val="bullet"/>
+      <w:lvlText w:val=""/>
+      <w:lvlJc w:val="left"/>
+      <w:pPr>
+        <w:tabs>
+          <w:tab w:val="num" w:pos="2880"/>
+        </w:tabs>
+        <w:ind w:left="2880" w:hanging="360"/>
+      </w:pPr>
+      <w:rPr>
+        <w:rFonts w:ascii="Wingdings" w:hAnsi="Wingdings" w:hint="default"/>
+        <w:sz w:val="20"/>
+      </w:rPr>
+    </w:lvl>
+    <w:lvl w:ilvl="4" w:tentative="1">
+      <w:start w:val="1"/>
+      <w:numFmt w:val="bullet"/>
+      <w:lvlText w:val=""/>
+      <w:lvlJc w:val="left"/>
+      <w:pPr>
+        <w:tabs>
+          <w:tab w:val="num" w:pos="3600"/>
+        </w:tabs>
+        <w:ind w:left="3600" w:hanging="360"/>
+      </w:pPr>
+      <w:rPr>
+        <w:rFonts w:ascii="Wingdings" w:hAnsi="Wingdings" w:hint="default"/>
+        <w:sz w:val="20"/>
+      </w:rPr>
+    </w:lvl>
+    <w:lvl w:ilvl="5" w:tentative="1">
+      <w:start w:val="1"/>
+      <w:numFmt w:val="bullet"/>
+      <w:lvlText w:val=""/>
+      <w:lvlJc w:val="left"/>
+      <w:pPr>
+        <w:tabs>
+          <w:tab w:val="num" w:pos="4320"/>
+        </w:tabs>
+        <w:ind w:left="4320" w:hanging="360"/>
+      </w:pPr>
+      <w:rPr>
+        <w:rFonts w:ascii="Wingdings" w:hAnsi="Wingdings" w:hint="default"/>
+        <w:sz w:val="20"/>
+      </w:rPr>
+    </w:lvl>
+    <w:lvl w:ilvl="6" w:tentative="1">
+      <w:start w:val="1"/>
+      <w:numFmt w:val="bullet"/>
+      <w:lvlText w:val=""/>
+      <w:lvlJc w:val="left"/>
+      <w:pPr>
+        <w:tabs>
+          <w:tab w:val="num" w:pos="5040"/>
+        </w:tabs>
+        <w:ind w:left="5040" w:hanging="360"/>
+      </w:pPr>
+      <w:rPr>
+        <w:rFonts w:ascii="Wingdings" w:hAnsi="Wingdings" w:hint="default"/>
+        <w:sz w:val="20"/>
+      </w:rPr>
+    </w:lvl>
+    <w:lvl w:ilvl="7" w:tentative="1">
+      <w:start w:val="1"/>
+      <w:numFmt w:val="bullet"/>
+      <w:lvlText w:val=""/>
+      <w:lvlJc w:val="left"/>
+      <w:pPr>
+        <w:tabs>
+          <w:tab w:val="num" w:pos="5760"/>
+        </w:tabs>
+        <w:ind w:left="5760" w:hanging="360"/>
+      </w:pPr>
+      <w:rPr>
+        <w:rFonts w:ascii="Wingdings" w:hAnsi="Wingdings" w:hint="default"/>
+        <w:sz w:val="20"/>
+      </w:rPr>
+    </w:lvl>
+    <w:lvl w:ilvl="8" w:tentative="1">
+      <w:start w:val="1"/>
+      <w:numFmt w:val="bullet"/>
+      <w:lvlText w:val=""/>
+      <w:lvlJc w:val="left"/>
+      <w:pPr>
+        <w:tabs>
+          <w:tab w:val="num" w:pos="6480"/>
+        </w:tabs>
+        <w:ind w:left="6480" w:hanging="360"/>
+      </w:pPr>
+      <w:rPr>
+        <w:rFonts w:ascii="Wingdings" w:hAnsi="Wingdings" w:hint="default"/>
+        <w:sz w:val="20"/>
+      </w:rPr>
+    </w:lvl>
+  </w:abstractNum>
+  <w:abstractNum w:abstractNumId="17" w15:restartNumberingAfterBreak="0">
     <w:nsid w:val="6FFE4475"/>
     <w:multiLevelType w:val="multilevel"/>
     <w:tmpl w:val="02B099EA"/>
@@ -6669,10 +5976,10 @@
       </w:rPr>
     </w:lvl>
   </w:abstractNum>
-  <w:abstractNum w:abstractNumId="14" w15:restartNumberingAfterBreak="0">
+  <w:abstractNum w:abstractNumId="18" w15:restartNumberingAfterBreak="0">
     <w:nsid w:val="779B5536"/>
     <w:multiLevelType w:val="multilevel"/>
-    <w:tmpl w:val="9336FB28"/>
+    <w:tmpl w:val="03FE8B02"/>
     <w:lvl w:ilvl="0">
       <w:start w:val="1"/>
       <w:numFmt w:val="bullet"/>
@@ -6689,7 +5996,152 @@
         <w:sz w:val="20"/>
       </w:rPr>
     </w:lvl>
-    <w:lvl w:ilvl="1" w:tentative="1">
+    <w:lvl w:ilvl="1">
+      <w:start w:val="3"/>
+      <w:numFmt w:val="bullet"/>
+      <w:lvlText w:val="-"/>
+      <w:lvlJc w:val="left"/>
+      <w:pPr>
+        <w:ind w:left="1440" w:hanging="360"/>
+      </w:pPr>
+      <w:rPr>
+        <w:rFonts w:ascii="Aptos" w:eastAsiaTheme="minorHAnsi" w:hAnsi="Aptos" w:cstheme="minorBidi" w:hint="default"/>
+      </w:rPr>
+    </w:lvl>
+    <w:lvl w:ilvl="2" w:tentative="1">
+      <w:start w:val="1"/>
+      <w:numFmt w:val="bullet"/>
+      <w:lvlText w:val=""/>
+      <w:lvlJc w:val="left"/>
+      <w:pPr>
+        <w:tabs>
+          <w:tab w:val="num" w:pos="2160"/>
+        </w:tabs>
+        <w:ind w:left="2160" w:hanging="360"/>
+      </w:pPr>
+      <w:rPr>
+        <w:rFonts w:ascii="Wingdings" w:hAnsi="Wingdings" w:hint="default"/>
+        <w:sz w:val="20"/>
+      </w:rPr>
+    </w:lvl>
+    <w:lvl w:ilvl="3" w:tentative="1">
+      <w:start w:val="1"/>
+      <w:numFmt w:val="bullet"/>
+      <w:lvlText w:val=""/>
+      <w:lvlJc w:val="left"/>
+      <w:pPr>
+        <w:tabs>
+          <w:tab w:val="num" w:pos="2880"/>
+        </w:tabs>
+        <w:ind w:left="2880" w:hanging="360"/>
+      </w:pPr>
+      <w:rPr>
+        <w:rFonts w:ascii="Wingdings" w:hAnsi="Wingdings" w:hint="default"/>
+        <w:sz w:val="20"/>
+      </w:rPr>
+    </w:lvl>
+    <w:lvl w:ilvl="4" w:tentative="1">
+      <w:start w:val="1"/>
+      <w:numFmt w:val="bullet"/>
+      <w:lvlText w:val=""/>
+      <w:lvlJc w:val="left"/>
+      <w:pPr>
+        <w:tabs>
+          <w:tab w:val="num" w:pos="3600"/>
+        </w:tabs>
+        <w:ind w:left="3600" w:hanging="360"/>
+      </w:pPr>
+      <w:rPr>
+        <w:rFonts w:ascii="Wingdings" w:hAnsi="Wingdings" w:hint="default"/>
+        <w:sz w:val="20"/>
+      </w:rPr>
+    </w:lvl>
+    <w:lvl w:ilvl="5" w:tentative="1">
+      <w:start w:val="1"/>
+      <w:numFmt w:val="bullet"/>
+      <w:lvlText w:val=""/>
+      <w:lvlJc w:val="left"/>
+      <w:pPr>
+        <w:tabs>
+          <w:tab w:val="num" w:pos="4320"/>
+        </w:tabs>
+        <w:ind w:left="4320" w:hanging="360"/>
+      </w:pPr>
+      <w:rPr>
+        <w:rFonts w:ascii="Wingdings" w:hAnsi="Wingdings" w:hint="default"/>
+        <w:sz w:val="20"/>
+      </w:rPr>
+    </w:lvl>
+    <w:lvl w:ilvl="6" w:tentative="1">
+      <w:start w:val="1"/>
+      <w:numFmt w:val="bullet"/>
+      <w:lvlText w:val=""/>
+      <w:lvlJc w:val="left"/>
+      <w:pPr>
+        <w:tabs>
+          <w:tab w:val="num" w:pos="5040"/>
+        </w:tabs>
+        <w:ind w:left="5040" w:hanging="360"/>
+      </w:pPr>
+      <w:rPr>
+        <w:rFonts w:ascii="Wingdings" w:hAnsi="Wingdings" w:hint="default"/>
+        <w:sz w:val="20"/>
+      </w:rPr>
+    </w:lvl>
+    <w:lvl w:ilvl="7" w:tentative="1">
+      <w:start w:val="1"/>
+      <w:numFmt w:val="bullet"/>
+      <w:lvlText w:val=""/>
+      <w:lvlJc w:val="left"/>
+      <w:pPr>
+        <w:tabs>
+          <w:tab w:val="num" w:pos="5760"/>
+        </w:tabs>
+        <w:ind w:left="5760" w:hanging="360"/>
+      </w:pPr>
+      <w:rPr>
+        <w:rFonts w:ascii="Wingdings" w:hAnsi="Wingdings" w:hint="default"/>
+        <w:sz w:val="20"/>
+      </w:rPr>
+    </w:lvl>
+    <w:lvl w:ilvl="8" w:tentative="1">
+      <w:start w:val="1"/>
+      <w:numFmt w:val="bullet"/>
+      <w:lvlText w:val=""/>
+      <w:lvlJc w:val="left"/>
+      <w:pPr>
+        <w:tabs>
+          <w:tab w:val="num" w:pos="6480"/>
+        </w:tabs>
+        <w:ind w:left="6480" w:hanging="360"/>
+      </w:pPr>
+      <w:rPr>
+        <w:rFonts w:ascii="Wingdings" w:hAnsi="Wingdings" w:hint="default"/>
+        <w:sz w:val="20"/>
+      </w:rPr>
+    </w:lvl>
+  </w:abstractNum>
+  <w:abstractNum w:abstractNumId="19" w15:restartNumberingAfterBreak="0">
+    <w:nsid w:val="7DE505AF"/>
+    <w:multiLevelType w:val="multilevel"/>
+    <w:tmpl w:val="91307BD8"/>
+    <w:lvl w:ilvl="0">
+      <w:start w:val="1"/>
+      <w:numFmt w:val="bullet"/>
+      <w:lvlText w:val=""/>
+      <w:lvlJc w:val="left"/>
+      <w:pPr>
+        <w:tabs>
+          <w:tab w:val="num" w:pos="720"/>
+        </w:tabs>
+        <w:ind w:left="720" w:hanging="360"/>
+      </w:pPr>
+      <w:rPr>
+        <w:rFonts w:ascii="Symbol" w:hAnsi="Symbol" w:hint="default"/>
+        <w:sz w:val="20"/>
+      </w:rPr>
+    </w:lvl>
+    <w:lvl w:ilvl="1">
       <w:start w:val="1"/>
       <w:numFmt w:val="bullet"/>
       <w:lvlText w:val="o"/>
@@ -6822,7 +6274,7 @@
     <w:abstractNumId w:val="6"/>
   </w:num>
   <w:num w:numId="2" w16cid:durableId="666175398">
-    <w:abstractNumId w:val="13"/>
+    <w:abstractNumId w:val="17"/>
   </w:num>
   <w:num w:numId="3" w16cid:durableId="2053655557">
     <w:abstractNumId w:val="4"/>
@@ -6831,13 +6283,13 @@
     <w:abstractNumId w:val="3"/>
   </w:num>
   <w:num w:numId="5" w16cid:durableId="812991172">
+    <w:abstractNumId w:val="12"/>
+  </w:num>
+  <w:num w:numId="6" w16cid:durableId="1148979028">
     <w:abstractNumId w:val="10"/>
   </w:num>
-  <w:num w:numId="6" w16cid:durableId="1148979028">
+  <w:num w:numId="7" w16cid:durableId="895701941">
     <w:abstractNumId w:val="9"/>
-  </w:num>
-  <w:num w:numId="7" w16cid:durableId="895701941">
-    <w:abstractNumId w:val="8"/>
   </w:num>
   <w:num w:numId="8" w16cid:durableId="1980764010">
     <w:abstractNumId w:val="1"/>
@@ -6846,10 +6298,10 @@
     <w:abstractNumId w:val="2"/>
   </w:num>
   <w:num w:numId="10" w16cid:durableId="635836165">
-    <w:abstractNumId w:val="12"/>
+    <w:abstractNumId w:val="15"/>
   </w:num>
   <w:num w:numId="11" w16cid:durableId="1968386567">
-    <w:abstractNumId w:val="7"/>
+    <w:abstractNumId w:val="8"/>
   </w:num>
   <w:num w:numId="12" w16cid:durableId="64422851">
     <w:abstractNumId w:val="0"/>
@@ -6858,10 +6310,25 @@
     <w:abstractNumId w:val="5"/>
   </w:num>
   <w:num w:numId="14" w16cid:durableId="1791390522">
+    <w:abstractNumId w:val="18"/>
+  </w:num>
+  <w:num w:numId="15" w16cid:durableId="214201056">
+    <w:abstractNumId w:val="13"/>
+  </w:num>
+  <w:num w:numId="16" w16cid:durableId="197544619">
     <w:abstractNumId w:val="14"/>
   </w:num>
-  <w:num w:numId="15" w16cid:durableId="214201056">
+  <w:num w:numId="17" w16cid:durableId="219900514">
     <w:abstractNumId w:val="11"/>
+  </w:num>
+  <w:num w:numId="18" w16cid:durableId="66734788">
+    <w:abstractNumId w:val="16"/>
+  </w:num>
+  <w:num w:numId="19" w16cid:durableId="1003701430">
+    <w:abstractNumId w:val="19"/>
+  </w:num>
+  <w:num w:numId="20" w16cid:durableId="1451364694">
+    <w:abstractNumId w:val="7"/>
   </w:num>
 </w:numbering>
 </file>
@@ -7470,7 +6937,6 @@
   <w:style w:type="character" w:default="1" w:styleId="DefaultParagraphFont">
     <w:name w:val="Default Paragraph Font"/>
     <w:uiPriority w:val="1"/>
-    <w:semiHidden/>
     <w:unhideWhenUsed/>
   </w:style>
   <w:style w:type="table" w:default="1" w:styleId="TableNormal">

</xml_diff>